<commit_message>
MAJ Documentation Capteur Particules et IHM
</commit_message>
<xml_diff>
--- a/Documentation Capteur Particules/Documentation_capteur_particules.docx
+++ b/Documentation Capteur Particules/Documentation_capteur_particules.docx
@@ -29,17 +29,18 @@
       </w:r>
       <w:r>
         <w:rPr>
-          <w:rFonts w:ascii="Lexend" w:hAnsi="Lexend" w:eastAsia="Lexend" w:cs="Lexend"/>
+          <w:rFonts w:ascii="Lexend" w:hAnsi="Lexend" w:cs="Lexend"/>
           <w:b/>
           <w:bCs/>
           <w:sz w:val="48"/>
           <w:szCs w:val="48"/>
           <w:highlight w:val="none"/>
+          <w14:ligatures w14:val="none"/>
         </w:rPr>
       </w:r>
       <w:r>
         <w:rPr>
-          <w:rFonts w:ascii="Lexend" w:hAnsi="Lexend" w:eastAsia="Lexend" w:cs="Lexend"/>
+          <w:rFonts w:ascii="Lexend" w:hAnsi="Lexend" w:cs="Lexend"/>
           <w:b/>
           <w:bCs/>
           <w:sz w:val="48"/>
@@ -77,17 +78,18 @@
       </w:r>
       <w:r>
         <w:rPr>
-          <w:rFonts w:ascii="Lexend" w:hAnsi="Lexend" w:eastAsia="Lexend" w:cs="Lexend"/>
+          <w:rFonts w:ascii="Lexend" w:hAnsi="Lexend" w:cs="Lexend"/>
           <w:b/>
           <w:bCs/>
           <w:sz w:val="72"/>
           <w:szCs w:val="72"/>
+          <w:highlight w:val="none"/>
           <w14:ligatures w14:val="none"/>
         </w:rPr>
       </w:r>
       <w:r>
         <w:rPr>
-          <w:rFonts w:ascii="Lexend" w:hAnsi="Lexend" w:eastAsia="Lexend" w:cs="Lexend"/>
+          <w:rFonts w:ascii="Lexend" w:hAnsi="Lexend" w:cs="Lexend"/>
           <w:b/>
           <w:bCs/>
           <w:sz w:val="72"/>
@@ -123,7 +125,7 @@
       </w:r>
       <w:r>
         <w:rPr>
-          <w:rFonts w:ascii="Lexend" w:hAnsi="Lexend" w:eastAsia="Lexend" w:cs="Lexend"/>
+          <w:rFonts w:ascii="Lexend" w:hAnsi="Lexend" w:cs="Lexend"/>
           <w:b/>
           <w:bCs/>
           <w:sz w:val="48"/>
@@ -133,7 +135,7 @@
       </w:r>
       <w:r>
         <w:rPr>
-          <w:rFonts w:ascii="Lexend" w:hAnsi="Lexend" w:eastAsia="Lexend" w:cs="Lexend"/>
+          <w:rFonts w:ascii="Lexend" w:hAnsi="Lexend" w:cs="Lexend"/>
           <w:b/>
           <w:bCs/>
           <w:sz w:val="48"/>
@@ -168,7 +170,7 @@
       </w:r>
       <w:r>
         <w:rPr>
-          <w:rFonts w:ascii="Lexend" w:hAnsi="Lexend" w:eastAsia="Lexend" w:cs="Lexend"/>
+          <w:rFonts w:ascii="Lexend" w:hAnsi="Lexend" w:cs="Lexend"/>
           <w:b/>
           <w:bCs/>
           <w:sz w:val="48"/>
@@ -178,7 +180,7 @@
       </w:r>
       <w:r>
         <w:rPr>
-          <w:rFonts w:ascii="Lexend" w:hAnsi="Lexend" w:eastAsia="Lexend" w:cs="Lexend"/>
+          <w:rFonts w:ascii="Lexend" w:hAnsi="Lexend" w:cs="Lexend"/>
           <w:b/>
           <w:bCs/>
           <w:sz w:val="48"/>
@@ -294,7 +296,7 @@
       </w:r>
       <w:r>
         <w:rPr>
-          <w:rFonts w:ascii="Lexend" w:hAnsi="Lexend" w:eastAsia="Lexend" w:cs="Lexend"/>
+          <w:rFonts w:ascii="Lexend" w:hAnsi="Lexend" w:cs="Lexend"/>
           <w:b/>
           <w:bCs/>
           <w:sz w:val="48"/>
@@ -304,7 +306,7 @@
       </w:r>
       <w:r>
         <w:rPr>
-          <w:rFonts w:ascii="Lexend" w:hAnsi="Lexend" w:eastAsia="Lexend" w:cs="Lexend"/>
+          <w:rFonts w:ascii="Lexend" w:hAnsi="Lexend" w:cs="Lexend"/>
           <w:b/>
           <w:bCs/>
           <w:sz w:val="48"/>
@@ -339,7 +341,7 @@
       </w:r>
       <w:r>
         <w:rPr>
-          <w:rFonts w:ascii="Lexend" w:hAnsi="Lexend" w:eastAsia="Lexend" w:cs="Lexend"/>
+          <w:rFonts w:ascii="Lexend" w:hAnsi="Lexend" w:cs="Lexend"/>
           <w:b/>
           <w:bCs/>
           <w:sz w:val="48"/>
@@ -349,7 +351,7 @@
       </w:r>
       <w:r>
         <w:rPr>
-          <w:rFonts w:ascii="Lexend" w:hAnsi="Lexend" w:eastAsia="Lexend" w:cs="Lexend"/>
+          <w:rFonts w:ascii="Lexend" w:hAnsi="Lexend" w:cs="Lexend"/>
           <w:b/>
           <w:bCs/>
           <w:sz w:val="48"/>
@@ -384,7 +386,7 @@
       </w:r>
       <w:r>
         <w:rPr>
-          <w:rFonts w:ascii="Lexend" w:hAnsi="Lexend" w:eastAsia="Lexend" w:cs="Lexend"/>
+          <w:rFonts w:ascii="Lexend" w:hAnsi="Lexend" w:cs="Lexend"/>
           <w:b/>
           <w:bCs/>
           <w:sz w:val="48"/>
@@ -394,7 +396,7 @@
       </w:r>
       <w:r>
         <w:rPr>
-          <w:rFonts w:ascii="Lexend" w:hAnsi="Lexend" w:eastAsia="Lexend" w:cs="Lexend"/>
+          <w:rFonts w:ascii="Lexend" w:hAnsi="Lexend" w:cs="Lexend"/>
           <w:b/>
           <w:bCs/>
           <w:sz w:val="48"/>
@@ -429,7 +431,7 @@
       </w:r>
       <w:r>
         <w:rPr>
-          <w:rFonts w:ascii="Lexend" w:hAnsi="Lexend" w:eastAsia="Lexend" w:cs="Lexend"/>
+          <w:rFonts w:ascii="Lexend" w:hAnsi="Lexend" w:cs="Lexend"/>
           <w:b/>
           <w:bCs/>
           <w:sz w:val="48"/>
@@ -439,7 +441,7 @@
       </w:r>
       <w:r>
         <w:rPr>
-          <w:rFonts w:ascii="Lexend" w:hAnsi="Lexend" w:eastAsia="Lexend" w:cs="Lexend"/>
+          <w:rFonts w:ascii="Lexend" w:hAnsi="Lexend" w:cs="Lexend"/>
           <w:b/>
           <w:bCs/>
           <w:sz w:val="48"/>
@@ -474,7 +476,7 @@
       </w:r>
       <w:r>
         <w:rPr>
-          <w:rFonts w:ascii="Lexend" w:hAnsi="Lexend" w:eastAsia="Lexend" w:cs="Lexend"/>
+          <w:rFonts w:ascii="Lexend" w:hAnsi="Lexend" w:cs="Lexend"/>
           <w:b/>
           <w:bCs/>
           <w:sz w:val="48"/>
@@ -484,7 +486,7 @@
       </w:r>
       <w:r>
         <w:rPr>
-          <w:rFonts w:ascii="Lexend" w:hAnsi="Lexend" w:eastAsia="Lexend" w:cs="Lexend"/>
+          <w:rFonts w:ascii="Lexend" w:hAnsi="Lexend" w:cs="Lexend"/>
           <w:b/>
           <w:bCs/>
           <w:sz w:val="48"/>
@@ -519,7 +521,7 @@
       </w:r>
       <w:r>
         <w:rPr>
-          <w:rFonts w:ascii="Lexend" w:hAnsi="Lexend" w:eastAsia="Lexend" w:cs="Lexend"/>
+          <w:rFonts w:ascii="Lexend" w:hAnsi="Lexend" w:cs="Lexend"/>
           <w:b/>
           <w:bCs/>
           <w:sz w:val="48"/>
@@ -529,7 +531,7 @@
       </w:r>
       <w:r>
         <w:rPr>
-          <w:rFonts w:ascii="Lexend" w:hAnsi="Lexend" w:eastAsia="Lexend" w:cs="Lexend"/>
+          <w:rFonts w:ascii="Lexend" w:hAnsi="Lexend" w:cs="Lexend"/>
           <w:b/>
           <w:bCs/>
           <w:sz w:val="48"/>
@@ -564,7 +566,7 @@
       </w:r>
       <w:r>
         <w:rPr>
-          <w:rFonts w:ascii="Lexend" w:hAnsi="Lexend" w:eastAsia="Lexend" w:cs="Lexend"/>
+          <w:rFonts w:ascii="Lexend" w:hAnsi="Lexend" w:cs="Lexend"/>
           <w:b/>
           <w:bCs/>
           <w:sz w:val="48"/>
@@ -574,7 +576,7 @@
       </w:r>
       <w:r>
         <w:rPr>
-          <w:rFonts w:ascii="Lexend" w:hAnsi="Lexend" w:eastAsia="Lexend" w:cs="Lexend"/>
+          <w:rFonts w:ascii="Lexend" w:hAnsi="Lexend" w:cs="Lexend"/>
           <w:b/>
           <w:bCs/>
           <w:sz w:val="48"/>
@@ -609,7 +611,7 @@
       </w:r>
       <w:r>
         <w:rPr>
-          <w:rFonts w:ascii="Lexend" w:hAnsi="Lexend" w:eastAsia="Lexend" w:cs="Lexend"/>
+          <w:rFonts w:ascii="Lexend" w:hAnsi="Lexend" w:cs="Lexend"/>
           <w:b/>
           <w:bCs/>
           <w:sz w:val="48"/>
@@ -619,7 +621,7 @@
       </w:r>
       <w:r>
         <w:rPr>
-          <w:rFonts w:ascii="Lexend" w:hAnsi="Lexend" w:eastAsia="Lexend" w:cs="Lexend"/>
+          <w:rFonts w:ascii="Lexend" w:hAnsi="Lexend" w:cs="Lexend"/>
           <w:b/>
           <w:bCs/>
           <w:sz w:val="48"/>
@@ -654,7 +656,7 @@
       </w:r>
       <w:r>
         <w:rPr>
-          <w:rFonts w:ascii="Lexend" w:hAnsi="Lexend" w:eastAsia="Lexend" w:cs="Lexend"/>
+          <w:rFonts w:ascii="Lexend" w:hAnsi="Lexend" w:cs="Lexend"/>
           <w:b/>
           <w:bCs/>
           <w:sz w:val="48"/>
@@ -664,7 +666,7 @@
       </w:r>
       <w:r>
         <w:rPr>
-          <w:rFonts w:ascii="Lexend" w:hAnsi="Lexend" w:eastAsia="Lexend" w:cs="Lexend"/>
+          <w:rFonts w:ascii="Lexend" w:hAnsi="Lexend" w:cs="Lexend"/>
           <w:b/>
           <w:bCs/>
           <w:sz w:val="48"/>
@@ -699,7 +701,7 @@
       </w:r>
       <w:r>
         <w:rPr>
-          <w:rFonts w:ascii="Lexend" w:hAnsi="Lexend" w:eastAsia="Lexend" w:cs="Lexend"/>
+          <w:rFonts w:ascii="Lexend" w:hAnsi="Lexend" w:cs="Lexend"/>
           <w:b/>
           <w:bCs/>
           <w:sz w:val="48"/>
@@ -709,7 +711,7 @@
       </w:r>
       <w:r>
         <w:rPr>
-          <w:rFonts w:ascii="Lexend" w:hAnsi="Lexend" w:eastAsia="Lexend" w:cs="Lexend"/>
+          <w:rFonts w:ascii="Lexend" w:hAnsi="Lexend" w:cs="Lexend"/>
           <w:b/>
           <w:bCs/>
           <w:sz w:val="48"/>
@@ -744,7 +746,7 @@
       </w:r>
       <w:r>
         <w:rPr>
-          <w:rFonts w:ascii="Lexend" w:hAnsi="Lexend" w:eastAsia="Lexend" w:cs="Lexend"/>
+          <w:rFonts w:ascii="Lexend" w:hAnsi="Lexend" w:cs="Lexend"/>
           <w:b/>
           <w:bCs/>
           <w:sz w:val="48"/>
@@ -754,7 +756,7 @@
       </w:r>
       <w:r>
         <w:rPr>
-          <w:rFonts w:ascii="Lexend" w:hAnsi="Lexend" w:eastAsia="Lexend" w:cs="Lexend"/>
+          <w:rFonts w:ascii="Lexend" w:hAnsi="Lexend" w:cs="Lexend"/>
           <w:b/>
           <w:bCs/>
           <w:sz w:val="48"/>
@@ -790,13 +792,14 @@
       <w:bookmarkEnd w:id="1"/>
       <w:r>
         <w:rPr>
-          <w:rFonts w:ascii="Lexend" w:hAnsi="Lexend" w:eastAsia="Lexend" w:cs="Lexend"/>
+          <w:rFonts w:ascii="Lexend" w:hAnsi="Lexend" w:cs="Lexend"/>
           <w:highlight w:val="none"/>
+          <w14:ligatures w14:val="none"/>
         </w:rPr>
       </w:r>
       <w:r>
         <w:rPr>
-          <w:rFonts w:ascii="Lexend" w:hAnsi="Lexend" w:eastAsia="Lexend" w:cs="Lexend"/>
+          <w:rFonts w:ascii="Lexend" w:hAnsi="Lexend" w:cs="Lexend"/>
           <w:highlight w:val="none"/>
           <w14:ligatures w14:val="none"/>
         </w:rPr>
@@ -896,13 +899,13 @@
           </w:hyperlink>
           <w:r>
             <w:rPr>
-              <w:rFonts w:ascii="Lexend" w:hAnsi="Lexend" w:eastAsia="Lexend" w:cs="Lexend"/>
+              <w:rFonts w:ascii="Lexend" w:hAnsi="Lexend" w:cs="Lexend"/>
               <w:highlight w:val="none"/>
             </w:rPr>
           </w:r>
           <w:r>
             <w:rPr>
-              <w:rFonts w:ascii="Lexend" w:hAnsi="Lexend" w:eastAsia="Lexend" w:cs="Lexend"/>
+              <w:rFonts w:ascii="Lexend" w:hAnsi="Lexend" w:cs="Lexend"/>
               <w:highlight w:val="none"/>
             </w:rPr>
           </w:r>
@@ -973,12 +976,12 @@
           </w:hyperlink>
           <w:r>
             <w:rPr>
-              <w:rFonts w:ascii="Lexend" w:hAnsi="Lexend" w:eastAsia="Lexend" w:cs="Lexend"/>
+              <w:rFonts w:ascii="Lexend" w:hAnsi="Lexend" w:cs="Lexend"/>
             </w:rPr>
           </w:r>
           <w:r>
             <w:rPr>
-              <w:rFonts w:ascii="Lexend" w:hAnsi="Lexend" w:eastAsia="Lexend" w:cs="Lexend"/>
+              <w:rFonts w:ascii="Lexend" w:hAnsi="Lexend" w:cs="Lexend"/>
             </w:rPr>
           </w:r>
         </w:p>
@@ -1000,7 +1003,13 @@
           </w:r>
           <w:r>
             <w:rPr>
-              <w:rFonts w:ascii="Lexend" w:hAnsi="Lexend" w:eastAsia="Lexend" w:cs="Lexend"/>
+              <w:rFonts w:ascii="Lexend" w:hAnsi="Lexend" w:cs="Lexend"/>
+              <w:highlight w:val="none"/>
+            </w:rPr>
+          </w:r>
+          <w:r>
+            <w:rPr>
+              <w:rFonts w:ascii="Lexend" w:hAnsi="Lexend" w:cs="Lexend"/>
               <w:highlight w:val="none"/>
             </w:rPr>
           </w:r>
@@ -1026,7 +1035,13 @@
       </w:r>
       <w:r>
         <w:rPr>
-          <w:rFonts w:ascii="Lexend" w:hAnsi="Lexend" w:eastAsia="Lexend" w:cs="Lexend"/>
+          <w:rFonts w:ascii="Lexend" w:hAnsi="Lexend" w:cs="Lexend"/>
+          <w14:ligatures w14:val="none"/>
+        </w:rPr>
+      </w:r>
+      <w:r>
+        <w:rPr>
+          <w:rFonts w:ascii="Lexend" w:hAnsi="Lexend" w:cs="Lexend"/>
           <w14:ligatures w14:val="none"/>
         </w:rPr>
       </w:r>
@@ -1058,41 +1073,1179 @@
       </w:r>
       <w:r>
         <w:rPr>
+          <w:rFonts w:ascii="Lexend" w:hAnsi="Lexend" w:cs="Lexend"/>
+          <w:highlight w:val="none"/>
+          <w14:ligatures w14:val="none"/>
+        </w:rPr>
+      </w:r>
+      <w:r>
+        <w:rPr>
+          <w:rFonts w:ascii="Lexend" w:hAnsi="Lexend" w:cs="Lexend"/>
+          <w:highlight w:val="none"/>
+          <w14:ligatures w14:val="none"/>
+        </w:rPr>
+      </w:r>
+    </w:p>
+    <w:p>
+      <w:pPr>
+        <w:pBdr/>
+        <w:spacing/>
+        <w:ind/>
+        <w:rPr/>
+      </w:pPr>
+      <w:r>
+        <w:rPr>
+          <w:highlight w:val="none"/>
+        </w:rPr>
+        <w:t xml:space="preserve">L</w:t>
+      </w:r>
+      <w:r>
+        <w:rPr>
+          <w:highlight w:val="none"/>
+        </w:rPr>
+        <w:t xml:space="preserve">e capteur choisi pour le projet est le capteur de particules SDS011. Il permet de mesurer la concentration de particules fines dans l'air, selon deux catégories réglementaires : les PM2.5 (particules de diamètre inférieur à 2,5 µm) et les PM10 (particules </w:t>
+      </w:r>
+      <w:r>
+        <w:rPr>
+          <w:highlight w:val="none"/>
+        </w:rPr>
+        <w:t xml:space="preserve">de diamètre inférieur à 10 µm).</w:t>
+      </w:r>
+      <w:r>
+        <w:rPr>
+          <w:highlight w:val="none"/>
+        </w:rPr>
+      </w:r>
+      <w:r/>
+    </w:p>
+    <w:p>
+      <w:pPr>
+        <w:pBdr/>
+        <w:spacing/>
+        <w:ind/>
+        <w:rPr>
+          <w:highlight w:val="none"/>
+          <w14:ligatures w14:val="none"/>
+        </w:rPr>
+      </w:pPr>
+      <w:r>
+        <w:rPr>
+          <w:highlight w:val="none"/>
+        </w:rPr>
+        <w:t xml:space="preserve">Le capteur communique via une liaison série UART et est fourni avec un adaptateur permettant de le connecter directement en USB.</w:t>
+      </w:r>
+      <w:r>
+        <w:rPr>
+          <w:highlight w:val="none"/>
+          <w14:ligatures w14:val="none"/>
+        </w:rPr>
+      </w:r>
+      <w:r>
+        <w:rPr>
+          <w:highlight w:val="none"/>
+          <w14:ligatures w14:val="none"/>
+        </w:rPr>
+      </w:r>
+    </w:p>
+    <w:p>
+      <w:pPr>
+        <w:pBdr/>
+        <w:spacing/>
+        <w:ind/>
+        <w:rPr>
+          <w:highlight w:val="none"/>
+          <w14:ligatures w14:val="none"/>
+        </w:rPr>
+      </w:pPr>
+      <w:r>
+        <w:rPr>
+          <w:highlight w:val="none"/>
+          <w14:ligatures w14:val="none"/>
+        </w:rPr>
+      </w:r>
+      <w:r>
+        <w:rPr>
+          <w:highlight w:val="none"/>
+          <w14:ligatures w14:val="none"/>
+        </w:rPr>
+      </w:r>
+      <w:r>
+        <w:rPr>
+          <w:highlight w:val="none"/>
+          <w14:ligatures w14:val="none"/>
+        </w:rPr>
+      </w:r>
+    </w:p>
+    <w:p>
+      <w:pPr>
+        <w:pBdr>
+          <w:top w:val="none" w:color="000000" w:sz="4" w:space="0"/>
+          <w:left w:val="none" w:color="000000" w:sz="4" w:space="0"/>
+          <w:bottom w:val="none" w:color="000000" w:sz="4" w:space="0"/>
+          <w:right w:val="none" w:color="000000" w:sz="4" w:space="0"/>
+        </w:pBdr>
+        <w:spacing/>
+        <w:ind w:right="0" w:firstLine="0" w:left="0"/>
+        <w:rPr>
+          <w14:ligatures w14:val="none"/>
+        </w:rPr>
+      </w:pPr>
+      <w:r>
+        <w:t xml:space="preserve">Caractéristiques techniques principales :</w:t>
+      </w:r>
+      <w:r>
+        <w:rPr>
+          <w14:ligatures w14:val="none"/>
+        </w:rPr>
+      </w:r>
+    </w:p>
+    <w:tbl>
+      <w:tblPr>
+        <w:tblStyle w:val="711"/>
+        <w:tblInd w:w="-1" w:type="dxa"/>
+        <w:tblW w:w="0" w:type="auto"/>
+        <w:tblBorders>
+          <w:top w:val="none" w:color="000000" w:sz="4" w:space="0"/>
+          <w:left w:val="none" w:color="000000" w:sz="4" w:space="0"/>
+          <w:bottom w:val="none" w:color="000000" w:sz="4" w:space="0"/>
+          <w:right w:val="none" w:color="000000" w:sz="4" w:space="0"/>
+          <w:insideH w:val="none" w:color="000000" w:sz="4" w:space="0"/>
+          <w:insideV w:val="none" w:color="000000" w:sz="4" w:space="0"/>
+        </w:tblBorders>
+        <w:tblLayout w:type="fixed"/>
+        <w:tblLook w:val="04A0" w:firstRow="1" w:lastRow="0" w:firstColumn="1" w:lastColumn="0" w:noHBand="0" w:noVBand="1"/>
+      </w:tblPr>
+      <w:tblGrid>
+        <w:gridCol w:w="3118"/>
+        <w:gridCol w:w="5244"/>
+      </w:tblGrid>
+      <w:tr>
+        <w:trPr>
+          <w:trHeight w:val="432"/>
+        </w:trPr>
+        <w:tc>
+          <w:tcPr>
+            <w:tcBorders/>
+            <w:tcMar>
+              <w:left w:w="15" w:type="dxa"/>
+              <w:top w:w="15" w:type="dxa"/>
+              <w:right w:w="15" w:type="dxa"/>
+              <w:bottom w:w="15" w:type="dxa"/>
+            </w:tcMar>
+            <w:tcW w:w="3118" w:type="dxa"/>
+            <w:vAlign w:val="center"/>
+            <w:textDirection w:val="lrTb"/>
+            <w:noWrap w:val="false"/>
+          </w:tcPr>
+          <w:p>
+            <w:pPr>
+              <w:pBdr/>
+              <w:spacing w:after="0" w:before="0" w:line="240" w:lineRule="auto"/>
+              <w:ind/>
+              <w:jc w:val="center"/>
+              <w:rPr>
+                <w:rFonts w:ascii="Lexend" w:hAnsi="Lexend" w:cs="Lexend"/>
+              </w:rPr>
+            </w:pPr>
+            <w:r>
+              <w:rPr>
+                <w:rFonts w:ascii="Lexend" w:hAnsi="Lexend" w:eastAsia="Lexend" w:cs="Lexend"/>
+                <w:b/>
+                <w:color w:val="000000"/>
+                <w:sz w:val="24"/>
+              </w:rPr>
+              <w:t xml:space="preserve">Paramètre</w:t>
+            </w:r>
+            <w:r>
+              <w:rPr>
+                <w:rFonts w:ascii="Lexend" w:hAnsi="Lexend" w:eastAsia="Lexend" w:cs="Lexend"/>
+              </w:rPr>
+            </w:r>
+            <w:r>
+              <w:rPr>
+                <w:rFonts w:ascii="Lexend" w:hAnsi="Lexend" w:cs="Lexend"/>
+              </w:rPr>
+            </w:r>
+          </w:p>
+        </w:tc>
+        <w:tc>
+          <w:tcPr>
+            <w:tcBorders/>
+            <w:tcMar>
+              <w:left w:w="15" w:type="dxa"/>
+              <w:top w:w="15" w:type="dxa"/>
+              <w:right w:w="15" w:type="dxa"/>
+              <w:bottom w:w="15" w:type="dxa"/>
+            </w:tcMar>
+            <w:tcW w:w="5244" w:type="dxa"/>
+            <w:vAlign w:val="center"/>
+            <w:textDirection w:val="lrTb"/>
+            <w:noWrap w:val="false"/>
+          </w:tcPr>
+          <w:p>
+            <w:pPr>
+              <w:pBdr/>
+              <w:spacing w:after="0" w:before="0" w:line="240" w:lineRule="auto"/>
+              <w:ind/>
+              <w:jc w:val="center"/>
+              <w:rPr>
+                <w:rFonts w:ascii="Lexend" w:hAnsi="Lexend" w:cs="Lexend"/>
+              </w:rPr>
+            </w:pPr>
+            <w:r>
+              <w:rPr>
+                <w:rFonts w:ascii="Lexend" w:hAnsi="Lexend" w:eastAsia="Lexend" w:cs="Lexend"/>
+                <w:b/>
+                <w:color w:val="000000"/>
+                <w:sz w:val="24"/>
+              </w:rPr>
+              <w:t xml:space="preserve">Valeur</w:t>
+            </w:r>
+            <w:r>
+              <w:rPr>
+                <w:rFonts w:ascii="Lexend" w:hAnsi="Lexend" w:eastAsia="Lexend" w:cs="Lexend"/>
+              </w:rPr>
+            </w:r>
+            <w:r>
+              <w:rPr>
+                <w:rFonts w:ascii="Lexend" w:hAnsi="Lexend" w:cs="Lexend"/>
+              </w:rPr>
+            </w:r>
+          </w:p>
+        </w:tc>
+      </w:tr>
+      <w:tr>
+        <w:trPr/>
+        <w:tc>
+          <w:tcPr>
+            <w:tcBorders/>
+            <w:tcMar>
+              <w:left w:w="15" w:type="dxa"/>
+              <w:top w:w="15" w:type="dxa"/>
+              <w:right w:w="15" w:type="dxa"/>
+              <w:bottom w:w="15" w:type="dxa"/>
+            </w:tcMar>
+            <w:tcW w:w="3118" w:type="dxa"/>
+            <w:vAlign w:val="center"/>
+            <w:textDirection w:val="lrTb"/>
+            <w:noWrap w:val="false"/>
+          </w:tcPr>
+          <w:p>
+            <w:pPr>
+              <w:pBdr/>
+              <w:spacing w:after="0" w:before="0" w:line="240" w:lineRule="auto"/>
+              <w:ind/>
+              <w:rPr>
+                <w:rFonts w:ascii="Lexend" w:hAnsi="Lexend" w:cs="Lexend"/>
+              </w:rPr>
+            </w:pPr>
+            <w:r>
+              <w:rPr>
+                <w:rFonts w:ascii="Lexend" w:hAnsi="Lexend" w:eastAsia="Lexend" w:cs="Lexend"/>
+                <w:color w:val="000000"/>
+                <w:sz w:val="24"/>
+              </w:rPr>
+              <w:t xml:space="preserve">Plage de mesure</w:t>
+            </w:r>
+            <w:r>
+              <w:rPr>
+                <w:rFonts w:ascii="Lexend" w:hAnsi="Lexend" w:eastAsia="Lexend" w:cs="Lexend"/>
+              </w:rPr>
+            </w:r>
+            <w:r>
+              <w:rPr>
+                <w:rFonts w:ascii="Lexend" w:hAnsi="Lexend" w:cs="Lexend"/>
+              </w:rPr>
+            </w:r>
+          </w:p>
+        </w:tc>
+        <w:tc>
+          <w:tcPr>
+            <w:tcBorders/>
+            <w:tcMar>
+              <w:left w:w="15" w:type="dxa"/>
+              <w:top w:w="15" w:type="dxa"/>
+              <w:right w:w="15" w:type="dxa"/>
+              <w:bottom w:w="15" w:type="dxa"/>
+            </w:tcMar>
+            <w:tcW w:w="5244" w:type="dxa"/>
+            <w:vAlign w:val="center"/>
+            <w:textDirection w:val="lrTb"/>
+            <w:noWrap w:val="false"/>
+          </w:tcPr>
+          <w:p>
+            <w:pPr>
+              <w:pBdr/>
+              <w:spacing w:after="0" w:before="0" w:line="240" w:lineRule="auto"/>
+              <w:ind/>
+              <w:rPr>
+                <w:rFonts w:ascii="Lexend" w:hAnsi="Lexend" w:cs="Lexend"/>
+              </w:rPr>
+            </w:pPr>
+            <w:r>
+              <w:rPr>
+                <w:rFonts w:ascii="Lexend" w:hAnsi="Lexend" w:eastAsia="Lexend" w:cs="Lexend"/>
+                <w:color w:val="000000"/>
+                <w:sz w:val="24"/>
+              </w:rPr>
+              <w:t xml:space="preserve">0 – 999,9 µg/m³</w:t>
+            </w:r>
+            <w:r>
+              <w:rPr>
+                <w:rFonts w:ascii="Lexend" w:hAnsi="Lexend" w:eastAsia="Lexend" w:cs="Lexend"/>
+              </w:rPr>
+            </w:r>
+            <w:r>
+              <w:rPr>
+                <w:rFonts w:ascii="Lexend" w:hAnsi="Lexend" w:cs="Lexend"/>
+              </w:rPr>
+            </w:r>
+          </w:p>
+        </w:tc>
+      </w:tr>
+      <w:tr>
+        <w:trPr/>
+        <w:tc>
+          <w:tcPr>
+            <w:tcBorders/>
+            <w:tcMar>
+              <w:left w:w="15" w:type="dxa"/>
+              <w:top w:w="15" w:type="dxa"/>
+              <w:right w:w="15" w:type="dxa"/>
+              <w:bottom w:w="15" w:type="dxa"/>
+            </w:tcMar>
+            <w:tcW w:w="3118" w:type="dxa"/>
+            <w:vAlign w:val="center"/>
+            <w:textDirection w:val="lrTb"/>
+            <w:noWrap w:val="false"/>
+          </w:tcPr>
+          <w:p>
+            <w:pPr>
+              <w:pBdr/>
+              <w:spacing w:after="0" w:before="0" w:line="240" w:lineRule="auto"/>
+              <w:ind/>
+              <w:rPr>
+                <w:rFonts w:ascii="Lexend" w:hAnsi="Lexend" w:cs="Lexend"/>
+              </w:rPr>
+            </w:pPr>
+            <w:r>
+              <w:rPr>
+                <w:rFonts w:ascii="Lexend" w:hAnsi="Lexend" w:eastAsia="Lexend" w:cs="Lexend"/>
+                <w:color w:val="000000"/>
+                <w:sz w:val="24"/>
+              </w:rPr>
+              <w:t xml:space="preserve">Précision</w:t>
+            </w:r>
+            <w:r>
+              <w:rPr>
+                <w:rFonts w:ascii="Lexend" w:hAnsi="Lexend" w:eastAsia="Lexend" w:cs="Lexend"/>
+              </w:rPr>
+            </w:r>
+            <w:r>
+              <w:rPr>
+                <w:rFonts w:ascii="Lexend" w:hAnsi="Lexend" w:cs="Lexend"/>
+              </w:rPr>
+            </w:r>
+          </w:p>
+        </w:tc>
+        <w:tc>
+          <w:tcPr>
+            <w:tcBorders/>
+            <w:tcMar>
+              <w:left w:w="15" w:type="dxa"/>
+              <w:top w:w="15" w:type="dxa"/>
+              <w:right w:w="15" w:type="dxa"/>
+              <w:bottom w:w="15" w:type="dxa"/>
+            </w:tcMar>
+            <w:tcW w:w="5244" w:type="dxa"/>
+            <w:vAlign w:val="center"/>
+            <w:textDirection w:val="lrTb"/>
+            <w:noWrap w:val="false"/>
+          </w:tcPr>
+          <w:p>
+            <w:pPr>
+              <w:pBdr/>
+              <w:spacing w:after="0" w:before="0" w:line="240" w:lineRule="auto"/>
+              <w:ind/>
+              <w:rPr>
+                <w:rFonts w:ascii="Lexend" w:hAnsi="Lexend" w:cs="Lexend"/>
+              </w:rPr>
+            </w:pPr>
+            <w:r>
+              <w:rPr>
+                <w:rFonts w:ascii="Lexend" w:hAnsi="Lexend" w:eastAsia="Lexend" w:cs="Lexend"/>
+                <w:color w:val="000000"/>
+                <w:sz w:val="24"/>
+              </w:rPr>
+              <w:t xml:space="preserve">±15 % ou ±10 µg/m³</w:t>
+            </w:r>
+            <w:r>
+              <w:rPr>
+                <w:rFonts w:ascii="Lexend" w:hAnsi="Lexend" w:eastAsia="Lexend" w:cs="Lexend"/>
+              </w:rPr>
+            </w:r>
+            <w:r>
+              <w:rPr>
+                <w:rFonts w:ascii="Lexend" w:hAnsi="Lexend" w:cs="Lexend"/>
+              </w:rPr>
+            </w:r>
+          </w:p>
+        </w:tc>
+      </w:tr>
+      <w:tr>
+        <w:trPr/>
+        <w:tc>
+          <w:tcPr>
+            <w:tcBorders/>
+            <w:tcMar>
+              <w:left w:w="15" w:type="dxa"/>
+              <w:top w:w="15" w:type="dxa"/>
+              <w:right w:w="15" w:type="dxa"/>
+              <w:bottom w:w="15" w:type="dxa"/>
+            </w:tcMar>
+            <w:tcW w:w="3118" w:type="dxa"/>
+            <w:vAlign w:val="center"/>
+            <w:textDirection w:val="lrTb"/>
+            <w:noWrap w:val="false"/>
+          </w:tcPr>
+          <w:p>
+            <w:pPr>
+              <w:pBdr/>
+              <w:spacing w:after="0" w:before="0" w:line="240" w:lineRule="auto"/>
+              <w:ind/>
+              <w:rPr>
+                <w:rFonts w:ascii="Lexend" w:hAnsi="Lexend" w:cs="Lexend"/>
+              </w:rPr>
+            </w:pPr>
+            <w:r>
+              <w:rPr>
+                <w:rFonts w:ascii="Lexend" w:hAnsi="Lexend" w:eastAsia="Lexend" w:cs="Lexend"/>
+                <w:color w:val="000000"/>
+                <w:sz w:val="24"/>
+              </w:rPr>
+              <w:t xml:space="preserve">Alimentation</w:t>
+            </w:r>
+            <w:r>
+              <w:rPr>
+                <w:rFonts w:ascii="Lexend" w:hAnsi="Lexend" w:eastAsia="Lexend" w:cs="Lexend"/>
+              </w:rPr>
+            </w:r>
+            <w:r>
+              <w:rPr>
+                <w:rFonts w:ascii="Lexend" w:hAnsi="Lexend" w:cs="Lexend"/>
+              </w:rPr>
+            </w:r>
+          </w:p>
+        </w:tc>
+        <w:tc>
+          <w:tcPr>
+            <w:tcBorders/>
+            <w:tcMar>
+              <w:left w:w="15" w:type="dxa"/>
+              <w:top w:w="15" w:type="dxa"/>
+              <w:right w:w="15" w:type="dxa"/>
+              <w:bottom w:w="15" w:type="dxa"/>
+            </w:tcMar>
+            <w:tcW w:w="5244" w:type="dxa"/>
+            <w:vAlign w:val="center"/>
+            <w:textDirection w:val="lrTb"/>
+            <w:noWrap w:val="false"/>
+          </w:tcPr>
+          <w:p>
+            <w:pPr>
+              <w:pBdr/>
+              <w:spacing w:after="0" w:before="0" w:line="240" w:lineRule="auto"/>
+              <w:ind/>
+              <w:rPr>
+                <w:rFonts w:ascii="Lexend" w:hAnsi="Lexend" w:cs="Lexend"/>
+              </w:rPr>
+            </w:pPr>
+            <w:r>
+              <w:rPr>
+                <w:rFonts w:ascii="Lexend" w:hAnsi="Lexend" w:eastAsia="Lexend" w:cs="Lexend"/>
+                <w:color w:val="000000"/>
+                <w:sz w:val="24"/>
+              </w:rPr>
+              <w:t xml:space="preserve">5V DC</w:t>
+            </w:r>
+            <w:r>
+              <w:rPr>
+                <w:rFonts w:ascii="Lexend" w:hAnsi="Lexend" w:eastAsia="Lexend" w:cs="Lexend"/>
+              </w:rPr>
+            </w:r>
+            <w:r>
+              <w:rPr>
+                <w:rFonts w:ascii="Lexend" w:hAnsi="Lexend" w:cs="Lexend"/>
+              </w:rPr>
+            </w:r>
+          </w:p>
+        </w:tc>
+      </w:tr>
+      <w:tr>
+        <w:trPr/>
+        <w:tc>
+          <w:tcPr>
+            <w:tcBorders/>
+            <w:tcMar>
+              <w:left w:w="15" w:type="dxa"/>
+              <w:top w:w="15" w:type="dxa"/>
+              <w:right w:w="15" w:type="dxa"/>
+              <w:bottom w:w="15" w:type="dxa"/>
+            </w:tcMar>
+            <w:tcW w:w="3118" w:type="dxa"/>
+            <w:vAlign w:val="center"/>
+            <w:textDirection w:val="lrTb"/>
+            <w:noWrap w:val="false"/>
+          </w:tcPr>
+          <w:p>
+            <w:pPr>
+              <w:pBdr/>
+              <w:spacing w:after="0" w:before="0" w:line="240" w:lineRule="auto"/>
+              <w:ind/>
+              <w:rPr>
+                <w:rFonts w:ascii="Lexend" w:hAnsi="Lexend" w:cs="Lexend"/>
+              </w:rPr>
+            </w:pPr>
+            <w:r>
+              <w:rPr>
+                <w:rFonts w:ascii="Lexend" w:hAnsi="Lexend" w:eastAsia="Lexend" w:cs="Lexend"/>
+                <w:color w:val="000000"/>
+                <w:sz w:val="24"/>
+              </w:rPr>
+              <w:t xml:space="preserve">Courant de fonctionnement</w:t>
+            </w:r>
+            <w:r>
+              <w:rPr>
+                <w:rFonts w:ascii="Lexend" w:hAnsi="Lexend" w:eastAsia="Lexend" w:cs="Lexend"/>
+              </w:rPr>
+            </w:r>
+            <w:r>
+              <w:rPr>
+                <w:rFonts w:ascii="Lexend" w:hAnsi="Lexend" w:cs="Lexend"/>
+              </w:rPr>
+            </w:r>
+          </w:p>
+        </w:tc>
+        <w:tc>
+          <w:tcPr>
+            <w:tcBorders/>
+            <w:tcMar>
+              <w:left w:w="15" w:type="dxa"/>
+              <w:top w:w="15" w:type="dxa"/>
+              <w:right w:w="15" w:type="dxa"/>
+              <w:bottom w:w="15" w:type="dxa"/>
+            </w:tcMar>
+            <w:tcW w:w="5244" w:type="dxa"/>
+            <w:vAlign w:val="center"/>
+            <w:textDirection w:val="lrTb"/>
+            <w:noWrap w:val="false"/>
+          </w:tcPr>
+          <w:p>
+            <w:pPr>
+              <w:pBdr/>
+              <w:spacing w:after="0" w:before="0" w:line="240" w:lineRule="auto"/>
+              <w:ind/>
+              <w:rPr>
+                <w:rFonts w:ascii="Lexend" w:hAnsi="Lexend" w:cs="Lexend"/>
+              </w:rPr>
+            </w:pPr>
+            <w:r>
+              <w:rPr>
+                <w:rFonts w:ascii="Lexend" w:hAnsi="Lexend" w:eastAsia="Lexend" w:cs="Lexend"/>
+                <w:color w:val="000000"/>
+                <w:sz w:val="24"/>
+              </w:rPr>
+              <w:t xml:space="preserve">~100 mA</w:t>
+            </w:r>
+            <w:r>
+              <w:rPr>
+                <w:rFonts w:ascii="Lexend" w:hAnsi="Lexend" w:eastAsia="Lexend" w:cs="Lexend"/>
+              </w:rPr>
+            </w:r>
+            <w:r>
+              <w:rPr>
+                <w:rFonts w:ascii="Lexend" w:hAnsi="Lexend" w:cs="Lexend"/>
+              </w:rPr>
+            </w:r>
+          </w:p>
+        </w:tc>
+      </w:tr>
+      <w:tr>
+        <w:trPr/>
+        <w:tc>
+          <w:tcPr>
+            <w:tcBorders/>
+            <w:tcMar>
+              <w:left w:w="15" w:type="dxa"/>
+              <w:top w:w="15" w:type="dxa"/>
+              <w:right w:w="15" w:type="dxa"/>
+              <w:bottom w:w="15" w:type="dxa"/>
+            </w:tcMar>
+            <w:tcW w:w="3118" w:type="dxa"/>
+            <w:vAlign w:val="center"/>
+            <w:textDirection w:val="lrTb"/>
+            <w:noWrap w:val="false"/>
+          </w:tcPr>
+          <w:p>
+            <w:pPr>
+              <w:pBdr/>
+              <w:spacing w:after="0" w:before="0" w:line="240" w:lineRule="auto"/>
+              <w:ind/>
+              <w:rPr>
+                <w:rFonts w:ascii="Lexend" w:hAnsi="Lexend" w:cs="Lexend"/>
+              </w:rPr>
+            </w:pPr>
+            <w:r>
+              <w:rPr>
+                <w:rFonts w:ascii="Lexend" w:hAnsi="Lexend" w:eastAsia="Lexend" w:cs="Lexend"/>
+                <w:color w:val="000000"/>
+                <w:sz w:val="24"/>
+              </w:rPr>
+              <w:t xml:space="preserve">Durée de vie du laser</w:t>
+            </w:r>
+            <w:r>
+              <w:rPr>
+                <w:rFonts w:ascii="Lexend" w:hAnsi="Lexend" w:eastAsia="Lexend" w:cs="Lexend"/>
+              </w:rPr>
+            </w:r>
+            <w:r>
+              <w:rPr>
+                <w:rFonts w:ascii="Lexend" w:hAnsi="Lexend" w:cs="Lexend"/>
+              </w:rPr>
+            </w:r>
+          </w:p>
+        </w:tc>
+        <w:tc>
+          <w:tcPr>
+            <w:tcBorders/>
+            <w:tcMar>
+              <w:left w:w="15" w:type="dxa"/>
+              <w:top w:w="15" w:type="dxa"/>
+              <w:right w:w="15" w:type="dxa"/>
+              <w:bottom w:w="15" w:type="dxa"/>
+            </w:tcMar>
+            <w:tcW w:w="5244" w:type="dxa"/>
+            <w:vAlign w:val="center"/>
+            <w:textDirection w:val="lrTb"/>
+            <w:noWrap w:val="false"/>
+          </w:tcPr>
+          <w:p>
+            <w:pPr>
+              <w:pBdr/>
+              <w:spacing w:after="0" w:before="0" w:line="240" w:lineRule="auto"/>
+              <w:ind/>
+              <w:rPr>
+                <w:rFonts w:ascii="Lexend" w:hAnsi="Lexend" w:cs="Lexend"/>
+              </w:rPr>
+            </w:pPr>
+            <w:r>
+              <w:rPr>
+                <w:rFonts w:ascii="Lexend" w:hAnsi="Lexend" w:eastAsia="Lexend" w:cs="Lexend"/>
+                <w:color w:val="000000"/>
+                <w:sz w:val="24"/>
+              </w:rPr>
+              <w:t xml:space="preserve">~8 000 heures</w:t>
+            </w:r>
+            <w:r>
+              <w:rPr>
+                <w:rFonts w:ascii="Lexend" w:hAnsi="Lexend" w:eastAsia="Lexend" w:cs="Lexend"/>
+              </w:rPr>
+            </w:r>
+            <w:r>
+              <w:rPr>
+                <w:rFonts w:ascii="Lexend" w:hAnsi="Lexend" w:cs="Lexend"/>
+              </w:rPr>
+            </w:r>
+          </w:p>
+        </w:tc>
+      </w:tr>
+      <w:tr>
+        <w:trPr/>
+        <w:tc>
+          <w:tcPr>
+            <w:tcBorders/>
+            <w:tcMar>
+              <w:left w:w="15" w:type="dxa"/>
+              <w:top w:w="15" w:type="dxa"/>
+              <w:right w:w="15" w:type="dxa"/>
+              <w:bottom w:w="15" w:type="dxa"/>
+            </w:tcMar>
+            <w:tcW w:w="3118" w:type="dxa"/>
+            <w:vAlign w:val="center"/>
+            <w:textDirection w:val="lrTb"/>
+            <w:noWrap w:val="false"/>
+          </w:tcPr>
+          <w:p>
+            <w:pPr>
+              <w:pBdr/>
+              <w:spacing w:after="0" w:before="0" w:line="240" w:lineRule="auto"/>
+              <w:ind/>
+              <w:rPr>
+                <w:rFonts w:ascii="Lexend" w:hAnsi="Lexend" w:cs="Lexend"/>
+              </w:rPr>
+            </w:pPr>
+            <w:r>
+              <w:rPr>
+                <w:rFonts w:ascii="Lexend" w:hAnsi="Lexend" w:eastAsia="Lexend" w:cs="Lexend"/>
+                <w:color w:val="000000"/>
+                <w:sz w:val="24"/>
+              </w:rPr>
+              <w:t xml:space="preserve">Plage de température</w:t>
+            </w:r>
+            <w:r>
+              <w:rPr>
+                <w:rFonts w:ascii="Lexend" w:hAnsi="Lexend" w:eastAsia="Lexend" w:cs="Lexend"/>
+              </w:rPr>
+            </w:r>
+            <w:r>
+              <w:rPr>
+                <w:rFonts w:ascii="Lexend" w:hAnsi="Lexend" w:cs="Lexend"/>
+              </w:rPr>
+            </w:r>
+          </w:p>
+        </w:tc>
+        <w:tc>
+          <w:tcPr>
+            <w:tcBorders/>
+            <w:tcMar>
+              <w:left w:w="15" w:type="dxa"/>
+              <w:top w:w="15" w:type="dxa"/>
+              <w:right w:w="15" w:type="dxa"/>
+              <w:bottom w:w="15" w:type="dxa"/>
+            </w:tcMar>
+            <w:tcW w:w="5244" w:type="dxa"/>
+            <w:vAlign w:val="center"/>
+            <w:textDirection w:val="lrTb"/>
+            <w:noWrap w:val="false"/>
+          </w:tcPr>
+          <w:p>
+            <w:pPr>
+              <w:pBdr/>
+              <w:spacing w:after="0" w:before="0" w:line="240" w:lineRule="auto"/>
+              <w:ind/>
+              <w:rPr>
+                <w:rFonts w:ascii="Lexend" w:hAnsi="Lexend" w:cs="Lexend"/>
+              </w:rPr>
+            </w:pPr>
+            <w:r>
+              <w:rPr>
+                <w:rFonts w:ascii="Lexend" w:hAnsi="Lexend" w:eastAsia="Lexend" w:cs="Lexend"/>
+                <w:color w:val="000000"/>
+                <w:sz w:val="24"/>
+              </w:rPr>
+              <w:t xml:space="preserve">-20°C à +50°C</w:t>
+            </w:r>
+            <w:r>
+              <w:rPr>
+                <w:rFonts w:ascii="Lexend" w:hAnsi="Lexend" w:eastAsia="Lexend" w:cs="Lexend"/>
+              </w:rPr>
+            </w:r>
+            <w:r>
+              <w:rPr>
+                <w:rFonts w:ascii="Lexend" w:hAnsi="Lexend" w:cs="Lexend"/>
+              </w:rPr>
+            </w:r>
+          </w:p>
+        </w:tc>
+      </w:tr>
+      <w:tr>
+        <w:trPr/>
+        <w:tc>
+          <w:tcPr>
+            <w:tcBorders/>
+            <w:tcMar>
+              <w:left w:w="15" w:type="dxa"/>
+              <w:top w:w="15" w:type="dxa"/>
+              <w:right w:w="15" w:type="dxa"/>
+              <w:bottom w:w="15" w:type="dxa"/>
+            </w:tcMar>
+            <w:tcW w:w="3118" w:type="dxa"/>
+            <w:vAlign w:val="center"/>
+            <w:textDirection w:val="lrTb"/>
+            <w:noWrap w:val="false"/>
+          </w:tcPr>
+          <w:p>
+            <w:pPr>
+              <w:pBdr/>
+              <w:spacing w:after="0" w:before="0" w:line="240" w:lineRule="auto"/>
+              <w:ind/>
+              <w:rPr>
+                <w:rFonts w:ascii="Lexend" w:hAnsi="Lexend" w:cs="Lexend"/>
+              </w:rPr>
+            </w:pPr>
+            <w:r>
+              <w:rPr>
+                <w:rFonts w:ascii="Lexend" w:hAnsi="Lexend" w:eastAsia="Lexend" w:cs="Lexend"/>
+                <w:color w:val="000000"/>
+                <w:sz w:val="24"/>
+              </w:rPr>
+              <w:t xml:space="preserve">Humidité relative max</w:t>
+            </w:r>
+            <w:r>
+              <w:rPr>
+                <w:rFonts w:ascii="Lexend" w:hAnsi="Lexend" w:eastAsia="Lexend" w:cs="Lexend"/>
+              </w:rPr>
+            </w:r>
+            <w:r>
+              <w:rPr>
+                <w:rFonts w:ascii="Lexend" w:hAnsi="Lexend" w:cs="Lexend"/>
+              </w:rPr>
+            </w:r>
+          </w:p>
+        </w:tc>
+        <w:tc>
+          <w:tcPr>
+            <w:tcBorders/>
+            <w:tcMar>
+              <w:left w:w="15" w:type="dxa"/>
+              <w:top w:w="15" w:type="dxa"/>
+              <w:right w:w="15" w:type="dxa"/>
+              <w:bottom w:w="15" w:type="dxa"/>
+            </w:tcMar>
+            <w:tcW w:w="5244" w:type="dxa"/>
+            <w:vAlign w:val="center"/>
+            <w:textDirection w:val="lrTb"/>
+            <w:noWrap w:val="false"/>
+          </w:tcPr>
+          <w:p>
+            <w:pPr>
+              <w:pBdr/>
+              <w:spacing w:after="0" w:before="0" w:line="240" w:lineRule="auto"/>
+              <w:ind/>
+              <w:rPr>
+                <w:rFonts w:ascii="Lexend" w:hAnsi="Lexend" w:cs="Lexend"/>
+              </w:rPr>
+            </w:pPr>
+            <w:r>
+              <w:rPr>
+                <w:rFonts w:ascii="Lexend" w:hAnsi="Lexend" w:eastAsia="Lexend" w:cs="Lexend"/>
+                <w:color w:val="000000"/>
+                <w:sz w:val="24"/>
+              </w:rPr>
+              <w:t xml:space="preserve">70 % RH</w:t>
+            </w:r>
+            <w:r>
+              <w:rPr>
+                <w:rFonts w:ascii="Lexend" w:hAnsi="Lexend" w:eastAsia="Lexend" w:cs="Lexend"/>
+              </w:rPr>
+            </w:r>
+            <w:r>
+              <w:rPr>
+                <w:rFonts w:ascii="Lexend" w:hAnsi="Lexend" w:cs="Lexend"/>
+              </w:rPr>
+            </w:r>
+          </w:p>
+        </w:tc>
+      </w:tr>
+    </w:tbl>
+    <w:p>
+      <w:pPr>
+        <w:pStyle w:val="838"/>
+        <w:pBdr/>
+        <w:spacing/>
+        <w:ind/>
+        <w:rPr>
+          <w:highlight w:val="none"/>
+          <w14:ligatures w14:val="none"/>
+        </w:rPr>
+      </w:pPr>
+      <w:r>
+        <w:rPr>
+          <w:highlight w:val="none"/>
+        </w:rPr>
+      </w:r>
+      <w:r>
+        <w:rPr>
+          <w:highlight w:val="none"/>
+        </w:rPr>
+      </w:r>
+      <w:r>
+        <w:rPr>
+          <w:highlight w:val="none"/>
+          <w14:ligatures w14:val="none"/>
+        </w:rPr>
+      </w:r>
+    </w:p>
+    <w:p>
+      <w:pPr>
+        <w:pStyle w:val="838"/>
+        <w:pBdr/>
+        <w:spacing/>
+        <w:ind/>
+        <w:rPr>
+          <w:highlight w:val="none"/>
+          <w14:ligatures w14:val="none"/>
+        </w:rPr>
+      </w:pPr>
+      <w:r>
+        <w:rPr>
+          <w:highlight w:val="none"/>
+        </w:rPr>
+        <w:t xml:space="preserve">2 – Fonctionnement du capteur</w:t>
+      </w:r>
+      <w:r>
+        <w:rPr>
+          <w14:ligatures w14:val="none"/>
+        </w:rPr>
+      </w:r>
+      <w:r>
+        <w:rPr>
+          <w:highlight w:val="none"/>
+          <w14:ligatures w14:val="none"/>
+        </w:rPr>
+      </w:r>
+    </w:p>
+    <w:p>
+      <w:pPr>
+        <w:pStyle w:val="839"/>
+        <w:pBdr/>
+        <w:spacing/>
+        <w:ind/>
+        <w:rPr>
+          <w14:ligatures w14:val="none"/>
+        </w:rPr>
+      </w:pPr>
+      <w:r>
+        <w:rPr>
+          <w:highlight w:val="none"/>
+        </w:rPr>
+        <w:t xml:space="preserve">2.1 – Principe de mesure</w:t>
+      </w:r>
+      <w:r>
+        <w:rPr>
+          <w:highlight w:val="none"/>
+        </w:rPr>
+      </w:r>
+      <w:r>
+        <w:rPr>
+          <w14:ligatures w14:val="none"/>
+        </w:rPr>
+      </w:r>
+    </w:p>
+    <w:p>
+      <w:pPr>
+        <w:pBdr/>
+        <w:spacing/>
+        <w:ind/>
+        <w:rPr/>
+      </w:pPr>
+      <w:r>
+        <w:rPr>
+          <w:highlight w:val="none"/>
+        </w:rPr>
+        <w:t xml:space="preserve">L</w:t>
+      </w:r>
+      <w:r>
+        <w:rPr>
+          <w:highlight w:val="none"/>
+        </w:rPr>
+        <w:t xml:space="preserve">e SDS011 utilise la technique de diffusion laser. Un faisceau laser illumine les particules en suspension dans l'air aspiré par le ventilateur interne. Un photorécepteur mesure ensuite la lumière diffusée par ces particules, ce qui permet d'en déduire leur</w:t>
+      </w:r>
+      <w:r>
+        <w:rPr>
+          <w:highlight w:val="none"/>
+        </w:rPr>
+        <w:t xml:space="preserve"> concentration et leur taille approximative.</w:t>
+      </w:r>
+      <w:r>
+        <w:rPr>
+          <w:highlight w:val="none"/>
+        </w:rPr>
+      </w:r>
+      <w:r/>
+    </w:p>
+    <w:p>
+      <w:pPr>
+        <w:pStyle w:val="839"/>
+        <w:pBdr/>
+        <w:spacing/>
+        <w:ind/>
+        <w:rPr>
+          <w:b/>
+          <w:bCs/>
+        </w:rPr>
+      </w:pPr>
+      <w:r>
+        <w:rPr>
+          <w:b/>
+          <w:bCs/>
+          <w:highlight w:val="none"/>
+        </w:rPr>
+        <w:t xml:space="preserve">2.2 – Branchement</w:t>
+      </w:r>
+      <w:r>
+        <w:rPr>
+          <w:b/>
+          <w:bCs/>
+          <w:highlight w:val="none"/>
+        </w:rPr>
+      </w:r>
+      <w:r>
+        <w:rPr>
+          <w:b/>
+          <w:bCs/>
+        </w:rPr>
+      </w:r>
+    </w:p>
+    <w:p>
+      <w:pPr>
+        <w:pBdr/>
+        <w:spacing/>
+        <w:ind/>
+        <w:rPr>
+          <w:highlight w:val="none"/>
+        </w:rPr>
+      </w:pPr>
+      <w:r>
+        <w:rPr>
+          <w:highlight w:val="none"/>
+        </w:rPr>
+        <w:t xml:space="preserve">Le capteur peut se brancher de différentes manières. Il est possible de le connecter directement via ses broches, notamment les pins 1 µm et 2,5 µm qui fournissent les mesures analogiques correspondantes.</w:t>
+      </w:r>
+      <w:r>
+        <w:rPr>
+          <w:highlight w:val="none"/>
+        </w:rPr>
+      </w:r>
+      <w:r>
+        <w:rPr>
+          <w:highlight w:val="none"/>
+        </w:rPr>
+      </w:r>
+    </w:p>
+    <w:p>
+      <w:pPr>
+        <w:pBdr/>
+        <w:spacing/>
+        <w:ind/>
+        <w:rPr/>
+      </w:pPr>
+      <w:r>
+        <w:rPr>
+          <w:highlight w:val="none"/>
+        </w:rPr>
+      </w:r>
+      <w:r>
+        <mc:AlternateContent>
+          <mc:Choice Requires="wpg">
+            <w:drawing>
+              <wp:anchor xmlns:wp="http://schemas.openxmlformats.org/drawingml/2006/wordprocessingDrawing" xmlns:wp14="http://schemas.microsoft.com/office/word/2010/wordprocessingDrawing" distT="0" distB="0" distL="115200" distR="115200" simplePos="0" relativeHeight="9216" behindDoc="0" locked="0" layoutInCell="1" allowOverlap="1">
+                <wp:simplePos x="0" y="0"/>
+                <wp:positionH relativeFrom="column">
+                  <wp:posOffset>0</wp:posOffset>
+                </wp:positionH>
+                <wp:positionV relativeFrom="paragraph">
+                  <wp:posOffset>22225</wp:posOffset>
+                </wp:positionV>
+                <wp:extent cx="3699215" cy="988472"/>
+                <wp:effectExtent l="0" t="0" r="0" b="0"/>
+                <wp:wrapNone/>
+                <wp:docPr id="2" name=""/>
+                <wp:cNvGraphicFramePr>
+                  <a:graphicFrameLocks xmlns:a="http://schemas.openxmlformats.org/drawingml/2006/main" noChangeAspect="1"/>
+                </wp:cNvGraphicFramePr>
+                <a:graphic xmlns:a="http://schemas.openxmlformats.org/drawingml/2006/main">
+                  <a:graphicData uri="http://schemas.openxmlformats.org/drawingml/2006/picture">
+                    <pic:pic xmlns:pic="http://schemas.openxmlformats.org/drawingml/2006/picture">
+                      <pic:nvPicPr>
+                        <pic:cNvPr id="2010109740" name=""/>
+                        <pic:cNvPicPr>
+                          <a:picLocks noChangeAspect="1"/>
+                        </pic:cNvPicPr>
+                        <pic:nvPr/>
+                      </pic:nvPicPr>
+                      <pic:blipFill rotWithShape="1">
+                        <a:blip r:embed="rId11"/>
+                        <a:srcRect l="25923" t="57379" r="16989" b="22281"/>
+                        <a:stretch/>
+                      </pic:blipFill>
+                      <pic:spPr bwMode="auto">
+                        <a:xfrm flipH="0" flipV="0">
+                          <a:off x="0" y="0"/>
+                          <a:ext cx="3699214" cy="988472"/>
+                        </a:xfrm>
+                        <a:prstGeom prst="rect">
+                          <a:avLst/>
+                        </a:prstGeom>
+                      </pic:spPr>
+                    </pic:pic>
+                  </a:graphicData>
+                </a:graphic>
+              </wp:anchor>
+            </w:drawing>
+          </mc:Choice>
+          <mc:Fallback>
+            <w:pict>
+              <v:shapetype id="_x0000_t75" coordsize="21600,21600" o:spt="75" o:preferrelative="t" path="m@4@5l@4@11@9@11@9@5xe" filled="f" stroked="f">
+                <v:stroke joinstyle="miter"/>
+                <v:formulas>
+                  <v:f eqn="if lineDrawn pixelLineWidth 0"/>
+                  <v:f eqn="sum @0 1 0"/>
+                  <v:f eqn="sum 0 0 @1"/>
+                  <v:f eqn="prod @2 1 2"/>
+                  <v:f eqn="prod @3 21600 pixelWidth"/>
+                  <v:f eqn="prod @3 21600 pixelHeight"/>
+                  <v:f eqn="sum @0 0 1"/>
+                  <v:f eqn="prod @6 1 2"/>
+                  <v:f eqn="prod @7 21600 pixelWidth"/>
+                  <v:f eqn="sum @8 21600 0"/>
+                  <v:f eqn="prod @7 21600 pixelHeight"/>
+                  <v:f eqn="sum @10 21600 0"/>
+                </v:formulas>
+                <v:path o:extrusionok="f" gradientshapeok="t" o:connecttype="rect"/>
+                <o:lock v:ext="edit" aspectratio="t"/>
+              </v:shapetype>
+              <v:shape id="_x0000_i1" o:spid="_x0000_s1" type="#_x0000_t75" style="position:absolute;z-index:9216;o:allowoverlap:true;o:allowincell:true;mso-position-horizontal-relative:text;margin-left:0.00pt;mso-position-horizontal:absolute;mso-position-vertical-relative:text;margin-top:1.75pt;mso-position-vertical:absolute;width:291.28pt;height:77.83pt;mso-wrap-distance-left:9.07pt;mso-wrap-distance-top:0.00pt;mso-wrap-distance-right:9.07pt;mso-wrap-distance-bottom:0.00pt;z-index:1;" stroked="false">
+                <v:imagedata r:id="rId11" o:title="" croptop="37604f" cropleft="16989f" cropbottom="14602f" cropright="11134f"/>
+                <o:lock v:ext="edit" rotation="t"/>
+              </v:shape>
+            </w:pict>
+          </mc:Fallback>
+        </mc:AlternateContent>
+      </w:r>
+      <w:r>
+        <w:rPr>
+          <w:highlight w:val="none"/>
+        </w:rPr>
+      </w:r>
+      <w:r/>
+    </w:p>
+    <w:p>
+      <w:pPr>
+        <w:pBdr/>
+        <w:spacing/>
+        <w:ind/>
+        <w:rPr>
+          <w:rFonts w:ascii="Lexend" w:hAnsi="Lexend" w:cs="Lexend"/>
+        </w:rPr>
+      </w:pPr>
+      <w:r>
+        <w:rPr>
           <w:rFonts w:ascii="Lexend" w:hAnsi="Lexend" w:eastAsia="Lexend" w:cs="Lexend"/>
           <w:highlight w:val="none"/>
         </w:rPr>
       </w:r>
       <w:r>
         <w:rPr>
-          <w:rFonts w:ascii="Lexend" w:hAnsi="Lexend" w:eastAsia="Lexend" w:cs="Lexend"/>
-          <w:highlight w:val="none"/>
+          <w:rFonts w:ascii="Lexend" w:hAnsi="Lexend" w:cs="Lexend"/>
+        </w:rPr>
+      </w:r>
+      <w:r>
+        <w:rPr>
+          <w:rFonts w:ascii="Lexend" w:hAnsi="Lexend" w:cs="Lexend"/>
         </w:rPr>
       </w:r>
     </w:p>
     <w:p>
       <w:pPr>
-        <w:pBdr/>
-        <w:spacing/>
-        <w:ind/>
-        <w:rPr>
-          <w14:ligatures w14:val="none"/>
-        </w:rPr>
-      </w:pPr>
-      <w:r>
-        <w:rPr>
-          <w:highlight w:val="none"/>
-        </w:rPr>
-        <w:t xml:space="preserve">Le capteur choisi pour le projet est le capteur de particule SDS011. Il peut faire des mesures de particules de la taille PM2.5 et PM10. Qui sont des tailles réglementaires de 2.5µm et 10µm.</w:t>
-      </w:r>
-      <w:r/>
-    </w:p>
-    <w:p>
-      <w:pPr>
+        <w:pStyle w:val="838"/>
         <w:pBdr/>
         <w:spacing/>
         <w:ind/>
         <w:rPr>
           <w:rFonts w:ascii="Lexend" w:hAnsi="Lexend" w:cs="Lexend"/>
+          <w:highlight w:val="none"/>
+          <w14:ligatures w14:val="none"/>
         </w:rPr>
       </w:pPr>
       <w:r>
@@ -1105,20 +2258,145 @@
         <w:rPr>
           <w:rFonts w:ascii="Lexend" w:hAnsi="Lexend" w:eastAsia="Lexend" w:cs="Lexend"/>
         </w:rPr>
+        <mc:AlternateContent>
+          <mc:Choice Requires="wpg">
+            <w:drawing>
+              <wp:inline xmlns:wp="http://schemas.openxmlformats.org/drawingml/2006/wordprocessingDrawing" distT="0" distB="0" distL="0" distR="0">
+                <wp:extent cx="6480175" cy="2213214"/>
+                <wp:effectExtent l="0" t="0" r="0" b="0"/>
+                <wp:docPr id="3" name=""/>
+                <wp:cNvGraphicFramePr>
+                  <a:graphicFrameLocks xmlns:a="http://schemas.openxmlformats.org/drawingml/2006/main" noChangeAspect="1"/>
+                </wp:cNvGraphicFramePr>
+                <a:graphic xmlns:a="http://schemas.openxmlformats.org/drawingml/2006/main">
+                  <a:graphicData uri="http://schemas.openxmlformats.org/drawingml/2006/picture">
+                    <pic:pic xmlns:pic="http://schemas.openxmlformats.org/drawingml/2006/picture">
+                      <pic:nvPicPr>
+                        <pic:cNvPr id="800579506" name=""/>
+                        <pic:cNvPicPr>
+                          <a:picLocks noChangeAspect="1"/>
+                        </pic:cNvPicPr>
+                        <pic:nvPr/>
+                      </pic:nvPicPr>
+                      <pic:blipFill rotWithShape="1">
+                        <a:blip r:embed="rId12"/>
+                        <a:stretch/>
+                      </pic:blipFill>
+                      <pic:spPr bwMode="auto">
+                        <a:xfrm rot="0" flipH="0" flipV="0">
+                          <a:off x="0" y="0"/>
+                          <a:ext cx="6480174" cy="2213213"/>
+                        </a:xfrm>
+                        <a:prstGeom prst="rect">
+                          <a:avLst/>
+                        </a:prstGeom>
+                      </pic:spPr>
+                    </pic:pic>
+                  </a:graphicData>
+                </a:graphic>
+              </wp:inline>
+            </w:drawing>
+          </mc:Choice>
+          <mc:Fallback>
+            <w:pict>
+              <v:shapetype id="_x0000_t75" coordsize="21600,21600" o:spt="75" o:preferrelative="t" path="m@4@5l@4@11@9@11@9@5xe" filled="f" stroked="f">
+                <v:stroke joinstyle="miter"/>
+                <v:formulas>
+                  <v:f eqn="if lineDrawn pixelLineWidth 0"/>
+                  <v:f eqn="sum @0 1 0"/>
+                  <v:f eqn="sum 0 0 @1"/>
+                  <v:f eqn="prod @2 1 2"/>
+                  <v:f eqn="prod @3 21600 pixelWidth"/>
+                  <v:f eqn="prod @3 21600 pixelHeight"/>
+                  <v:f eqn="sum @0 0 1"/>
+                  <v:f eqn="prod @6 1 2"/>
+                  <v:f eqn="prod @7 21600 pixelWidth"/>
+                  <v:f eqn="sum @8 21600 0"/>
+                  <v:f eqn="prod @7 21600 pixelHeight"/>
+                  <v:f eqn="sum @10 21600 0"/>
+                </v:formulas>
+                <v:path o:extrusionok="f" gradientshapeok="t" o:connecttype="rect"/>
+                <o:lock v:ext="edit" aspectratio="t"/>
+              </v:shapetype>
+              <v:shape id="_x0000_i2" o:spid="_x0000_s2" type="#_x0000_t75" style="width:510.25pt;height:174.27pt;mso-wrap-distance-left:0.00pt;mso-wrap-distance-top:0.00pt;mso-wrap-distance-right:0.00pt;mso-wrap-distance-bottom:0.00pt;rotation:0;z-index:1;" stroked="false">
+                <v:imagedata r:id="rId12" o:title=""/>
+                <o:lock v:ext="edit" rotation="t"/>
+              </v:shape>
+            </w:pict>
+          </mc:Fallback>
+        </mc:AlternateContent>
       </w:r>
-    </w:p>
-    <w:p>
-      <w:pPr>
-        <w:pStyle w:val="838"/>
-        <w:pBdr/>
-        <w:spacing/>
-        <w:ind/>
+      <w:r>
         <w:rPr>
           <w:rFonts w:ascii="Lexend" w:hAnsi="Lexend" w:cs="Lexend"/>
           <w:highlight w:val="none"/>
           <w14:ligatures w14:val="none"/>
         </w:rPr>
-      </w:pPr>
+      </w:r>
+      <w:r>
+        <w:rPr>
+          <w:rFonts w:ascii="Lexend" w:hAnsi="Lexend" w:cs="Lexend"/>
+          <w:highlight w:val="none"/>
+          <w14:ligatures w14:val="none"/>
+        </w:rPr>
+      </w:r>
+    </w:p>
+    <w:p>
+      <w:pPr>
+        <w:pStyle w:val="839"/>
+        <w:pBdr/>
+        <w:spacing/>
+        <w:ind/>
+        <w:rPr>
+          <w:b/>
+          <w:bCs/>
+        </w:rPr>
+      </w:pPr>
+      <w:r>
+        <w:rPr>
+          <w:rFonts w:ascii="Lexend" w:hAnsi="Lexend" w:eastAsia="Lexend" w:cs="Lexend"/>
+          <w:b/>
+          <w:bCs/>
+          <w:highlight w:val="none"/>
+        </w:rPr>
+        <w:t xml:space="preserve">2.4 – Modes de fonctionnement</w:t>
+      </w:r>
+      <w:r>
+        <w:rPr>
+          <w:rFonts w:ascii="Lexend" w:hAnsi="Lexend" w:eastAsia="Lexend" w:cs="Lexend"/>
+          <w:b/>
+          <w:bCs/>
+          <w:highlight w:val="none"/>
+        </w:rPr>
+      </w:r>
+      <w:r>
+        <w:rPr>
+          <w:b/>
+          <w:bCs/>
+        </w:rPr>
+      </w:r>
+    </w:p>
+    <w:p>
+      <w:pPr>
+        <w:pBdr/>
+        <w:spacing/>
+        <w:ind/>
+        <w:rPr/>
+      </w:pPr>
+      <w:r>
+        <w:rPr>
+          <w:rFonts w:ascii="Lexend" w:hAnsi="Lexend" w:eastAsia="Lexend" w:cs="Lexend"/>
+          <w:highlight w:val="none"/>
+        </w:rPr>
+        <w:t xml:space="preserve">Le SDS011 supporte deux modes de fonctionnement :</w:t>
+      </w:r>
+      <w:r>
+        <w:rPr>
+          <w:rFonts w:ascii="Lexend" w:hAnsi="Lexend" w:eastAsia="Lexend" w:cs="Lexend"/>
+          <w:highlight w:val="none"/>
+        </w:rPr>
+      </w:r>
+      <w:r/>
       <w:r>
         <w:rPr>
           <w:rFonts w:ascii="Lexend" w:hAnsi="Lexend" w:eastAsia="Lexend" w:cs="Lexend"/>
@@ -1131,24 +2409,77 @@
           <w:highlight w:val="none"/>
         </w:rPr>
       </w:r>
+      <w:r/>
+      <w:r/>
+    </w:p>
+    <w:p>
+      <w:pPr>
+        <w:pBdr/>
+        <w:spacing/>
+        <w:ind/>
+        <w:rPr/>
+      </w:pPr>
+      <w:r>
+        <w:rPr>
+          <w:rFonts w:ascii="Lexend" w:hAnsi="Lexend" w:eastAsia="Lexend" w:cs="Lexend"/>
+          <w:b/>
+          <w:bCs/>
+          <w:highlight w:val="none"/>
+        </w:rPr>
+        <w:t xml:space="preserve">Mode actif :</w:t>
+      </w:r>
+      <w:r>
+        <w:rPr>
+          <w:rFonts w:ascii="Lexend" w:hAnsi="Lexend" w:eastAsia="Lexend" w:cs="Lexend"/>
+          <w:highlight w:val="none"/>
+        </w:rPr>
+        <w:t xml:space="preserve"> le capteur envoie automatiquement une trame de données toutes les secondes, sans sollicitation extérieure.</w:t>
+      </w:r>
       <w:r>
         <w:rPr>
           <w:rFonts w:ascii="Lexend" w:hAnsi="Lexend" w:eastAsia="Lexend" w:cs="Lexend"/>
           <w:highlight w:val="none"/>
         </w:rPr>
       </w:r>
+      <w:r/>
     </w:p>
     <w:p>
       <w:pPr>
-        <w:pStyle w:val="838"/>
-        <w:pBdr/>
-        <w:spacing/>
-        <w:ind/>
+        <w:pBdr/>
+        <w:spacing/>
+        <w:ind/>
+        <w:rPr/>
+      </w:pPr>
+      <w:r>
         <w:rPr>
-          <w:rFonts w:ascii="Lexend" w:hAnsi="Lexend" w:cs="Lexend"/>
+          <w:rFonts w:ascii="Lexend" w:hAnsi="Lexend" w:eastAsia="Lexend" w:cs="Lexend"/>
+          <w:b/>
+          <w:bCs/>
           <w:highlight w:val="none"/>
-          <w14:ligatures w14:val="none"/>
         </w:rPr>
+        <w:t xml:space="preserve">Mode interrogation :</w:t>
+      </w:r>
+      <w:r>
+        <w:rPr>
+          <w:rFonts w:ascii="Lexend" w:hAnsi="Lexend" w:eastAsia="Lexend" w:cs="Lexend"/>
+          <w:highlight w:val="none"/>
+        </w:rPr>
+        <w:t xml:space="preserve"> le capteur attend une requête explicite avant de renvoyer une mesure. Ce mode est utile pour ne déclencher une mesure qu'à la demande.</w:t>
+      </w:r>
+      <w:r>
+        <w:rPr>
+          <w:rFonts w:ascii="Lexend" w:hAnsi="Lexend" w:eastAsia="Lexend" w:cs="Lexend"/>
+          <w:highlight w:val="none"/>
+        </w:rPr>
+      </w:r>
+      <w:r/>
+    </w:p>
+    <w:p>
+      <w:pPr>
+        <w:pBdr/>
+        <w:spacing/>
+        <w:ind/>
+        <w:rPr/>
       </w:pPr>
       <w:r>
         <w:rPr>
@@ -1162,12 +2493,98 @@
           <w:highlight w:val="none"/>
         </w:rPr>
       </w:r>
+      <w:r/>
+    </w:p>
+    <w:p>
+      <w:pPr>
+        <w:pStyle w:val="839"/>
+        <w:pBdr/>
+        <w:spacing/>
+        <w:ind/>
+        <w:rPr/>
+      </w:pPr>
+      <w:r>
+        <w:rPr>
+          <w:rFonts w:ascii="Lexend" w:hAnsi="Lexend" w:eastAsia="Lexend" w:cs="Lexend"/>
+          <w:highlight w:val="none"/>
+        </w:rPr>
+        <w:t xml:space="preserve">2.5 – Période de chauffe</w:t>
+      </w:r>
       <w:r>
         <w:rPr>
           <w:rFonts w:ascii="Lexend" w:hAnsi="Lexend" w:eastAsia="Lexend" w:cs="Lexend"/>
           <w:highlight w:val="none"/>
         </w:rPr>
       </w:r>
+      <w:r/>
+    </w:p>
+    <w:p>
+      <w:pPr>
+        <w:pBdr/>
+        <w:spacing/>
+        <w:ind/>
+        <w:rPr/>
+      </w:pPr>
+      <w:r>
+        <w:rPr>
+          <w:rFonts w:ascii="Lexend" w:hAnsi="Lexend" w:eastAsia="Lexend" w:cs="Lexend"/>
+          <w:highlight w:val="none"/>
+        </w:rPr>
+        <w:t xml:space="preserve">Après la mise sous tension, il est recommandé d'attendre environ 30 secondes avant de considérer les mesures comme fiables. Ce délai permet au ventilateur interne de stabiliser le flux d'air traversant la chambre de mesure.</w:t>
+      </w:r>
+      <w:r>
+        <w:rPr>
+          <w:rFonts w:ascii="Lexend" w:hAnsi="Lexend" w:eastAsia="Lexend" w:cs="Lexend"/>
+          <w:highlight w:val="none"/>
+        </w:rPr>
+      </w:r>
+      <w:r/>
+    </w:p>
+    <w:p>
+      <w:pPr>
+        <w:pStyle w:val="839"/>
+        <w:pBdr/>
+        <w:spacing/>
+        <w:ind/>
+        <w:rPr/>
+      </w:pPr>
+      <w:r>
+        <w:rPr>
+          <w:rFonts w:ascii="Lexend" w:hAnsi="Lexend" w:eastAsia="Lexend" w:cs="Lexend"/>
+          <w:highlight w:val="none"/>
+        </w:rPr>
+        <w:t xml:space="preserve">2.6 – Mode veille</w:t>
+      </w:r>
+      <w:r>
+        <w:rPr>
+          <w:rFonts w:ascii="Lexend" w:hAnsi="Lexend" w:eastAsia="Lexend" w:cs="Lexend"/>
+          <w:highlight w:val="none"/>
+        </w:rPr>
+      </w:r>
+      <w:r/>
+    </w:p>
+    <w:p>
+      <w:pPr>
+        <w:pBdr/>
+        <w:spacing/>
+        <w:ind/>
+        <w:rPr/>
+      </w:pPr>
+      <w:r>
+        <w:rPr>
+          <w:rFonts w:ascii="Lexend" w:hAnsi="Lexend" w:eastAsia="Lexend" w:cs="Lexend"/>
+          <w:highlight w:val="none"/>
+        </w:rPr>
+        <w:t xml:space="preserve">Le capteur dispose d'un mode veille (sleep) permettant d'éteindre le ventilateur et le laser lorsque les mesures ne sont pas nécessaires. Cela permet de préserver la durée de vie du laser, estimée à environ 8 000 heures de fonctionnement.</w:t>
+      </w:r>
+      <w:r>
+        <w:rPr>
+          <w:rFonts w:ascii="Lexend" w:hAnsi="Lexend" w:cs="Lexend"/>
+          <w:highlight w:val="none"/>
+          <w14:ligatures w14:val="none"/>
+        </w:rPr>
+      </w:r>
+      <w:r/>
     </w:p>
     <w:p>
       <w:pPr>
@@ -1189,14 +2606,16 @@
       </w:r>
       <w:r>
         <w:rPr>
-          <w:rFonts w:ascii="Lexend" w:hAnsi="Lexend" w:eastAsia="Lexend" w:cs="Lexend"/>
+          <w:rFonts w:ascii="Lexend" w:hAnsi="Lexend" w:cs="Lexend"/>
           <w:highlight w:val="none"/>
+          <w14:ligatures w14:val="none"/>
         </w:rPr>
       </w:r>
       <w:r>
         <w:rPr>
-          <w:rFonts w:ascii="Lexend" w:hAnsi="Lexend" w:eastAsia="Lexend" w:cs="Lexend"/>
+          <w:rFonts w:ascii="Lexend" w:hAnsi="Lexend" w:cs="Lexend"/>
           <w:highlight w:val="none"/>
+          <w14:ligatures w14:val="none"/>
         </w:rPr>
       </w:r>
     </w:p>
@@ -1220,14 +2639,16 @@
       </w:r>
       <w:r>
         <w:rPr>
-          <w:rFonts w:ascii="Lexend" w:hAnsi="Lexend" w:eastAsia="Lexend" w:cs="Lexend"/>
+          <w:rFonts w:ascii="Lexend" w:hAnsi="Lexend" w:cs="Lexend"/>
           <w:highlight w:val="none"/>
+          <w14:ligatures w14:val="none"/>
         </w:rPr>
       </w:r>
       <w:r>
         <w:rPr>
-          <w:rFonts w:ascii="Lexend" w:hAnsi="Lexend" w:eastAsia="Lexend" w:cs="Lexend"/>
+          <w:rFonts w:ascii="Lexend" w:hAnsi="Lexend" w:cs="Lexend"/>
           <w:highlight w:val="none"/>
+          <w14:ligatures w14:val="none"/>
         </w:rPr>
       </w:r>
     </w:p>
@@ -1251,14 +2672,16 @@
       </w:r>
       <w:r>
         <w:rPr>
-          <w:rFonts w:ascii="Lexend" w:hAnsi="Lexend" w:eastAsia="Lexend" w:cs="Lexend"/>
+          <w:rFonts w:ascii="Lexend" w:hAnsi="Lexend" w:cs="Lexend"/>
           <w:highlight w:val="none"/>
+          <w14:ligatures w14:val="none"/>
         </w:rPr>
       </w:r>
       <w:r>
         <w:rPr>
-          <w:rFonts w:ascii="Lexend" w:hAnsi="Lexend" w:eastAsia="Lexend" w:cs="Lexend"/>
+          <w:rFonts w:ascii="Lexend" w:hAnsi="Lexend" w:cs="Lexend"/>
           <w:highlight w:val="none"/>
+          <w14:ligatures w14:val="none"/>
         </w:rPr>
       </w:r>
     </w:p>
@@ -1282,14 +2705,16 @@
       </w:r>
       <w:r>
         <w:rPr>
-          <w:rFonts w:ascii="Lexend" w:hAnsi="Lexend" w:eastAsia="Lexend" w:cs="Lexend"/>
+          <w:rFonts w:ascii="Lexend" w:hAnsi="Lexend" w:cs="Lexend"/>
           <w:highlight w:val="none"/>
+          <w14:ligatures w14:val="none"/>
         </w:rPr>
       </w:r>
       <w:r>
         <w:rPr>
-          <w:rFonts w:ascii="Lexend" w:hAnsi="Lexend" w:eastAsia="Lexend" w:cs="Lexend"/>
+          <w:rFonts w:ascii="Lexend" w:hAnsi="Lexend" w:cs="Lexend"/>
           <w:highlight w:val="none"/>
+          <w14:ligatures w14:val="none"/>
         </w:rPr>
       </w:r>
     </w:p>
@@ -1313,14 +2738,16 @@
       </w:r>
       <w:r>
         <w:rPr>
-          <w:rFonts w:ascii="Lexend" w:hAnsi="Lexend" w:eastAsia="Lexend" w:cs="Lexend"/>
+          <w:rFonts w:ascii="Lexend" w:hAnsi="Lexend" w:cs="Lexend"/>
           <w:highlight w:val="none"/>
+          <w14:ligatures w14:val="none"/>
         </w:rPr>
       </w:r>
       <w:r>
         <w:rPr>
-          <w:rFonts w:ascii="Lexend" w:hAnsi="Lexend" w:eastAsia="Lexend" w:cs="Lexend"/>
+          <w:rFonts w:ascii="Lexend" w:hAnsi="Lexend" w:cs="Lexend"/>
           <w:highlight w:val="none"/>
+          <w14:ligatures w14:val="none"/>
         </w:rPr>
       </w:r>
     </w:p>
@@ -1344,14 +2771,16 @@
       </w:r>
       <w:r>
         <w:rPr>
-          <w:rFonts w:ascii="Lexend" w:hAnsi="Lexend" w:eastAsia="Lexend" w:cs="Lexend"/>
+          <w:rFonts w:ascii="Lexend" w:hAnsi="Lexend" w:cs="Lexend"/>
           <w:highlight w:val="none"/>
+          <w14:ligatures w14:val="none"/>
         </w:rPr>
       </w:r>
       <w:r>
         <w:rPr>
-          <w:rFonts w:ascii="Lexend" w:hAnsi="Lexend" w:eastAsia="Lexend" w:cs="Lexend"/>
+          <w:rFonts w:ascii="Lexend" w:hAnsi="Lexend" w:cs="Lexend"/>
           <w:highlight w:val="none"/>
+          <w14:ligatures w14:val="none"/>
         </w:rPr>
       </w:r>
     </w:p>
@@ -1375,14 +2804,16 @@
       </w:r>
       <w:r>
         <w:rPr>
-          <w:rFonts w:ascii="Lexend" w:hAnsi="Lexend" w:eastAsia="Lexend" w:cs="Lexend"/>
+          <w:rFonts w:ascii="Lexend" w:hAnsi="Lexend" w:cs="Lexend"/>
           <w:highlight w:val="none"/>
+          <w14:ligatures w14:val="none"/>
         </w:rPr>
       </w:r>
       <w:r>
         <w:rPr>
-          <w:rFonts w:ascii="Lexend" w:hAnsi="Lexend" w:eastAsia="Lexend" w:cs="Lexend"/>
+          <w:rFonts w:ascii="Lexend" w:hAnsi="Lexend" w:cs="Lexend"/>
           <w:highlight w:val="none"/>
+          <w14:ligatures w14:val="none"/>
         </w:rPr>
       </w:r>
     </w:p>
@@ -1406,14 +2837,16 @@
       </w:r>
       <w:r>
         <w:rPr>
-          <w:rFonts w:ascii="Lexend" w:hAnsi="Lexend" w:eastAsia="Lexend" w:cs="Lexend"/>
+          <w:rFonts w:ascii="Lexend" w:hAnsi="Lexend" w:cs="Lexend"/>
           <w:highlight w:val="none"/>
+          <w14:ligatures w14:val="none"/>
         </w:rPr>
       </w:r>
       <w:r>
         <w:rPr>
-          <w:rFonts w:ascii="Lexend" w:hAnsi="Lexend" w:eastAsia="Lexend" w:cs="Lexend"/>
+          <w:rFonts w:ascii="Lexend" w:hAnsi="Lexend" w:cs="Lexend"/>
           <w:highlight w:val="none"/>
+          <w14:ligatures w14:val="none"/>
         </w:rPr>
       </w:r>
     </w:p>
@@ -1437,14 +2870,16 @@
       </w:r>
       <w:r>
         <w:rPr>
-          <w:rFonts w:ascii="Lexend" w:hAnsi="Lexend" w:eastAsia="Lexend" w:cs="Lexend"/>
+          <w:rFonts w:ascii="Lexend" w:hAnsi="Lexend" w:cs="Lexend"/>
           <w:highlight w:val="none"/>
+          <w14:ligatures w14:val="none"/>
         </w:rPr>
       </w:r>
       <w:r>
         <w:rPr>
-          <w:rFonts w:ascii="Lexend" w:hAnsi="Lexend" w:eastAsia="Lexend" w:cs="Lexend"/>
+          <w:rFonts w:ascii="Lexend" w:hAnsi="Lexend" w:cs="Lexend"/>
           <w:highlight w:val="none"/>
+          <w14:ligatures w14:val="none"/>
         </w:rPr>
       </w:r>
     </w:p>
@@ -1468,14 +2903,16 @@
       </w:r>
       <w:r>
         <w:rPr>
-          <w:rFonts w:ascii="Lexend" w:hAnsi="Lexend" w:eastAsia="Lexend" w:cs="Lexend"/>
+          <w:rFonts w:ascii="Lexend" w:hAnsi="Lexend" w:cs="Lexend"/>
           <w:highlight w:val="none"/>
+          <w14:ligatures w14:val="none"/>
         </w:rPr>
       </w:r>
       <w:r>
         <w:rPr>
-          <w:rFonts w:ascii="Lexend" w:hAnsi="Lexend" w:eastAsia="Lexend" w:cs="Lexend"/>
+          <w:rFonts w:ascii="Lexend" w:hAnsi="Lexend" w:cs="Lexend"/>
           <w:highlight w:val="none"/>
+          <w14:ligatures w14:val="none"/>
         </w:rPr>
       </w:r>
     </w:p>
@@ -1499,14 +2936,16 @@
       </w:r>
       <w:r>
         <w:rPr>
-          <w:rFonts w:ascii="Lexend" w:hAnsi="Lexend" w:eastAsia="Lexend" w:cs="Lexend"/>
+          <w:rFonts w:ascii="Lexend" w:hAnsi="Lexend" w:cs="Lexend"/>
           <w:highlight w:val="none"/>
+          <w14:ligatures w14:val="none"/>
         </w:rPr>
       </w:r>
       <w:r>
         <w:rPr>
-          <w:rFonts w:ascii="Lexend" w:hAnsi="Lexend" w:eastAsia="Lexend" w:cs="Lexend"/>
+          <w:rFonts w:ascii="Lexend" w:hAnsi="Lexend" w:cs="Lexend"/>
           <w:highlight w:val="none"/>
+          <w14:ligatures w14:val="none"/>
         </w:rPr>
       </w:r>
     </w:p>
@@ -1530,14 +2969,16 @@
       </w:r>
       <w:r>
         <w:rPr>
-          <w:rFonts w:ascii="Lexend" w:hAnsi="Lexend" w:eastAsia="Lexend" w:cs="Lexend"/>
+          <w:rFonts w:ascii="Lexend" w:hAnsi="Lexend" w:cs="Lexend"/>
           <w:highlight w:val="none"/>
+          <w14:ligatures w14:val="none"/>
         </w:rPr>
       </w:r>
       <w:r>
         <w:rPr>
-          <w:rFonts w:ascii="Lexend" w:hAnsi="Lexend" w:eastAsia="Lexend" w:cs="Lexend"/>
+          <w:rFonts w:ascii="Lexend" w:hAnsi="Lexend" w:cs="Lexend"/>
           <w:highlight w:val="none"/>
+          <w14:ligatures w14:val="none"/>
         </w:rPr>
       </w:r>
     </w:p>
@@ -1561,14 +3002,16 @@
       </w:r>
       <w:r>
         <w:rPr>
-          <w:rFonts w:ascii="Lexend" w:hAnsi="Lexend" w:eastAsia="Lexend" w:cs="Lexend"/>
+          <w:rFonts w:ascii="Lexend" w:hAnsi="Lexend" w:cs="Lexend"/>
           <w:highlight w:val="none"/>
+          <w14:ligatures w14:val="none"/>
         </w:rPr>
       </w:r>
       <w:r>
         <w:rPr>
-          <w:rFonts w:ascii="Lexend" w:hAnsi="Lexend" w:eastAsia="Lexend" w:cs="Lexend"/>
+          <w:rFonts w:ascii="Lexend" w:hAnsi="Lexend" w:cs="Lexend"/>
           <w:highlight w:val="none"/>
+          <w14:ligatures w14:val="none"/>
         </w:rPr>
       </w:r>
     </w:p>
@@ -1592,14 +3035,16 @@
       </w:r>
       <w:r>
         <w:rPr>
-          <w:rFonts w:ascii="Lexend" w:hAnsi="Lexend" w:eastAsia="Lexend" w:cs="Lexend"/>
+          <w:rFonts w:ascii="Lexend" w:hAnsi="Lexend" w:cs="Lexend"/>
           <w:highlight w:val="none"/>
+          <w14:ligatures w14:val="none"/>
         </w:rPr>
       </w:r>
       <w:r>
         <w:rPr>
-          <w:rFonts w:ascii="Lexend" w:hAnsi="Lexend" w:eastAsia="Lexend" w:cs="Lexend"/>
+          <w:rFonts w:ascii="Lexend" w:hAnsi="Lexend" w:cs="Lexend"/>
           <w:highlight w:val="none"/>
+          <w14:ligatures w14:val="none"/>
         </w:rPr>
       </w:r>
     </w:p>
@@ -1623,14 +3068,16 @@
       </w:r>
       <w:r>
         <w:rPr>
-          <w:rFonts w:ascii="Lexend" w:hAnsi="Lexend" w:eastAsia="Lexend" w:cs="Lexend"/>
+          <w:rFonts w:ascii="Lexend" w:hAnsi="Lexend" w:cs="Lexend"/>
           <w:highlight w:val="none"/>
+          <w14:ligatures w14:val="none"/>
         </w:rPr>
       </w:r>
       <w:r>
         <w:rPr>
-          <w:rFonts w:ascii="Lexend" w:hAnsi="Lexend" w:eastAsia="Lexend" w:cs="Lexend"/>
+          <w:rFonts w:ascii="Lexend" w:hAnsi="Lexend" w:cs="Lexend"/>
           <w:highlight w:val="none"/>
+          <w14:ligatures w14:val="none"/>
         </w:rPr>
       </w:r>
     </w:p>
@@ -1654,14 +3101,49 @@
       </w:r>
       <w:r>
         <w:rPr>
+          <w:rFonts w:ascii="Lexend" w:hAnsi="Lexend" w:cs="Lexend"/>
+          <w:highlight w:val="none"/>
+          <w14:ligatures w14:val="none"/>
+        </w:rPr>
+      </w:r>
+      <w:r>
+        <w:rPr>
+          <w:rFonts w:ascii="Lexend" w:hAnsi="Lexend" w:cs="Lexend"/>
+          <w:highlight w:val="none"/>
+          <w14:ligatures w14:val="none"/>
+        </w:rPr>
+      </w:r>
+    </w:p>
+    <w:p>
+      <w:pPr>
+        <w:pStyle w:val="838"/>
+        <w:pBdr/>
+        <w:spacing/>
+        <w:ind/>
+        <w:rPr>
+          <w:rFonts w:ascii="Lexend" w:hAnsi="Lexend" w:cs="Lexend"/>
+          <w:highlight w:val="none"/>
+          <w14:ligatures w14:val="none"/>
+        </w:rPr>
+      </w:pPr>
+      <w:r>
+        <w:rPr>
           <w:rFonts w:ascii="Lexend" w:hAnsi="Lexend" w:eastAsia="Lexend" w:cs="Lexend"/>
           <w:highlight w:val="none"/>
         </w:rPr>
       </w:r>
       <w:r>
         <w:rPr>
-          <w:rFonts w:ascii="Lexend" w:hAnsi="Lexend" w:eastAsia="Lexend" w:cs="Lexend"/>
+          <w:rFonts w:ascii="Lexend" w:hAnsi="Lexend" w:cs="Lexend"/>
           <w:highlight w:val="none"/>
+          <w14:ligatures w14:val="none"/>
+        </w:rPr>
+      </w:r>
+      <w:r>
+        <w:rPr>
+          <w:rFonts w:ascii="Lexend" w:hAnsi="Lexend" w:cs="Lexend"/>
+          <w:highlight w:val="none"/>
+          <w14:ligatures w14:val="none"/>
         </w:rPr>
       </w:r>
     </w:p>
@@ -1700,13 +3182,16 @@
       <w:bookmarkEnd w:id="2"/>
       <w:r>
         <w:rPr>
-          <w:rFonts w:ascii="Lexend" w:hAnsi="Lexend" w:eastAsia="Lexend" w:cs="Lexend"/>
+          <w:rFonts w:ascii="Lexend" w:hAnsi="Lexend" w:cs="Lexend"/>
+          <w:highlight w:val="none"/>
+          <w14:ligatures w14:val="none"/>
         </w:rPr>
       </w:r>
       <w:r>
         <w:rPr>
-          <w:rFonts w:ascii="Lexend" w:hAnsi="Lexend" w:eastAsia="Lexend" w:cs="Lexend"/>
+          <w:rFonts w:ascii="Lexend" w:hAnsi="Lexend" w:cs="Lexend"/>
           <w:highlight w:val="none"/>
+          <w14:ligatures w14:val="none"/>
         </w:rPr>
       </w:r>
     </w:p>
@@ -1729,7 +3214,7 @@
               <wp:inline xmlns:wp="http://schemas.openxmlformats.org/drawingml/2006/wordprocessingDrawing" distT="0" distB="0" distL="0" distR="0">
                 <wp:extent cx="6480175" cy="573156"/>
                 <wp:effectExtent l="0" t="0" r="0" b="0"/>
-                <wp:docPr id="2" name=""/>
+                <wp:docPr id="4" name=""/>
                 <wp:cNvGraphicFramePr>
                   <a:graphicFrameLocks xmlns:a="http://schemas.openxmlformats.org/drawingml/2006/main" noChangeAspect="1"/>
                 </wp:cNvGraphicFramePr>
@@ -1744,7 +3229,7 @@
                         <pic:nvPr/>
                       </pic:nvPicPr>
                       <pic:blipFill rotWithShape="1">
-                        <a:blip r:embed="rId11"/>
+                        <a:blip r:embed="rId13"/>
                         <a:stretch/>
                       </pic:blipFill>
                       <pic:spPr bwMode="auto">
@@ -1783,8 +3268,8 @@
                 <v:path o:extrusionok="f" gradientshapeok="t" o:connecttype="rect"/>
                 <o:lock v:ext="edit" aspectratio="t"/>
               </v:shapetype>
-              <v:shape id="_x0000_i1" o:spid="_x0000_s1" type="#_x0000_t75" style="width:510.25pt;height:45.13pt;mso-wrap-distance-left:0.00pt;mso-wrap-distance-top:0.00pt;mso-wrap-distance-right:0.00pt;mso-wrap-distance-bottom:0.00pt;z-index:1;" stroked="false">
-                <v:imagedata r:id="rId11" o:title=""/>
+              <v:shape id="_x0000_i3" o:spid="_x0000_s3" type="#_x0000_t75" style="width:510.25pt;height:45.13pt;mso-wrap-distance-left:0.00pt;mso-wrap-distance-top:0.00pt;mso-wrap-distance-right:0.00pt;mso-wrap-distance-bottom:0.00pt;z-index:1;" stroked="false">
+                <v:imagedata r:id="rId13" o:title=""/>
                 <o:lock v:ext="edit" rotation="t"/>
               </v:shape>
             </w:pict>
@@ -1793,7 +3278,12 @@
       </w:r>
       <w:r>
         <w:rPr>
-          <w:rFonts w:ascii="Lexend" w:hAnsi="Lexend" w:eastAsia="Lexend" w:cs="Lexend"/>
+          <w:rFonts w:ascii="Lexend" w:hAnsi="Lexend" w:cs="Lexend"/>
+        </w:rPr>
+      </w:r>
+      <w:r>
+        <w:rPr>
+          <w:rFonts w:ascii="Lexend" w:hAnsi="Lexend" w:cs="Lexend"/>
         </w:rPr>
       </w:r>
     </w:p>
@@ -1982,13 +3472,13 @@
       </w:r>
       <w:r>
         <w:rPr>
-          <w:rFonts w:ascii="Lexend" w:hAnsi="Lexend" w:eastAsia="Lexend" w:cs="Lexend"/>
+          <w:rFonts w:ascii="Lexend" w:hAnsi="Lexend" w:cs="Lexend"/>
           <w:highlight w:val="none"/>
         </w:rPr>
       </w:r>
       <w:r>
         <w:rPr>
-          <w:rFonts w:ascii="Lexend" w:hAnsi="Lexend" w:eastAsia="Lexend" w:cs="Lexend"/>
+          <w:rFonts w:ascii="Lexend" w:hAnsi="Lexend" w:cs="Lexend"/>
           <w:highlight w:val="none"/>
         </w:rPr>
       </w:r>
@@ -2012,13 +3502,13 @@
       </w:r>
       <w:r>
         <w:rPr>
-          <w:rFonts w:ascii="Lexend" w:hAnsi="Lexend" w:eastAsia="Lexend" w:cs="Lexend"/>
+          <w:rFonts w:ascii="Lexend" w:hAnsi="Lexend" w:cs="Lexend"/>
           <w:highlight w:val="none"/>
         </w:rPr>
       </w:r>
       <w:r>
         <w:rPr>
-          <w:rFonts w:ascii="Lexend" w:hAnsi="Lexend" w:eastAsia="Lexend" w:cs="Lexend"/>
+          <w:rFonts w:ascii="Lexend" w:hAnsi="Lexend" w:cs="Lexend"/>
           <w:highlight w:val="none"/>
         </w:rPr>
       </w:r>
@@ -2094,14 +3584,14 @@
       </w:r>
       <w:r>
         <w:rPr>
-          <w:rFonts w:ascii="Lexend" w:hAnsi="Lexend" w:eastAsia="Lexend" w:cs="Lexend"/>
+          <w:rFonts w:ascii="Lexend" w:hAnsi="Lexend" w:cs="Lexend"/>
           <w:highlight w:val="none"/>
           <w:vertAlign w:val="baseline"/>
         </w:rPr>
       </w:r>
       <w:r>
         <w:rPr>
-          <w:rFonts w:ascii="Lexend" w:hAnsi="Lexend" w:eastAsia="Lexend" w:cs="Lexend"/>
+          <w:rFonts w:ascii="Lexend" w:hAnsi="Lexend" w:cs="Lexend"/>
           <w:highlight w:val="none"/>
           <w:vertAlign w:val="baseline"/>
         </w:rPr>
@@ -2122,83 +3612,16 @@
         <w:rPr>
           <w:rFonts w:ascii="Lexend" w:hAnsi="Lexend" w:eastAsia="Lexend" w:cs="Lexend"/>
         </w:rPr>
-        <mc:AlternateContent>
-          <mc:Choice Requires="wpg">
-            <w:drawing>
-              <wp:inline xmlns:wp="http://schemas.openxmlformats.org/drawingml/2006/wordprocessingDrawing" distT="0" distB="0" distL="0" distR="0">
-                <wp:extent cx="6480175" cy="2213214"/>
-                <wp:effectExtent l="0" t="0" r="0" b="0"/>
-                <wp:docPr id="3" name=""/>
-                <wp:cNvGraphicFramePr>
-                  <a:graphicFrameLocks xmlns:a="http://schemas.openxmlformats.org/drawingml/2006/main" noChangeAspect="1"/>
-                </wp:cNvGraphicFramePr>
-                <a:graphic xmlns:a="http://schemas.openxmlformats.org/drawingml/2006/main">
-                  <a:graphicData uri="http://schemas.openxmlformats.org/drawingml/2006/picture">
-                    <pic:pic xmlns:pic="http://schemas.openxmlformats.org/drawingml/2006/picture">
-                      <pic:nvPicPr>
-                        <pic:cNvPr id="1373024594" name=""/>
-                        <pic:cNvPicPr>
-                          <a:picLocks noChangeAspect="1"/>
-                        </pic:cNvPicPr>
-                        <pic:nvPr/>
-                      </pic:nvPicPr>
-                      <pic:blipFill rotWithShape="1">
-                        <a:blip r:embed="rId12"/>
-                        <a:stretch/>
-                      </pic:blipFill>
-                      <pic:spPr bwMode="auto">
-                        <a:xfrm>
-                          <a:off x="0" y="0"/>
-                          <a:ext cx="6480174" cy="2213214"/>
-                        </a:xfrm>
-                        <a:prstGeom prst="rect">
-                          <a:avLst/>
-                        </a:prstGeom>
-                      </pic:spPr>
-                    </pic:pic>
-                  </a:graphicData>
-                </a:graphic>
-              </wp:inline>
-            </w:drawing>
-          </mc:Choice>
-          <mc:Fallback>
-            <w:pict>
-              <v:shapetype id="_x0000_t75" coordsize="21600,21600" o:spt="75" o:preferrelative="t" path="m@4@5l@4@11@9@11@9@5xe" filled="f" stroked="f">
-                <v:stroke joinstyle="miter"/>
-                <v:formulas>
-                  <v:f eqn="if lineDrawn pixelLineWidth 0"/>
-                  <v:f eqn="sum @0 1 0"/>
-                  <v:f eqn="sum 0 0 @1"/>
-                  <v:f eqn="prod @2 1 2"/>
-                  <v:f eqn="prod @3 21600 pixelWidth"/>
-                  <v:f eqn="prod @3 21600 pixelHeight"/>
-                  <v:f eqn="sum @0 0 1"/>
-                  <v:f eqn="prod @6 1 2"/>
-                  <v:f eqn="prod @7 21600 pixelWidth"/>
-                  <v:f eqn="sum @8 21600 0"/>
-                  <v:f eqn="prod @7 21600 pixelHeight"/>
-                  <v:f eqn="sum @10 21600 0"/>
-                </v:formulas>
-                <v:path o:extrusionok="f" gradientshapeok="t" o:connecttype="rect"/>
-                <o:lock v:ext="edit" aspectratio="t"/>
-              </v:shapetype>
-              <v:shape id="_x0000_i2" o:spid="_x0000_s2" type="#_x0000_t75" style="width:510.25pt;height:174.27pt;mso-wrap-distance-left:0.00pt;mso-wrap-distance-top:0.00pt;mso-wrap-distance-right:0.00pt;mso-wrap-distance-bottom:0.00pt;z-index:1;" stroked="false">
-                <v:imagedata r:id="rId12" o:title=""/>
-                <o:lock v:ext="edit" rotation="t"/>
-              </v:shape>
-            </w:pict>
-          </mc:Fallback>
-        </mc:AlternateContent>
       </w:r>
       <w:r>
         <w:rPr>
-          <w:rFonts w:ascii="Lexend" w:hAnsi="Lexend" w:eastAsia="Lexend" w:cs="Lexend"/>
+          <w:rFonts w:ascii="Lexend" w:hAnsi="Lexend" w:cs="Lexend"/>
           <w14:ligatures w14:val="none"/>
         </w:rPr>
       </w:r>
       <w:r>
         <w:rPr>
-          <w:rFonts w:ascii="Lexend" w:hAnsi="Lexend" w:eastAsia="Lexend" w:cs="Lexend"/>
+          <w:rFonts w:ascii="Lexend" w:hAnsi="Lexend" w:cs="Lexend"/>
           <w14:ligatures w14:val="none"/>
         </w:rPr>
       </w:r>
@@ -31945,18 +33368,13 @@
     <w:unhideWhenUsed/>
     <w:qFormat/>
     <w:pPr>
-      <w:keepNext w:val="true"/>
-      <w:keepLines w:val="true"/>
       <w:pBdr/>
-      <w:spacing w:after="80" w:before="160"/>
+      <w:spacing/>
       <w:ind/>
-      <w:outlineLvl w:val="2"/>
     </w:pPr>
     <w:rPr>
-      <w:rFonts w:ascii="Arial" w:hAnsi="Arial" w:eastAsia="Arial" w:cs="Arial"/>
-      <w:color w:val="0f4761" w:themeColor="accent1" w:themeShade="BF"/>
-      <w:sz w:val="28"/>
-      <w:szCs w:val="28"/>
+      <w:b/>
+      <w:bCs/>
     </w:rPr>
   </w:style>
   <w:style w:type="paragraph" w:styleId="840">
@@ -32134,7 +33552,6 @@
   </w:style>
   <w:style w:type="character" w:styleId="849">
     <w:name w:val="Heading 3 Char"/>
-    <w:basedOn w:val="846"/>
     <w:link w:val="839"/>
     <w:uiPriority w:val="9"/>
     <w:pPr>
@@ -32143,10 +33560,8 @@
       <w:ind/>
     </w:pPr>
     <w:rPr>
-      <w:rFonts w:ascii="Arial" w:hAnsi="Arial" w:eastAsia="Arial" w:cs="Arial"/>
-      <w:color w:val="0f4761" w:themeColor="accent1" w:themeShade="BF"/>
-      <w:sz w:val="28"/>
-      <w:szCs w:val="28"/>
+      <w:b/>
+      <w:bCs/>
     </w:rPr>
   </w:style>
   <w:style w:type="character" w:styleId="850">
@@ -33148,7 +34563,6 @@
         <w:ind/>
         <w:rPr/>
       </w:pPr>
-      <w:r/>
       <w:r>
         <w:separator/>
       </w:r>
@@ -33163,7 +34577,6 @@
         <w:ind/>
         <w:rPr/>
       </w:pPr>
-      <w:r/>
       <w:r>
         <w:continuationSeparator/>
       </w:r>
@@ -33200,7 +34613,6 @@
         <w:ind/>
         <w:rPr/>
       </w:pPr>
-      <w:r/>
       <w:r>
         <w:separator/>
       </w:r>
@@ -33215,7 +34627,6 @@
         <w:ind/>
         <w:rPr/>
       </w:pPr>
-      <w:r/>
       <w:r>
         <w:continuationSeparator/>
       </w:r>
@@ -33411,7 +34822,7 @@
     <w:lsdException w:name="Bibliography" w:uiPriority="37"/>
     <w:lsdException w:name="TOC Heading" w:uiPriority="39" w:qFormat="1"/>
   </w:latentStyles>
-  <w:style w:type="table" w:styleId="1367" w:default="1">
+  <w:style w:type="table" w:styleId="1403" w:default="1">
     <w:name w:val="Normal Table"/>
     <w:uiPriority w:val="99"/>
     <w:semiHidden/>
@@ -33604,9 +35015,9 @@
       </w:tcPr>
     </w:tblStylePr>
   </w:style>
-  <w:style w:type="table" w:styleId="1368">
+  <w:style w:type="table" w:styleId="1404">
     <w:name w:val="Table Grid"/>
-    <w:basedOn w:val="1367"/>
+    <w:basedOn w:val="1403"/>
     <w:uiPriority w:val="59"/>
     <w:pPr>
       <w:pBdr/>
@@ -33803,9 +35214,9 @@
       </w:tcPr>
     </w:tblStylePr>
   </w:style>
-  <w:style w:type="table" w:styleId="1369">
+  <w:style w:type="table" w:styleId="1405">
     <w:name w:val="Table Grid Light"/>
-    <w:basedOn w:val="1367"/>
+    <w:basedOn w:val="1403"/>
     <w:uiPriority w:val="59"/>
     <w:pPr>
       <w:pBdr/>
@@ -34002,9 +35413,9 @@
       </w:tcPr>
     </w:tblStylePr>
   </w:style>
-  <w:style w:type="table" w:styleId="1370">
+  <w:style w:type="table" w:styleId="1406">
     <w:name w:val="Plain Table 1"/>
-    <w:basedOn w:val="1367"/>
+    <w:basedOn w:val="1403"/>
     <w:uiPriority w:val="59"/>
     <w:pPr>
       <w:pBdr/>
@@ -34227,9 +35638,9 @@
       </w:tcPr>
     </w:tblStylePr>
   </w:style>
-  <w:style w:type="table" w:styleId="1371">
+  <w:style w:type="table" w:styleId="1407">
     <w:name w:val="Plain Table 2"/>
-    <w:basedOn w:val="1367"/>
+    <w:basedOn w:val="1403"/>
     <w:uiPriority w:val="59"/>
     <w:pPr>
       <w:pBdr/>
@@ -34460,9 +35871,9 @@
       </w:tcPr>
     </w:tblStylePr>
   </w:style>
-  <w:style w:type="table" w:styleId="1372">
+  <w:style w:type="table" w:styleId="1408">
     <w:name w:val="Plain Table 3"/>
-    <w:basedOn w:val="1367"/>
+    <w:basedOn w:val="1403"/>
     <w:uiPriority w:val="99"/>
     <w:pPr>
       <w:pBdr/>
@@ -34690,9 +36101,9 @@
       </w:tcPr>
     </w:tblStylePr>
   </w:style>
-  <w:style w:type="table" w:styleId="1373">
+  <w:style w:type="table" w:styleId="1409">
     <w:name w:val="Plain Table 4"/>
-    <w:basedOn w:val="1367"/>
+    <w:basedOn w:val="1403"/>
     <w:uiPriority w:val="99"/>
     <w:pPr>
       <w:pBdr/>
@@ -34906,9 +36317,9 @@
       </w:tcPr>
     </w:tblStylePr>
   </w:style>
-  <w:style w:type="table" w:styleId="1374">
+  <w:style w:type="table" w:styleId="1410">
     <w:name w:val="Plain Table 5"/>
-    <w:basedOn w:val="1367"/>
+    <w:basedOn w:val="1403"/>
     <w:uiPriority w:val="99"/>
     <w:pPr>
       <w:pBdr/>
@@ -35139,9 +36550,9 @@
       </w:tcPr>
     </w:tblStylePr>
   </w:style>
-  <w:style w:type="table" w:styleId="1375">
+  <w:style w:type="table" w:styleId="1411">
     <w:name w:val="Grid Table 1 Light"/>
-    <w:basedOn w:val="1367"/>
+    <w:basedOn w:val="1403"/>
     <w:uiPriority w:val="99"/>
     <w:pPr>
       <w:pBdr/>
@@ -35362,9 +36773,9 @@
       </w:tcPr>
     </w:tblStylePr>
   </w:style>
-  <w:style w:type="table" w:styleId="1376">
+  <w:style w:type="table" w:styleId="1412">
     <w:name w:val="Grid Table 1 Light - Accent 1"/>
-    <w:basedOn w:val="1367"/>
+    <w:basedOn w:val="1403"/>
     <w:uiPriority w:val="99"/>
     <w:pPr>
       <w:pBdr/>
@@ -35585,9 +36996,9 @@
       </w:tcPr>
     </w:tblStylePr>
   </w:style>
-  <w:style w:type="table" w:styleId="1377">
+  <w:style w:type="table" w:styleId="1413">
     <w:name w:val="Grid Table 1 Light - Accent 2"/>
-    <w:basedOn w:val="1367"/>
+    <w:basedOn w:val="1403"/>
     <w:uiPriority w:val="99"/>
     <w:pPr>
       <w:pBdr/>
@@ -35808,9 +37219,9 @@
       </w:tcPr>
     </w:tblStylePr>
   </w:style>
-  <w:style w:type="table" w:styleId="1378">
+  <w:style w:type="table" w:styleId="1414">
     <w:name w:val="Grid Table 1 Light - Accent 3"/>
-    <w:basedOn w:val="1367"/>
+    <w:basedOn w:val="1403"/>
     <w:uiPriority w:val="99"/>
     <w:pPr>
       <w:pBdr/>
@@ -36031,9 +37442,9 @@
       </w:tcPr>
     </w:tblStylePr>
   </w:style>
-  <w:style w:type="table" w:styleId="1379">
+  <w:style w:type="table" w:styleId="1415">
     <w:name w:val="Grid Table 1 Light - Accent 4"/>
-    <w:basedOn w:val="1367"/>
+    <w:basedOn w:val="1403"/>
     <w:uiPriority w:val="99"/>
     <w:pPr>
       <w:pBdr/>
@@ -36254,9 +37665,9 @@
       </w:tcPr>
     </w:tblStylePr>
   </w:style>
-  <w:style w:type="table" w:styleId="1380">
+  <w:style w:type="table" w:styleId="1416">
     <w:name w:val="Grid Table 1 Light - Accent 5"/>
-    <w:basedOn w:val="1367"/>
+    <w:basedOn w:val="1403"/>
     <w:uiPriority w:val="99"/>
     <w:pPr>
       <w:pBdr/>
@@ -36477,9 +37888,9 @@
       </w:tcPr>
     </w:tblStylePr>
   </w:style>
-  <w:style w:type="table" w:styleId="1381">
+  <w:style w:type="table" w:styleId="1417">
     <w:name w:val="Grid Table 1 Light - Accent 6"/>
-    <w:basedOn w:val="1367"/>
+    <w:basedOn w:val="1403"/>
     <w:uiPriority w:val="99"/>
     <w:pPr>
       <w:pBdr/>
@@ -36700,9 +38111,9 @@
       </w:tcPr>
     </w:tblStylePr>
   </w:style>
-  <w:style w:type="table" w:styleId="1382">
+  <w:style w:type="table" w:styleId="1418">
     <w:name w:val="Grid Table 2"/>
-    <w:basedOn w:val="1367"/>
+    <w:basedOn w:val="1403"/>
     <w:uiPriority w:val="99"/>
     <w:pPr>
       <w:pBdr/>
@@ -36932,9 +38343,9 @@
       </w:tcPr>
     </w:tblStylePr>
   </w:style>
-  <w:style w:type="table" w:styleId="1383">
+  <w:style w:type="table" w:styleId="1419">
     <w:name w:val="Grid Table 2 - Accent 1"/>
-    <w:basedOn w:val="1367"/>
+    <w:basedOn w:val="1403"/>
     <w:uiPriority w:val="99"/>
     <w:pPr>
       <w:pBdr/>
@@ -37164,9 +38575,9 @@
       </w:tcPr>
     </w:tblStylePr>
   </w:style>
-  <w:style w:type="table" w:styleId="1384">
+  <w:style w:type="table" w:styleId="1420">
     <w:name w:val="Grid Table 2 - Accent 2"/>
-    <w:basedOn w:val="1367"/>
+    <w:basedOn w:val="1403"/>
     <w:uiPriority w:val="99"/>
     <w:pPr>
       <w:pBdr/>
@@ -37396,9 +38807,9 @@
       </w:tcPr>
     </w:tblStylePr>
   </w:style>
-  <w:style w:type="table" w:styleId="1385">
+  <w:style w:type="table" w:styleId="1421">
     <w:name w:val="Grid Table 2 - Accent 3"/>
-    <w:basedOn w:val="1367"/>
+    <w:basedOn w:val="1403"/>
     <w:uiPriority w:val="99"/>
     <w:pPr>
       <w:pBdr/>
@@ -37628,9 +39039,9 @@
       </w:tcPr>
     </w:tblStylePr>
   </w:style>
-  <w:style w:type="table" w:styleId="1386">
+  <w:style w:type="table" w:styleId="1422">
     <w:name w:val="Grid Table 2 - Accent 4"/>
-    <w:basedOn w:val="1367"/>
+    <w:basedOn w:val="1403"/>
     <w:uiPriority w:val="99"/>
     <w:pPr>
       <w:pBdr/>
@@ -37860,9 +39271,9 @@
       </w:tcPr>
     </w:tblStylePr>
   </w:style>
-  <w:style w:type="table" w:styleId="1387">
+  <w:style w:type="table" w:styleId="1423">
     <w:name w:val="Grid Table 2 - Accent 5"/>
-    <w:basedOn w:val="1367"/>
+    <w:basedOn w:val="1403"/>
     <w:uiPriority w:val="99"/>
     <w:pPr>
       <w:pBdr/>
@@ -38092,9 +39503,9 @@
       </w:tcPr>
     </w:tblStylePr>
   </w:style>
-  <w:style w:type="table" w:styleId="1388">
+  <w:style w:type="table" w:styleId="1424">
     <w:name w:val="Grid Table 2 - Accent 6"/>
-    <w:basedOn w:val="1367"/>
+    <w:basedOn w:val="1403"/>
     <w:uiPriority w:val="99"/>
     <w:pPr>
       <w:pBdr/>
@@ -38324,9 +39735,9 @@
       </w:tcPr>
     </w:tblStylePr>
   </w:style>
-  <w:style w:type="table" w:styleId="1389">
+  <w:style w:type="table" w:styleId="1425">
     <w:name w:val="Grid Table 3"/>
-    <w:basedOn w:val="1367"/>
+    <w:basedOn w:val="1403"/>
     <w:uiPriority w:val="99"/>
     <w:pPr>
       <w:pBdr/>
@@ -38569,9 +39980,9 @@
       </w:tcPr>
     </w:tblStylePr>
   </w:style>
-  <w:style w:type="table" w:styleId="1390">
+  <w:style w:type="table" w:styleId="1426">
     <w:name w:val="Grid Table 3 - Accent 1"/>
-    <w:basedOn w:val="1367"/>
+    <w:basedOn w:val="1403"/>
     <w:uiPriority w:val="99"/>
     <w:pPr>
       <w:pBdr/>
@@ -38814,9 +40225,9 @@
       </w:tcPr>
     </w:tblStylePr>
   </w:style>
-  <w:style w:type="table" w:styleId="1391">
+  <w:style w:type="table" w:styleId="1427">
     <w:name w:val="Grid Table 3 - Accent 2"/>
-    <w:basedOn w:val="1367"/>
+    <w:basedOn w:val="1403"/>
     <w:uiPriority w:val="99"/>
     <w:pPr>
       <w:pBdr/>
@@ -39059,9 +40470,9 @@
       </w:tcPr>
     </w:tblStylePr>
   </w:style>
-  <w:style w:type="table" w:styleId="1392">
+  <w:style w:type="table" w:styleId="1428">
     <w:name w:val="Grid Table 3 - Accent 3"/>
-    <w:basedOn w:val="1367"/>
+    <w:basedOn w:val="1403"/>
     <w:uiPriority w:val="99"/>
     <w:pPr>
       <w:pBdr/>
@@ -39304,9 +40715,9 @@
       </w:tcPr>
     </w:tblStylePr>
   </w:style>
-  <w:style w:type="table" w:styleId="1393">
+  <w:style w:type="table" w:styleId="1429">
     <w:name w:val="Grid Table 3 - Accent 4"/>
-    <w:basedOn w:val="1367"/>
+    <w:basedOn w:val="1403"/>
     <w:uiPriority w:val="99"/>
     <w:pPr>
       <w:pBdr/>
@@ -39549,9 +40960,9 @@
       </w:tcPr>
     </w:tblStylePr>
   </w:style>
-  <w:style w:type="table" w:styleId="1394">
+  <w:style w:type="table" w:styleId="1430">
     <w:name w:val="Grid Table 3 - Accent 5"/>
-    <w:basedOn w:val="1367"/>
+    <w:basedOn w:val="1403"/>
     <w:uiPriority w:val="99"/>
     <w:pPr>
       <w:pBdr/>
@@ -39794,9 +41205,9 @@
       </w:tcPr>
     </w:tblStylePr>
   </w:style>
-  <w:style w:type="table" w:styleId="1395">
+  <w:style w:type="table" w:styleId="1431">
     <w:name w:val="Grid Table 3 - Accent 6"/>
-    <w:basedOn w:val="1367"/>
+    <w:basedOn w:val="1403"/>
     <w:uiPriority w:val="99"/>
     <w:pPr>
       <w:pBdr/>
@@ -40039,9 +41450,9 @@
       </w:tcPr>
     </w:tblStylePr>
   </w:style>
-  <w:style w:type="table" w:styleId="1396">
+  <w:style w:type="table" w:styleId="1432">
     <w:name w:val="Grid Table 4"/>
-    <w:basedOn w:val="1367"/>
+    <w:basedOn w:val="1403"/>
     <w:uiPriority w:val="59"/>
     <w:pPr>
       <w:pBdr/>
@@ -40272,9 +41683,9 @@
       </w:tcPr>
     </w:tblStylePr>
   </w:style>
-  <w:style w:type="table" w:styleId="1397">
+  <w:style w:type="table" w:styleId="1433">
     <w:name w:val="Grid Table 4 - Accent 1"/>
-    <w:basedOn w:val="1367"/>
+    <w:basedOn w:val="1403"/>
     <w:uiPriority w:val="59"/>
     <w:pPr>
       <w:pBdr/>
@@ -40505,9 +41916,9 @@
       </w:tcPr>
     </w:tblStylePr>
   </w:style>
-  <w:style w:type="table" w:styleId="1398">
+  <w:style w:type="table" w:styleId="1434">
     <w:name w:val="Grid Table 4 - Accent 2"/>
-    <w:basedOn w:val="1367"/>
+    <w:basedOn w:val="1403"/>
     <w:uiPriority w:val="59"/>
     <w:pPr>
       <w:pBdr/>
@@ -40738,9 +42149,9 @@
       </w:tcPr>
     </w:tblStylePr>
   </w:style>
-  <w:style w:type="table" w:styleId="1399">
+  <w:style w:type="table" w:styleId="1435">
     <w:name w:val="Grid Table 4 - Accent 3"/>
-    <w:basedOn w:val="1367"/>
+    <w:basedOn w:val="1403"/>
     <w:uiPriority w:val="59"/>
     <w:pPr>
       <w:pBdr/>
@@ -40971,9 +42382,9 @@
       </w:tcPr>
     </w:tblStylePr>
   </w:style>
-  <w:style w:type="table" w:styleId="1400">
+  <w:style w:type="table" w:styleId="1436">
     <w:name w:val="Grid Table 4 - Accent 4"/>
-    <w:basedOn w:val="1367"/>
+    <w:basedOn w:val="1403"/>
     <w:uiPriority w:val="59"/>
     <w:pPr>
       <w:pBdr/>
@@ -41204,9 +42615,9 @@
       </w:tcPr>
     </w:tblStylePr>
   </w:style>
-  <w:style w:type="table" w:styleId="1401">
+  <w:style w:type="table" w:styleId="1437">
     <w:name w:val="Grid Table 4 - Accent 5"/>
-    <w:basedOn w:val="1367"/>
+    <w:basedOn w:val="1403"/>
     <w:uiPriority w:val="59"/>
     <w:pPr>
       <w:pBdr/>
@@ -41437,9 +42848,9 @@
       </w:tcPr>
     </w:tblStylePr>
   </w:style>
-  <w:style w:type="table" w:styleId="1402">
+  <w:style w:type="table" w:styleId="1438">
     <w:name w:val="Grid Table 4 - Accent 6"/>
-    <w:basedOn w:val="1367"/>
+    <w:basedOn w:val="1403"/>
     <w:uiPriority w:val="59"/>
     <w:pPr>
       <w:pBdr/>
@@ -41670,9 +43081,9 @@
       </w:tcPr>
     </w:tblStylePr>
   </w:style>
-  <w:style w:type="table" w:styleId="1403">
+  <w:style w:type="table" w:styleId="1439">
     <w:name w:val="Grid Table 5 Dark"/>
-    <w:basedOn w:val="1367"/>
+    <w:basedOn w:val="1403"/>
     <w:uiPriority w:val="99"/>
     <w:pPr>
       <w:pBdr/>
@@ -41898,9 +43309,9 @@
       </w:tcPr>
     </w:tblStylePr>
   </w:style>
-  <w:style w:type="table" w:styleId="1404">
+  <w:style w:type="table" w:styleId="1440">
     <w:name w:val="Grid Table 5 Dark- Accent 1"/>
-    <w:basedOn w:val="1367"/>
+    <w:basedOn w:val="1403"/>
     <w:uiPriority w:val="99"/>
     <w:pPr>
       <w:pBdr/>
@@ -42126,9 +43537,9 @@
       </w:tcPr>
     </w:tblStylePr>
   </w:style>
-  <w:style w:type="table" w:styleId="1405">
+  <w:style w:type="table" w:styleId="1441">
     <w:name w:val="Grid Table 5 Dark - Accent 2"/>
-    <w:basedOn w:val="1367"/>
+    <w:basedOn w:val="1403"/>
     <w:uiPriority w:val="99"/>
     <w:pPr>
       <w:pBdr/>
@@ -42354,9 +43765,9 @@
       </w:tcPr>
     </w:tblStylePr>
   </w:style>
-  <w:style w:type="table" w:styleId="1406">
+  <w:style w:type="table" w:styleId="1442">
     <w:name w:val="Grid Table 5 Dark - Accent 3"/>
-    <w:basedOn w:val="1367"/>
+    <w:basedOn w:val="1403"/>
     <w:uiPriority w:val="99"/>
     <w:pPr>
       <w:pBdr/>
@@ -42582,9 +43993,9 @@
       </w:tcPr>
     </w:tblStylePr>
   </w:style>
-  <w:style w:type="table" w:styleId="1407">
+  <w:style w:type="table" w:styleId="1443">
     <w:name w:val="Grid Table 5 Dark- Accent 4"/>
-    <w:basedOn w:val="1367"/>
+    <w:basedOn w:val="1403"/>
     <w:uiPriority w:val="99"/>
     <w:pPr>
       <w:pBdr/>
@@ -42810,9 +44221,9 @@
       </w:tcPr>
     </w:tblStylePr>
   </w:style>
-  <w:style w:type="table" w:styleId="1408">
+  <w:style w:type="table" w:styleId="1444">
     <w:name w:val="Grid Table 5 Dark - Accent 5"/>
-    <w:basedOn w:val="1367"/>
+    <w:basedOn w:val="1403"/>
     <w:uiPriority w:val="99"/>
     <w:pPr>
       <w:pBdr/>
@@ -43038,9 +44449,9 @@
       </w:tcPr>
     </w:tblStylePr>
   </w:style>
-  <w:style w:type="table" w:styleId="1409">
+  <w:style w:type="table" w:styleId="1445">
     <w:name w:val="Grid Table 5 Dark - Accent 6"/>
-    <w:basedOn w:val="1367"/>
+    <w:basedOn w:val="1403"/>
     <w:uiPriority w:val="99"/>
     <w:pPr>
       <w:pBdr/>
@@ -43266,9 +44677,9 @@
       </w:tcPr>
     </w:tblStylePr>
   </w:style>
-  <w:style w:type="table" w:styleId="1410">
+  <w:style w:type="table" w:styleId="1446">
     <w:name w:val="Grid Table 6 Colorful"/>
-    <w:basedOn w:val="1367"/>
+    <w:basedOn w:val="1403"/>
     <w:uiPriority w:val="99"/>
     <w:pPr>
       <w:pBdr/>
@@ -43496,9 +44907,9 @@
       </w:tcPr>
     </w:tblStylePr>
   </w:style>
-  <w:style w:type="table" w:styleId="1411">
+  <w:style w:type="table" w:styleId="1447">
     <w:name w:val="Grid Table 6 Colorful - Accent 1"/>
-    <w:basedOn w:val="1367"/>
+    <w:basedOn w:val="1403"/>
     <w:uiPriority w:val="99"/>
     <w:pPr>
       <w:pBdr/>
@@ -43726,9 +45137,9 @@
       </w:tcPr>
     </w:tblStylePr>
   </w:style>
-  <w:style w:type="table" w:styleId="1412">
+  <w:style w:type="table" w:styleId="1448">
     <w:name w:val="Grid Table 6 Colorful - Accent 2"/>
-    <w:basedOn w:val="1367"/>
+    <w:basedOn w:val="1403"/>
     <w:uiPriority w:val="99"/>
     <w:pPr>
       <w:pBdr/>
@@ -43956,9 +45367,9 @@
       </w:tcPr>
     </w:tblStylePr>
   </w:style>
-  <w:style w:type="table" w:styleId="1413">
+  <w:style w:type="table" w:styleId="1449">
     <w:name w:val="Grid Table 6 Colorful - Accent 3"/>
-    <w:basedOn w:val="1367"/>
+    <w:basedOn w:val="1403"/>
     <w:uiPriority w:val="99"/>
     <w:pPr>
       <w:pBdr/>
@@ -44186,9 +45597,9 @@
       </w:tcPr>
     </w:tblStylePr>
   </w:style>
-  <w:style w:type="table" w:styleId="1414">
+  <w:style w:type="table" w:styleId="1450">
     <w:name w:val="Grid Table 6 Colorful - Accent 4"/>
-    <w:basedOn w:val="1367"/>
+    <w:basedOn w:val="1403"/>
     <w:uiPriority w:val="99"/>
     <w:pPr>
       <w:pBdr/>
@@ -44416,9 +45827,9 @@
       </w:tcPr>
     </w:tblStylePr>
   </w:style>
-  <w:style w:type="table" w:styleId="1415">
+  <w:style w:type="table" w:styleId="1451">
     <w:name w:val="Grid Table 6 Colorful - Accent 5"/>
-    <w:basedOn w:val="1367"/>
+    <w:basedOn w:val="1403"/>
     <w:uiPriority w:val="99"/>
     <w:pPr>
       <w:pBdr/>
@@ -44646,9 +46057,9 @@
       </w:tcPr>
     </w:tblStylePr>
   </w:style>
-  <w:style w:type="table" w:styleId="1416">
+  <w:style w:type="table" w:styleId="1452">
     <w:name w:val="Grid Table 6 Colorful - Accent 6"/>
-    <w:basedOn w:val="1367"/>
+    <w:basedOn w:val="1403"/>
     <w:uiPriority w:val="99"/>
     <w:pPr>
       <w:pBdr/>
@@ -44876,9 +46287,9 @@
       </w:tcPr>
     </w:tblStylePr>
   </w:style>
-  <w:style w:type="table" w:styleId="1417">
+  <w:style w:type="table" w:styleId="1453">
     <w:name w:val="Grid Table 7 Colorful"/>
-    <w:basedOn w:val="1367"/>
+    <w:basedOn w:val="1403"/>
     <w:uiPriority w:val="99"/>
     <w:pPr>
       <w:pBdr/>
@@ -45130,9 +46541,9 @@
       </w:tcPr>
     </w:tblStylePr>
   </w:style>
-  <w:style w:type="table" w:styleId="1418">
+  <w:style w:type="table" w:styleId="1454">
     <w:name w:val="Grid Table 7 Colorful - Accent 1"/>
-    <w:basedOn w:val="1367"/>
+    <w:basedOn w:val="1403"/>
     <w:uiPriority w:val="99"/>
     <w:pPr>
       <w:pBdr/>
@@ -45384,9 +46795,9 @@
       </w:tcPr>
     </w:tblStylePr>
   </w:style>
-  <w:style w:type="table" w:styleId="1419">
+  <w:style w:type="table" w:styleId="1455">
     <w:name w:val="Grid Table 7 Colorful - Accent 2"/>
-    <w:basedOn w:val="1367"/>
+    <w:basedOn w:val="1403"/>
     <w:uiPriority w:val="99"/>
     <w:pPr>
       <w:pBdr/>
@@ -45638,9 +47049,9 @@
       </w:tcPr>
     </w:tblStylePr>
   </w:style>
-  <w:style w:type="table" w:styleId="1420">
+  <w:style w:type="table" w:styleId="1456">
     <w:name w:val="Grid Table 7 Colorful - Accent 3"/>
-    <w:basedOn w:val="1367"/>
+    <w:basedOn w:val="1403"/>
     <w:uiPriority w:val="99"/>
     <w:pPr>
       <w:pBdr/>
@@ -45892,9 +47303,9 @@
       </w:tcPr>
     </w:tblStylePr>
   </w:style>
-  <w:style w:type="table" w:styleId="1421">
+  <w:style w:type="table" w:styleId="1457">
     <w:name w:val="Grid Table 7 Colorful - Accent 4"/>
-    <w:basedOn w:val="1367"/>
+    <w:basedOn w:val="1403"/>
     <w:uiPriority w:val="99"/>
     <w:pPr>
       <w:pBdr/>
@@ -46146,9 +47557,9 @@
       </w:tcPr>
     </w:tblStylePr>
   </w:style>
-  <w:style w:type="table" w:styleId="1422">
+  <w:style w:type="table" w:styleId="1458">
     <w:name w:val="Grid Table 7 Colorful - Accent 5"/>
-    <w:basedOn w:val="1367"/>
+    <w:basedOn w:val="1403"/>
     <w:uiPriority w:val="99"/>
     <w:pPr>
       <w:pBdr/>
@@ -46400,9 +47811,9 @@
       </w:tcPr>
     </w:tblStylePr>
   </w:style>
-  <w:style w:type="table" w:styleId="1423">
+  <w:style w:type="table" w:styleId="1459">
     <w:name w:val="Grid Table 7 Colorful - Accent 6"/>
-    <w:basedOn w:val="1367"/>
+    <w:basedOn w:val="1403"/>
     <w:uiPriority w:val="99"/>
     <w:pPr>
       <w:pBdr/>
@@ -46654,9 +48065,9 @@
       </w:tcPr>
     </w:tblStylePr>
   </w:style>
-  <w:style w:type="table" w:styleId="1424">
+  <w:style w:type="table" w:styleId="1460">
     <w:name w:val="List Table 1 Light"/>
-    <w:basedOn w:val="1367"/>
+    <w:basedOn w:val="1403"/>
     <w:uiPriority w:val="99"/>
     <w:pPr>
       <w:pBdr/>
@@ -46870,9 +48281,9 @@
       </w:tcPr>
     </w:tblStylePr>
   </w:style>
-  <w:style w:type="table" w:styleId="1425">
+  <w:style w:type="table" w:styleId="1461">
     <w:name w:val="List Table 1 Light - Accent 1"/>
-    <w:basedOn w:val="1367"/>
+    <w:basedOn w:val="1403"/>
     <w:uiPriority w:val="99"/>
     <w:pPr>
       <w:pBdr/>
@@ -47086,9 +48497,9 @@
       </w:tcPr>
     </w:tblStylePr>
   </w:style>
-  <w:style w:type="table" w:styleId="1426">
+  <w:style w:type="table" w:styleId="1462">
     <w:name w:val="List Table 1 Light - Accent 2"/>
-    <w:basedOn w:val="1367"/>
+    <w:basedOn w:val="1403"/>
     <w:uiPriority w:val="99"/>
     <w:pPr>
       <w:pBdr/>
@@ -47302,9 +48713,9 @@
       </w:tcPr>
     </w:tblStylePr>
   </w:style>
-  <w:style w:type="table" w:styleId="1427">
+  <w:style w:type="table" w:styleId="1463">
     <w:name w:val="List Table 1 Light - Accent 3"/>
-    <w:basedOn w:val="1367"/>
+    <w:basedOn w:val="1403"/>
     <w:uiPriority w:val="99"/>
     <w:pPr>
       <w:pBdr/>
@@ -47518,9 +48929,9 @@
       </w:tcPr>
     </w:tblStylePr>
   </w:style>
-  <w:style w:type="table" w:styleId="1428">
+  <w:style w:type="table" w:styleId="1464">
     <w:name w:val="List Table 1 Light - Accent 4"/>
-    <w:basedOn w:val="1367"/>
+    <w:basedOn w:val="1403"/>
     <w:uiPriority w:val="99"/>
     <w:pPr>
       <w:pBdr/>
@@ -47734,9 +49145,9 @@
       </w:tcPr>
     </w:tblStylePr>
   </w:style>
-  <w:style w:type="table" w:styleId="1429">
+  <w:style w:type="table" w:styleId="1465">
     <w:name w:val="List Table 1 Light - Accent 5"/>
-    <w:basedOn w:val="1367"/>
+    <w:basedOn w:val="1403"/>
     <w:uiPriority w:val="99"/>
     <w:pPr>
       <w:pBdr/>
@@ -47950,9 +49361,9 @@
       </w:tcPr>
     </w:tblStylePr>
   </w:style>
-  <w:style w:type="table" w:styleId="1430">
+  <w:style w:type="table" w:styleId="1466">
     <w:name w:val="List Table 1 Light - Accent 6"/>
-    <w:basedOn w:val="1367"/>
+    <w:basedOn w:val="1403"/>
     <w:uiPriority w:val="99"/>
     <w:pPr>
       <w:pBdr/>
@@ -48166,9 +49577,9 @@
       </w:tcPr>
     </w:tblStylePr>
   </w:style>
-  <w:style w:type="table" w:styleId="1431">
+  <w:style w:type="table" w:styleId="1467">
     <w:name w:val="List Table 2"/>
-    <w:basedOn w:val="1367"/>
+    <w:basedOn w:val="1403"/>
     <w:uiPriority w:val="99"/>
     <w:pPr>
       <w:pBdr/>
@@ -48404,9 +49815,9 @@
       </w:tcPr>
     </w:tblStylePr>
   </w:style>
-  <w:style w:type="table" w:styleId="1432">
+  <w:style w:type="table" w:styleId="1468">
     <w:name w:val="List Table 2 - Accent 1"/>
-    <w:basedOn w:val="1367"/>
+    <w:basedOn w:val="1403"/>
     <w:uiPriority w:val="99"/>
     <w:pPr>
       <w:pBdr/>
@@ -48642,9 +50053,9 @@
       </w:tcPr>
     </w:tblStylePr>
   </w:style>
-  <w:style w:type="table" w:styleId="1433">
+  <w:style w:type="table" w:styleId="1469">
     <w:name w:val="List Table 2 - Accent 2"/>
-    <w:basedOn w:val="1367"/>
+    <w:basedOn w:val="1403"/>
     <w:uiPriority w:val="99"/>
     <w:pPr>
       <w:pBdr/>
@@ -48880,9 +50291,9 @@
       </w:tcPr>
     </w:tblStylePr>
   </w:style>
-  <w:style w:type="table" w:styleId="1434">
+  <w:style w:type="table" w:styleId="1470">
     <w:name w:val="List Table 2 - Accent 3"/>
-    <w:basedOn w:val="1367"/>
+    <w:basedOn w:val="1403"/>
     <w:uiPriority w:val="99"/>
     <w:pPr>
       <w:pBdr/>
@@ -49118,9 +50529,9 @@
       </w:tcPr>
     </w:tblStylePr>
   </w:style>
-  <w:style w:type="table" w:styleId="1435">
+  <w:style w:type="table" w:styleId="1471">
     <w:name w:val="List Table 2 - Accent 4"/>
-    <w:basedOn w:val="1367"/>
+    <w:basedOn w:val="1403"/>
     <w:uiPriority w:val="99"/>
     <w:pPr>
       <w:pBdr/>
@@ -49356,9 +50767,9 @@
       </w:tcPr>
     </w:tblStylePr>
   </w:style>
-  <w:style w:type="table" w:styleId="1436">
+  <w:style w:type="table" w:styleId="1472">
     <w:name w:val="List Table 2 - Accent 5"/>
-    <w:basedOn w:val="1367"/>
+    <w:basedOn w:val="1403"/>
     <w:uiPriority w:val="99"/>
     <w:pPr>
       <w:pBdr/>
@@ -49594,9 +51005,9 @@
       </w:tcPr>
     </w:tblStylePr>
   </w:style>
-  <w:style w:type="table" w:styleId="1437">
+  <w:style w:type="table" w:styleId="1473">
     <w:name w:val="List Table 2 - Accent 6"/>
-    <w:basedOn w:val="1367"/>
+    <w:basedOn w:val="1403"/>
     <w:uiPriority w:val="99"/>
     <w:pPr>
       <w:pBdr/>
@@ -49832,9 +51243,9 @@
       </w:tcPr>
     </w:tblStylePr>
   </w:style>
-  <w:style w:type="table" w:styleId="1438">
+  <w:style w:type="table" w:styleId="1474">
     <w:name w:val="List Table 3"/>
-    <w:basedOn w:val="1367"/>
+    <w:basedOn w:val="1403"/>
     <w:uiPriority w:val="99"/>
     <w:pPr>
       <w:pBdr/>
@@ -50060,9 +51471,9 @@
       </w:tcPr>
     </w:tblStylePr>
   </w:style>
-  <w:style w:type="table" w:styleId="1439">
+  <w:style w:type="table" w:styleId="1475">
     <w:name w:val="List Table 3 - Accent 1"/>
-    <w:basedOn w:val="1367"/>
+    <w:basedOn w:val="1403"/>
     <w:uiPriority w:val="99"/>
     <w:pPr>
       <w:pBdr/>
@@ -50288,9 +51699,9 @@
       </w:tcPr>
     </w:tblStylePr>
   </w:style>
-  <w:style w:type="table" w:styleId="1440">
+  <w:style w:type="table" w:styleId="1476">
     <w:name w:val="List Table 3 - Accent 2"/>
-    <w:basedOn w:val="1367"/>
+    <w:basedOn w:val="1403"/>
     <w:uiPriority w:val="99"/>
     <w:pPr>
       <w:pBdr/>
@@ -50516,9 +51927,9 @@
       </w:tcPr>
     </w:tblStylePr>
   </w:style>
-  <w:style w:type="table" w:styleId="1441">
+  <w:style w:type="table" w:styleId="1477">
     <w:name w:val="List Table 3 - Accent 3"/>
-    <w:basedOn w:val="1367"/>
+    <w:basedOn w:val="1403"/>
     <w:uiPriority w:val="99"/>
     <w:pPr>
       <w:pBdr/>
@@ -50744,9 +52155,9 @@
       </w:tcPr>
     </w:tblStylePr>
   </w:style>
-  <w:style w:type="table" w:styleId="1442">
+  <w:style w:type="table" w:styleId="1478">
     <w:name w:val="List Table 3 - Accent 4"/>
-    <w:basedOn w:val="1367"/>
+    <w:basedOn w:val="1403"/>
     <w:uiPriority w:val="99"/>
     <w:pPr>
       <w:pBdr/>
@@ -50972,9 +52383,9 @@
       </w:tcPr>
     </w:tblStylePr>
   </w:style>
-  <w:style w:type="table" w:styleId="1443">
+  <w:style w:type="table" w:styleId="1479">
     <w:name w:val="List Table 3 - Accent 5"/>
-    <w:basedOn w:val="1367"/>
+    <w:basedOn w:val="1403"/>
     <w:uiPriority w:val="99"/>
     <w:pPr>
       <w:pBdr/>
@@ -51200,9 +52611,9 @@
       </w:tcPr>
     </w:tblStylePr>
   </w:style>
-  <w:style w:type="table" w:styleId="1444">
+  <w:style w:type="table" w:styleId="1480">
     <w:name w:val="List Table 3 - Accent 6"/>
-    <w:basedOn w:val="1367"/>
+    <w:basedOn w:val="1403"/>
     <w:uiPriority w:val="99"/>
     <w:pPr>
       <w:pBdr/>
@@ -51428,9 +52839,9 @@
       </w:tcPr>
     </w:tblStylePr>
   </w:style>
-  <w:style w:type="table" w:styleId="1445">
+  <w:style w:type="table" w:styleId="1481">
     <w:name w:val="List Table 4"/>
-    <w:basedOn w:val="1367"/>
+    <w:basedOn w:val="1403"/>
     <w:uiPriority w:val="99"/>
     <w:pPr>
       <w:pBdr/>
@@ -51653,9 +53064,9 @@
       </w:tcPr>
     </w:tblStylePr>
   </w:style>
-  <w:style w:type="table" w:styleId="1446">
+  <w:style w:type="table" w:styleId="1482">
     <w:name w:val="List Table 4 - Accent 1"/>
-    <w:basedOn w:val="1367"/>
+    <w:basedOn w:val="1403"/>
     <w:uiPriority w:val="99"/>
     <w:pPr>
       <w:pBdr/>
@@ -51878,9 +53289,9 @@
       </w:tcPr>
     </w:tblStylePr>
   </w:style>
-  <w:style w:type="table" w:styleId="1447">
+  <w:style w:type="table" w:styleId="1483">
     <w:name w:val="List Table 4 - Accent 2"/>
-    <w:basedOn w:val="1367"/>
+    <w:basedOn w:val="1403"/>
     <w:uiPriority w:val="99"/>
     <w:pPr>
       <w:pBdr/>
@@ -52103,9 +53514,9 @@
       </w:tcPr>
     </w:tblStylePr>
   </w:style>
-  <w:style w:type="table" w:styleId="1448">
+  <w:style w:type="table" w:styleId="1484">
     <w:name w:val="List Table 4 - Accent 3"/>
-    <w:basedOn w:val="1367"/>
+    <w:basedOn w:val="1403"/>
     <w:uiPriority w:val="99"/>
     <w:pPr>
       <w:pBdr/>
@@ -52328,9 +53739,9 @@
       </w:tcPr>
     </w:tblStylePr>
   </w:style>
-  <w:style w:type="table" w:styleId="1449">
+  <w:style w:type="table" w:styleId="1485">
     <w:name w:val="List Table 4 - Accent 4"/>
-    <w:basedOn w:val="1367"/>
+    <w:basedOn w:val="1403"/>
     <w:uiPriority w:val="99"/>
     <w:pPr>
       <w:pBdr/>
@@ -52553,9 +53964,9 @@
       </w:tcPr>
     </w:tblStylePr>
   </w:style>
-  <w:style w:type="table" w:styleId="1450">
+  <w:style w:type="table" w:styleId="1486">
     <w:name w:val="List Table 4 - Accent 5"/>
-    <w:basedOn w:val="1367"/>
+    <w:basedOn w:val="1403"/>
     <w:uiPriority w:val="99"/>
     <w:pPr>
       <w:pBdr/>
@@ -52778,9 +54189,9 @@
       </w:tcPr>
     </w:tblStylePr>
   </w:style>
-  <w:style w:type="table" w:styleId="1451">
+  <w:style w:type="table" w:styleId="1487">
     <w:name w:val="List Table 4 - Accent 6"/>
-    <w:basedOn w:val="1367"/>
+    <w:basedOn w:val="1403"/>
     <w:uiPriority w:val="99"/>
     <w:pPr>
       <w:pBdr/>
@@ -53003,9 +54414,9 @@
       </w:tcPr>
     </w:tblStylePr>
   </w:style>
-  <w:style w:type="table" w:styleId="1452">
+  <w:style w:type="table" w:styleId="1488">
     <w:name w:val="List Table 5 Dark"/>
-    <w:basedOn w:val="1367"/>
+    <w:basedOn w:val="1403"/>
     <w:uiPriority w:val="99"/>
     <w:pPr>
       <w:pBdr/>
@@ -53245,9 +54656,9 @@
       </w:tcPr>
     </w:tblStylePr>
   </w:style>
-  <w:style w:type="table" w:styleId="1453">
+  <w:style w:type="table" w:styleId="1489">
     <w:name w:val="List Table 5 Dark - Accent 1"/>
-    <w:basedOn w:val="1367"/>
+    <w:basedOn w:val="1403"/>
     <w:uiPriority w:val="99"/>
     <w:pPr>
       <w:pBdr/>
@@ -53487,9 +54898,9 @@
       </w:tcPr>
     </w:tblStylePr>
   </w:style>
-  <w:style w:type="table" w:styleId="1454">
+  <w:style w:type="table" w:styleId="1490">
     <w:name w:val="List Table 5 Dark - Accent 2"/>
-    <w:basedOn w:val="1367"/>
+    <w:basedOn w:val="1403"/>
     <w:uiPriority w:val="99"/>
     <w:pPr>
       <w:pBdr/>
@@ -53729,9 +55140,9 @@
       </w:tcPr>
     </w:tblStylePr>
   </w:style>
-  <w:style w:type="table" w:styleId="1455">
+  <w:style w:type="table" w:styleId="1491">
     <w:name w:val="List Table 5 Dark - Accent 3"/>
-    <w:basedOn w:val="1367"/>
+    <w:basedOn w:val="1403"/>
     <w:uiPriority w:val="99"/>
     <w:pPr>
       <w:pBdr/>
@@ -53971,9 +55382,9 @@
       </w:tcPr>
     </w:tblStylePr>
   </w:style>
-  <w:style w:type="table" w:styleId="1456">
+  <w:style w:type="table" w:styleId="1492">
     <w:name w:val="List Table 5 Dark - Accent 4"/>
-    <w:basedOn w:val="1367"/>
+    <w:basedOn w:val="1403"/>
     <w:uiPriority w:val="99"/>
     <w:pPr>
       <w:pBdr/>
@@ -54213,9 +55624,9 @@
       </w:tcPr>
     </w:tblStylePr>
   </w:style>
-  <w:style w:type="table" w:styleId="1457">
+  <w:style w:type="table" w:styleId="1493">
     <w:name w:val="List Table 5 Dark - Accent 5"/>
-    <w:basedOn w:val="1367"/>
+    <w:basedOn w:val="1403"/>
     <w:uiPriority w:val="99"/>
     <w:pPr>
       <w:pBdr/>
@@ -54455,9 +55866,9 @@
       </w:tcPr>
     </w:tblStylePr>
   </w:style>
-  <w:style w:type="table" w:styleId="1458">
+  <w:style w:type="table" w:styleId="1494">
     <w:name w:val="List Table 5 Dark - Accent 6"/>
-    <w:basedOn w:val="1367"/>
+    <w:basedOn w:val="1403"/>
     <w:uiPriority w:val="99"/>
     <w:pPr>
       <w:pBdr/>
@@ -54697,9 +56108,9 @@
       </w:tcPr>
     </w:tblStylePr>
   </w:style>
-  <w:style w:type="table" w:styleId="1459">
+  <w:style w:type="table" w:styleId="1495">
     <w:name w:val="List Table 6 Colorful"/>
-    <w:basedOn w:val="1367"/>
+    <w:basedOn w:val="1403"/>
     <w:uiPriority w:val="99"/>
     <w:pPr>
       <w:pBdr/>
@@ -54920,9 +56331,9 @@
       </w:tcPr>
     </w:tblStylePr>
   </w:style>
-  <w:style w:type="table" w:styleId="1460">
+  <w:style w:type="table" w:styleId="1496">
     <w:name w:val="List Table 6 Colorful - Accent 1"/>
-    <w:basedOn w:val="1367"/>
+    <w:basedOn w:val="1403"/>
     <w:uiPriority w:val="99"/>
     <w:pPr>
       <w:pBdr/>
@@ -55143,9 +56554,9 @@
       </w:tcPr>
     </w:tblStylePr>
   </w:style>
-  <w:style w:type="table" w:styleId="1461">
+  <w:style w:type="table" w:styleId="1497">
     <w:name w:val="List Table 6 Colorful - Accent 2"/>
-    <w:basedOn w:val="1367"/>
+    <w:basedOn w:val="1403"/>
     <w:uiPriority w:val="99"/>
     <w:pPr>
       <w:pBdr/>
@@ -55366,9 +56777,9 @@
       </w:tcPr>
     </w:tblStylePr>
   </w:style>
-  <w:style w:type="table" w:styleId="1462">
+  <w:style w:type="table" w:styleId="1498">
     <w:name w:val="List Table 6 Colorful - Accent 3"/>
-    <w:basedOn w:val="1367"/>
+    <w:basedOn w:val="1403"/>
     <w:uiPriority w:val="99"/>
     <w:pPr>
       <w:pBdr/>
@@ -55589,9 +57000,9 @@
       </w:tcPr>
     </w:tblStylePr>
   </w:style>
-  <w:style w:type="table" w:styleId="1463">
+  <w:style w:type="table" w:styleId="1499">
     <w:name w:val="List Table 6 Colorful - Accent 4"/>
-    <w:basedOn w:val="1367"/>
+    <w:basedOn w:val="1403"/>
     <w:uiPriority w:val="99"/>
     <w:pPr>
       <w:pBdr/>
@@ -55812,9 +57223,9 @@
       </w:tcPr>
     </w:tblStylePr>
   </w:style>
-  <w:style w:type="table" w:styleId="1464">
+  <w:style w:type="table" w:styleId="1500">
     <w:name w:val="List Table 6 Colorful - Accent 5"/>
-    <w:basedOn w:val="1367"/>
+    <w:basedOn w:val="1403"/>
     <w:uiPriority w:val="99"/>
     <w:pPr>
       <w:pBdr/>
@@ -56035,9 +57446,9 @@
       </w:tcPr>
     </w:tblStylePr>
   </w:style>
-  <w:style w:type="table" w:styleId="1465">
+  <w:style w:type="table" w:styleId="1501">
     <w:name w:val="List Table 6 Colorful - Accent 6"/>
-    <w:basedOn w:val="1367"/>
+    <w:basedOn w:val="1403"/>
     <w:uiPriority w:val="99"/>
     <w:pPr>
       <w:pBdr/>
@@ -56258,9 +57669,9 @@
       </w:tcPr>
     </w:tblStylePr>
   </w:style>
-  <w:style w:type="table" w:styleId="1466">
+  <w:style w:type="table" w:styleId="1502">
     <w:name w:val="List Table 7 Colorful"/>
-    <w:basedOn w:val="1367"/>
+    <w:basedOn w:val="1403"/>
     <w:uiPriority w:val="99"/>
     <w:pPr>
       <w:pBdr/>
@@ -56514,9 +57925,9 @@
       </w:tcPr>
     </w:tblStylePr>
   </w:style>
-  <w:style w:type="table" w:styleId="1467">
+  <w:style w:type="table" w:styleId="1503">
     <w:name w:val="List Table 7 Colorful - Accent 1"/>
-    <w:basedOn w:val="1367"/>
+    <w:basedOn w:val="1403"/>
     <w:uiPriority w:val="99"/>
     <w:pPr>
       <w:pBdr/>
@@ -56770,9 +58181,9 @@
       </w:tcPr>
     </w:tblStylePr>
   </w:style>
-  <w:style w:type="table" w:styleId="1468">
+  <w:style w:type="table" w:styleId="1504">
     <w:name w:val="List Table 7 Colorful - Accent 2"/>
-    <w:basedOn w:val="1367"/>
+    <w:basedOn w:val="1403"/>
     <w:uiPriority w:val="99"/>
     <w:pPr>
       <w:pBdr/>
@@ -57026,9 +58437,9 @@
       </w:tcPr>
     </w:tblStylePr>
   </w:style>
-  <w:style w:type="table" w:styleId="1469">
+  <w:style w:type="table" w:styleId="1505">
     <w:name w:val="List Table 7 Colorful - Accent 3"/>
-    <w:basedOn w:val="1367"/>
+    <w:basedOn w:val="1403"/>
     <w:uiPriority w:val="99"/>
     <w:pPr>
       <w:pBdr/>
@@ -57282,9 +58693,9 @@
       </w:tcPr>
     </w:tblStylePr>
   </w:style>
-  <w:style w:type="table" w:styleId="1470">
+  <w:style w:type="table" w:styleId="1506">
     <w:name w:val="List Table 7 Colorful - Accent 4"/>
-    <w:basedOn w:val="1367"/>
+    <w:basedOn w:val="1403"/>
     <w:uiPriority w:val="99"/>
     <w:pPr>
       <w:pBdr/>
@@ -57538,9 +58949,9 @@
       </w:tcPr>
     </w:tblStylePr>
   </w:style>
-  <w:style w:type="table" w:styleId="1471">
+  <w:style w:type="table" w:styleId="1507">
     <w:name w:val="List Table 7 Colorful - Accent 5"/>
-    <w:basedOn w:val="1367"/>
+    <w:basedOn w:val="1403"/>
     <w:uiPriority w:val="99"/>
     <w:pPr>
       <w:pBdr/>
@@ -57794,9 +59205,9 @@
       </w:tcPr>
     </w:tblStylePr>
   </w:style>
-  <w:style w:type="table" w:styleId="1472">
+  <w:style w:type="table" w:styleId="1508">
     <w:name w:val="List Table 7 Colorful - Accent 6"/>
-    <w:basedOn w:val="1367"/>
+    <w:basedOn w:val="1403"/>
     <w:uiPriority w:val="99"/>
     <w:pPr>
       <w:pBdr/>
@@ -58050,9 +59461,9 @@
       </w:tcPr>
     </w:tblStylePr>
   </w:style>
-  <w:style w:type="table" w:styleId="1473">
+  <w:style w:type="table" w:styleId="1509">
     <w:name w:val="Lined - Accent"/>
-    <w:basedOn w:val="1367"/>
+    <w:basedOn w:val="1403"/>
     <w:uiPriority w:val="99"/>
     <w:pPr>
       <w:pBdr/>
@@ -58287,9 +59698,9 @@
       </w:tcPr>
     </w:tblStylePr>
   </w:style>
-  <w:style w:type="table" w:styleId="1474">
+  <w:style w:type="table" w:styleId="1510">
     <w:name w:val="Lined - Accent 1"/>
-    <w:basedOn w:val="1367"/>
+    <w:basedOn w:val="1403"/>
     <w:uiPriority w:val="99"/>
     <w:pPr>
       <w:pBdr/>
@@ -58524,9 +59935,9 @@
       </w:tcPr>
     </w:tblStylePr>
   </w:style>
-  <w:style w:type="table" w:styleId="1475">
+  <w:style w:type="table" w:styleId="1511">
     <w:name w:val="Lined - Accent 2"/>
-    <w:basedOn w:val="1367"/>
+    <w:basedOn w:val="1403"/>
     <w:uiPriority w:val="99"/>
     <w:pPr>
       <w:pBdr/>
@@ -58761,9 +60172,9 @@
       </w:tcPr>
     </w:tblStylePr>
   </w:style>
-  <w:style w:type="table" w:styleId="1476">
+  <w:style w:type="table" w:styleId="1512">
     <w:name w:val="Lined - Accent 3"/>
-    <w:basedOn w:val="1367"/>
+    <w:basedOn w:val="1403"/>
     <w:uiPriority w:val="99"/>
     <w:pPr>
       <w:pBdr/>
@@ -58998,9 +60409,9 @@
       </w:tcPr>
     </w:tblStylePr>
   </w:style>
-  <w:style w:type="table" w:styleId="1477">
+  <w:style w:type="table" w:styleId="1513">
     <w:name w:val="Lined - Accent 4"/>
-    <w:basedOn w:val="1367"/>
+    <w:basedOn w:val="1403"/>
     <w:uiPriority w:val="99"/>
     <w:pPr>
       <w:pBdr/>
@@ -59235,9 +60646,9 @@
       </w:tcPr>
     </w:tblStylePr>
   </w:style>
-  <w:style w:type="table" w:styleId="1478">
+  <w:style w:type="table" w:styleId="1514">
     <w:name w:val="Lined - Accent 5"/>
-    <w:basedOn w:val="1367"/>
+    <w:basedOn w:val="1403"/>
     <w:uiPriority w:val="99"/>
     <w:pPr>
       <w:pBdr/>
@@ -59472,9 +60883,9 @@
       </w:tcPr>
     </w:tblStylePr>
   </w:style>
-  <w:style w:type="table" w:styleId="1479">
+  <w:style w:type="table" w:styleId="1515">
     <w:name w:val="Lined - Accent 6"/>
-    <w:basedOn w:val="1367"/>
+    <w:basedOn w:val="1403"/>
     <w:uiPriority w:val="99"/>
     <w:pPr>
       <w:pBdr/>
@@ -59709,9 +61120,9 @@
       </w:tcPr>
     </w:tblStylePr>
   </w:style>
-  <w:style w:type="table" w:styleId="1480">
+  <w:style w:type="table" w:styleId="1516">
     <w:name w:val="Bordered &amp; Lined - Accent"/>
-    <w:basedOn w:val="1367"/>
+    <w:basedOn w:val="1403"/>
     <w:uiPriority w:val="99"/>
     <w:pPr>
       <w:pBdr/>
@@ -59953,9 +61364,9 @@
       </w:tcPr>
     </w:tblStylePr>
   </w:style>
-  <w:style w:type="table" w:styleId="1481">
+  <w:style w:type="table" w:styleId="1517">
     <w:name w:val="Bordered &amp; Lined - Accent 1"/>
-    <w:basedOn w:val="1367"/>
+    <w:basedOn w:val="1403"/>
     <w:uiPriority w:val="99"/>
     <w:pPr>
       <w:pBdr/>
@@ -60197,9 +61608,9 @@
       </w:tcPr>
     </w:tblStylePr>
   </w:style>
-  <w:style w:type="table" w:styleId="1482">
+  <w:style w:type="table" w:styleId="1518">
     <w:name w:val="Bordered &amp; Lined - Accent 2"/>
-    <w:basedOn w:val="1367"/>
+    <w:basedOn w:val="1403"/>
     <w:uiPriority w:val="99"/>
     <w:pPr>
       <w:pBdr/>
@@ -60441,9 +61852,9 @@
       </w:tcPr>
     </w:tblStylePr>
   </w:style>
-  <w:style w:type="table" w:styleId="1483">
+  <w:style w:type="table" w:styleId="1519">
     <w:name w:val="Bordered &amp; Lined - Accent 3"/>
-    <w:basedOn w:val="1367"/>
+    <w:basedOn w:val="1403"/>
     <w:uiPriority w:val="99"/>
     <w:pPr>
       <w:pBdr/>
@@ -60685,9 +62096,9 @@
       </w:tcPr>
     </w:tblStylePr>
   </w:style>
-  <w:style w:type="table" w:styleId="1484">
+  <w:style w:type="table" w:styleId="1520">
     <w:name w:val="Bordered &amp; Lined - Accent 4"/>
-    <w:basedOn w:val="1367"/>
+    <w:basedOn w:val="1403"/>
     <w:uiPriority w:val="99"/>
     <w:pPr>
       <w:pBdr/>
@@ -60929,9 +62340,9 @@
       </w:tcPr>
     </w:tblStylePr>
   </w:style>
-  <w:style w:type="table" w:styleId="1485">
+  <w:style w:type="table" w:styleId="1521">
     <w:name w:val="Bordered &amp; Lined - Accent 5"/>
-    <w:basedOn w:val="1367"/>
+    <w:basedOn w:val="1403"/>
     <w:uiPriority w:val="99"/>
     <w:pPr>
       <w:pBdr/>
@@ -61173,9 +62584,9 @@
       </w:tcPr>
     </w:tblStylePr>
   </w:style>
-  <w:style w:type="table" w:styleId="1486">
+  <w:style w:type="table" w:styleId="1522">
     <w:name w:val="Bordered &amp; Lined - Accent 6"/>
-    <w:basedOn w:val="1367"/>
+    <w:basedOn w:val="1403"/>
     <w:uiPriority w:val="99"/>
     <w:pPr>
       <w:pBdr/>
@@ -61417,9 +62828,9 @@
       </w:tcPr>
     </w:tblStylePr>
   </w:style>
-  <w:style w:type="table" w:styleId="1487">
+  <w:style w:type="table" w:styleId="1523">
     <w:name w:val="Bordered"/>
-    <w:basedOn w:val="1367"/>
+    <w:basedOn w:val="1403"/>
     <w:uiPriority w:val="99"/>
     <w:pPr>
       <w:pBdr/>
@@ -61648,9 +63059,9 @@
       </w:tcPr>
     </w:tblStylePr>
   </w:style>
-  <w:style w:type="table" w:styleId="1488">
+  <w:style w:type="table" w:styleId="1524">
     <w:name w:val="Bordered - Accent 1"/>
-    <w:basedOn w:val="1367"/>
+    <w:basedOn w:val="1403"/>
     <w:uiPriority w:val="99"/>
     <w:pPr>
       <w:pBdr/>
@@ -61879,9 +63290,9 @@
       </w:tcPr>
     </w:tblStylePr>
   </w:style>
-  <w:style w:type="table" w:styleId="1489">
+  <w:style w:type="table" w:styleId="1525">
     <w:name w:val="Bordered - Accent 2"/>
-    <w:basedOn w:val="1367"/>
+    <w:basedOn w:val="1403"/>
     <w:uiPriority w:val="99"/>
     <w:pPr>
       <w:pBdr/>
@@ -62110,9 +63521,9 @@
       </w:tcPr>
     </w:tblStylePr>
   </w:style>
-  <w:style w:type="table" w:styleId="1490">
+  <w:style w:type="table" w:styleId="1526">
     <w:name w:val="Bordered - Accent 3"/>
-    <w:basedOn w:val="1367"/>
+    <w:basedOn w:val="1403"/>
     <w:uiPriority w:val="99"/>
     <w:pPr>
       <w:pBdr/>
@@ -62341,9 +63752,9 @@
       </w:tcPr>
     </w:tblStylePr>
   </w:style>
-  <w:style w:type="table" w:styleId="1491">
+  <w:style w:type="table" w:styleId="1527">
     <w:name w:val="Bordered - Accent 4"/>
-    <w:basedOn w:val="1367"/>
+    <w:basedOn w:val="1403"/>
     <w:uiPriority w:val="99"/>
     <w:pPr>
       <w:pBdr/>
@@ -62572,9 +63983,9 @@
       </w:tcPr>
     </w:tblStylePr>
   </w:style>
-  <w:style w:type="table" w:styleId="1492">
+  <w:style w:type="table" w:styleId="1528">
     <w:name w:val="Bordered - Accent 5"/>
-    <w:basedOn w:val="1367"/>
+    <w:basedOn w:val="1403"/>
     <w:uiPriority w:val="99"/>
     <w:pPr>
       <w:pBdr/>
@@ -62803,9 +64214,9 @@
       </w:tcPr>
     </w:tblStylePr>
   </w:style>
-  <w:style w:type="table" w:styleId="1493">
+  <w:style w:type="table" w:styleId="1529">
     <w:name w:val="Bordered - Accent 6"/>
-    <w:basedOn w:val="1367"/>
+    <w:basedOn w:val="1403"/>
     <w:uiPriority w:val="99"/>
     <w:pPr>
       <w:pBdr/>
@@ -63034,7 +64445,7 @@
       </w:tcPr>
     </w:tblStylePr>
   </w:style>
-  <w:style w:type="paragraph" w:styleId="1494" w:default="1">
+  <w:style w:type="paragraph" w:styleId="1530" w:default="1">
     <w:name w:val="Normal"/>
     <w:qFormat/>
     <w:pPr>
@@ -63043,11 +64454,11 @@
       <w:ind/>
     </w:pPr>
   </w:style>
-  <w:style w:type="paragraph" w:styleId="1495">
+  <w:style w:type="paragraph" w:styleId="1531">
     <w:name w:val="Heading 1"/>
-    <w:basedOn w:val="1494"/>
-    <w:next w:val="1494"/>
-    <w:link w:val="1506"/>
+    <w:basedOn w:val="1530"/>
+    <w:next w:val="1530"/>
+    <w:link w:val="1542"/>
     <w:uiPriority w:val="9"/>
     <w:qFormat/>
     <w:pPr>
@@ -63065,11 +64476,11 @@
       <w:szCs w:val="40"/>
     </w:rPr>
   </w:style>
-  <w:style w:type="paragraph" w:styleId="1496">
+  <w:style w:type="paragraph" w:styleId="1532">
     <w:name w:val="Heading 2"/>
-    <w:basedOn w:val="1494"/>
-    <w:next w:val="1494"/>
-    <w:link w:val="1507"/>
+    <w:basedOn w:val="1530"/>
+    <w:next w:val="1530"/>
+    <w:link w:val="1543"/>
     <w:uiPriority w:val="9"/>
     <w:unhideWhenUsed/>
     <w:qFormat/>
@@ -63088,11 +64499,11 @@
       <w:szCs w:val="32"/>
     </w:rPr>
   </w:style>
-  <w:style w:type="paragraph" w:styleId="1497">
+  <w:style w:type="paragraph" w:styleId="1533">
     <w:name w:val="Heading 3"/>
-    <w:basedOn w:val="1494"/>
-    <w:next w:val="1494"/>
-    <w:link w:val="1508"/>
+    <w:basedOn w:val="1530"/>
+    <w:next w:val="1530"/>
+    <w:link w:val="1544"/>
     <w:uiPriority w:val="9"/>
     <w:unhideWhenUsed/>
     <w:qFormat/>
@@ -63111,11 +64522,11 @@
       <w:szCs w:val="28"/>
     </w:rPr>
   </w:style>
-  <w:style w:type="paragraph" w:styleId="1498">
+  <w:style w:type="paragraph" w:styleId="1534">
     <w:name w:val="Heading 4"/>
-    <w:basedOn w:val="1494"/>
-    <w:next w:val="1494"/>
-    <w:link w:val="1509"/>
+    <w:basedOn w:val="1530"/>
+    <w:next w:val="1530"/>
+    <w:link w:val="1545"/>
     <w:uiPriority w:val="9"/>
     <w:unhideWhenUsed/>
     <w:qFormat/>
@@ -63134,11 +64545,11 @@
       <w:color w:val="0f4761" w:themeColor="accent1" w:themeShade="BF"/>
     </w:rPr>
   </w:style>
-  <w:style w:type="paragraph" w:styleId="1499">
+  <w:style w:type="paragraph" w:styleId="1535">
     <w:name w:val="Heading 5"/>
-    <w:basedOn w:val="1494"/>
-    <w:next w:val="1494"/>
-    <w:link w:val="1510"/>
+    <w:basedOn w:val="1530"/>
+    <w:next w:val="1530"/>
+    <w:link w:val="1546"/>
     <w:uiPriority w:val="9"/>
     <w:unhideWhenUsed/>
     <w:qFormat/>
@@ -63155,11 +64566,11 @@
       <w:color w:val="0f4761" w:themeColor="accent1" w:themeShade="BF"/>
     </w:rPr>
   </w:style>
-  <w:style w:type="paragraph" w:styleId="1500">
+  <w:style w:type="paragraph" w:styleId="1536">
     <w:name w:val="Heading 6"/>
-    <w:basedOn w:val="1494"/>
-    <w:next w:val="1494"/>
-    <w:link w:val="1511"/>
+    <w:basedOn w:val="1530"/>
+    <w:next w:val="1530"/>
+    <w:link w:val="1547"/>
     <w:uiPriority w:val="9"/>
     <w:unhideWhenUsed/>
     <w:qFormat/>
@@ -63178,11 +64589,11 @@
       <w:color w:val="595959" w:themeColor="text1" w:themeTint="A6"/>
     </w:rPr>
   </w:style>
-  <w:style w:type="paragraph" w:styleId="1501">
+  <w:style w:type="paragraph" w:styleId="1537">
     <w:name w:val="Heading 7"/>
-    <w:basedOn w:val="1494"/>
-    <w:next w:val="1494"/>
-    <w:link w:val="1512"/>
+    <w:basedOn w:val="1530"/>
+    <w:next w:val="1530"/>
+    <w:link w:val="1548"/>
     <w:uiPriority w:val="9"/>
     <w:unhideWhenUsed/>
     <w:qFormat/>
@@ -63199,11 +64610,11 @@
       <w:color w:val="595959" w:themeColor="text1" w:themeTint="A6"/>
     </w:rPr>
   </w:style>
-  <w:style w:type="paragraph" w:styleId="1502">
+  <w:style w:type="paragraph" w:styleId="1538">
     <w:name w:val="Heading 8"/>
-    <w:basedOn w:val="1494"/>
-    <w:next w:val="1494"/>
-    <w:link w:val="1513"/>
+    <w:basedOn w:val="1530"/>
+    <w:next w:val="1530"/>
+    <w:link w:val="1549"/>
     <w:uiPriority w:val="9"/>
     <w:unhideWhenUsed/>
     <w:qFormat/>
@@ -63222,11 +64633,11 @@
       <w:color w:val="272727" w:themeColor="text1" w:themeTint="D8"/>
     </w:rPr>
   </w:style>
-  <w:style w:type="paragraph" w:styleId="1503">
+  <w:style w:type="paragraph" w:styleId="1539">
     <w:name w:val="Heading 9"/>
-    <w:basedOn w:val="1494"/>
-    <w:next w:val="1494"/>
-    <w:link w:val="1514"/>
+    <w:basedOn w:val="1530"/>
+    <w:next w:val="1530"/>
+    <w:link w:val="1550"/>
     <w:uiPriority w:val="9"/>
     <w:unhideWhenUsed/>
     <w:qFormat/>
@@ -63245,7 +64656,7 @@
       <w:color w:val="272727" w:themeColor="text1" w:themeTint="D8"/>
     </w:rPr>
   </w:style>
-  <w:style w:type="character" w:styleId="1504" w:default="1">
+  <w:style w:type="character" w:styleId="1540" w:default="1">
     <w:name w:val="Default Paragraph Font"/>
     <w:uiPriority w:val="1"/>
     <w:semiHidden/>
@@ -63256,7 +64667,7 @@
       <w:ind/>
     </w:pPr>
   </w:style>
-  <w:style w:type="numbering" w:styleId="1505" w:default="1">
+  <w:style w:type="numbering" w:styleId="1541" w:default="1">
     <w:name w:val="No List"/>
     <w:uiPriority w:val="99"/>
     <w:semiHidden/>
@@ -63267,10 +64678,10 @@
       <w:ind/>
     </w:pPr>
   </w:style>
-  <w:style w:type="character" w:styleId="1506">
+  <w:style w:type="character" w:styleId="1542">
     <w:name w:val="Heading 1 Char"/>
-    <w:basedOn w:val="1504"/>
-    <w:link w:val="1495"/>
+    <w:basedOn w:val="1540"/>
+    <w:link w:val="1531"/>
     <w:uiPriority w:val="9"/>
     <w:pPr>
       <w:pBdr/>
@@ -63284,10 +64695,10 @@
       <w:szCs w:val="40"/>
     </w:rPr>
   </w:style>
-  <w:style w:type="character" w:styleId="1507">
+  <w:style w:type="character" w:styleId="1543">
     <w:name w:val="Heading 2 Char"/>
-    <w:basedOn w:val="1504"/>
-    <w:link w:val="1496"/>
+    <w:basedOn w:val="1540"/>
+    <w:link w:val="1532"/>
     <w:uiPriority w:val="9"/>
     <w:pPr>
       <w:pBdr/>
@@ -63301,10 +64712,10 @@
       <w:szCs w:val="32"/>
     </w:rPr>
   </w:style>
-  <w:style w:type="character" w:styleId="1508">
+  <w:style w:type="character" w:styleId="1544">
     <w:name w:val="Heading 3 Char"/>
-    <w:basedOn w:val="1504"/>
-    <w:link w:val="1497"/>
+    <w:basedOn w:val="1540"/>
+    <w:link w:val="1533"/>
     <w:uiPriority w:val="9"/>
     <w:pPr>
       <w:pBdr/>
@@ -63318,10 +64729,10 @@
       <w:szCs w:val="28"/>
     </w:rPr>
   </w:style>
-  <w:style w:type="character" w:styleId="1509">
+  <w:style w:type="character" w:styleId="1545">
     <w:name w:val="Heading 4 Char"/>
-    <w:basedOn w:val="1504"/>
-    <w:link w:val="1498"/>
+    <w:basedOn w:val="1540"/>
+    <w:link w:val="1534"/>
     <w:uiPriority w:val="9"/>
     <w:pPr>
       <w:pBdr/>
@@ -63335,10 +64746,10 @@
       <w:color w:val="0f4761" w:themeColor="accent1" w:themeShade="BF"/>
     </w:rPr>
   </w:style>
-  <w:style w:type="character" w:styleId="1510">
+  <w:style w:type="character" w:styleId="1546">
     <w:name w:val="Heading 5 Char"/>
-    <w:basedOn w:val="1504"/>
-    <w:link w:val="1499"/>
+    <w:basedOn w:val="1540"/>
+    <w:link w:val="1535"/>
     <w:uiPriority w:val="9"/>
     <w:pPr>
       <w:pBdr/>
@@ -63350,10 +64761,10 @@
       <w:color w:val="0f4761" w:themeColor="accent1" w:themeShade="BF"/>
     </w:rPr>
   </w:style>
-  <w:style w:type="character" w:styleId="1511">
+  <w:style w:type="character" w:styleId="1547">
     <w:name w:val="Heading 6 Char"/>
-    <w:basedOn w:val="1504"/>
-    <w:link w:val="1500"/>
+    <w:basedOn w:val="1540"/>
+    <w:link w:val="1536"/>
     <w:uiPriority w:val="9"/>
     <w:pPr>
       <w:pBdr/>
@@ -63367,10 +64778,10 @@
       <w:color w:val="595959" w:themeColor="text1" w:themeTint="A6"/>
     </w:rPr>
   </w:style>
-  <w:style w:type="character" w:styleId="1512">
+  <w:style w:type="character" w:styleId="1548">
     <w:name w:val="Heading 7 Char"/>
-    <w:basedOn w:val="1504"/>
-    <w:link w:val="1501"/>
+    <w:basedOn w:val="1540"/>
+    <w:link w:val="1537"/>
     <w:uiPriority w:val="9"/>
     <w:pPr>
       <w:pBdr/>
@@ -63382,10 +64793,10 @@
       <w:color w:val="595959" w:themeColor="text1" w:themeTint="A6"/>
     </w:rPr>
   </w:style>
-  <w:style w:type="character" w:styleId="1513">
+  <w:style w:type="character" w:styleId="1549">
     <w:name w:val="Heading 8 Char"/>
-    <w:basedOn w:val="1504"/>
-    <w:link w:val="1502"/>
+    <w:basedOn w:val="1540"/>
+    <w:link w:val="1538"/>
     <w:uiPriority w:val="9"/>
     <w:pPr>
       <w:pBdr/>
@@ -63399,10 +64810,10 @@
       <w:color w:val="272727" w:themeColor="text1" w:themeTint="D8"/>
     </w:rPr>
   </w:style>
-  <w:style w:type="character" w:styleId="1514">
+  <w:style w:type="character" w:styleId="1550">
     <w:name w:val="Heading 9 Char"/>
-    <w:basedOn w:val="1504"/>
-    <w:link w:val="1503"/>
+    <w:basedOn w:val="1540"/>
+    <w:link w:val="1539"/>
     <w:uiPriority w:val="9"/>
     <w:pPr>
       <w:pBdr/>
@@ -63416,11 +64827,11 @@
       <w:color w:val="272727" w:themeColor="text1" w:themeTint="D8"/>
     </w:rPr>
   </w:style>
-  <w:style w:type="paragraph" w:styleId="1515">
+  <w:style w:type="paragraph" w:styleId="1551">
     <w:name w:val="Title"/>
-    <w:basedOn w:val="1494"/>
-    <w:next w:val="1494"/>
-    <w:link w:val="1516"/>
+    <w:basedOn w:val="1530"/>
+    <w:next w:val="1530"/>
+    <w:link w:val="1552"/>
     <w:uiPriority w:val="10"/>
     <w:qFormat/>
     <w:pPr>
@@ -63436,10 +64847,10 @@
       <w:szCs w:val="56"/>
     </w:rPr>
   </w:style>
-  <w:style w:type="character" w:styleId="1516">
+  <w:style w:type="character" w:styleId="1552">
     <w:name w:val="Title Char"/>
-    <w:basedOn w:val="1504"/>
-    <w:link w:val="1515"/>
+    <w:basedOn w:val="1540"/>
+    <w:link w:val="1551"/>
     <w:uiPriority w:val="10"/>
     <w:pPr>
       <w:pBdr/>
@@ -63453,11 +64864,11 @@
       <w:szCs w:val="56"/>
     </w:rPr>
   </w:style>
-  <w:style w:type="paragraph" w:styleId="1517">
+  <w:style w:type="paragraph" w:styleId="1553">
     <w:name w:val="Subtitle"/>
-    <w:basedOn w:val="1494"/>
-    <w:next w:val="1494"/>
-    <w:link w:val="1518"/>
+    <w:basedOn w:val="1530"/>
+    <w:next w:val="1530"/>
+    <w:link w:val="1554"/>
     <w:uiPriority w:val="11"/>
     <w:qFormat/>
     <w:pPr>
@@ -63475,10 +64886,10 @@
       <w:szCs w:val="28"/>
     </w:rPr>
   </w:style>
-  <w:style w:type="character" w:styleId="1518">
+  <w:style w:type="character" w:styleId="1554">
     <w:name w:val="Subtitle Char"/>
-    <w:basedOn w:val="1504"/>
-    <w:link w:val="1517"/>
+    <w:basedOn w:val="1540"/>
+    <w:link w:val="1553"/>
     <w:uiPriority w:val="11"/>
     <w:pPr>
       <w:pBdr/>
@@ -63492,11 +64903,11 @@
       <w:szCs w:val="28"/>
     </w:rPr>
   </w:style>
-  <w:style w:type="paragraph" w:styleId="1519">
+  <w:style w:type="paragraph" w:styleId="1555">
     <w:name w:val="Quote"/>
-    <w:basedOn w:val="1494"/>
-    <w:next w:val="1494"/>
-    <w:link w:val="1520"/>
+    <w:basedOn w:val="1530"/>
+    <w:next w:val="1530"/>
+    <w:link w:val="1556"/>
     <w:uiPriority w:val="29"/>
     <w:qFormat/>
     <w:pPr>
@@ -63511,10 +64922,10 @@
       <w:color w:val="404040" w:themeColor="text1" w:themeTint="BF"/>
     </w:rPr>
   </w:style>
-  <w:style w:type="character" w:styleId="1520">
+  <w:style w:type="character" w:styleId="1556">
     <w:name w:val="Quote Char"/>
-    <w:basedOn w:val="1504"/>
-    <w:link w:val="1519"/>
+    <w:basedOn w:val="1540"/>
+    <w:link w:val="1555"/>
     <w:uiPriority w:val="29"/>
     <w:pPr>
       <w:pBdr/>
@@ -63527,9 +64938,9 @@
       <w:color w:val="404040" w:themeColor="text1" w:themeTint="BF"/>
     </w:rPr>
   </w:style>
-  <w:style w:type="paragraph" w:styleId="1521">
+  <w:style w:type="paragraph" w:styleId="1557">
     <w:name w:val="List Paragraph"/>
-    <w:basedOn w:val="1494"/>
+    <w:basedOn w:val="1530"/>
     <w:uiPriority w:val="34"/>
     <w:qFormat/>
     <w:pPr>
@@ -63539,9 +64950,9 @@
       <w:contextualSpacing w:val="true"/>
     </w:pPr>
   </w:style>
-  <w:style w:type="character" w:styleId="1522">
+  <w:style w:type="character" w:styleId="1558">
     <w:name w:val="Intense Emphasis"/>
-    <w:basedOn w:val="1504"/>
+    <w:basedOn w:val="1540"/>
     <w:uiPriority w:val="21"/>
     <w:qFormat/>
     <w:pPr>
@@ -63555,11 +64966,11 @@
       <w:color w:val="0f4761" w:themeColor="accent1" w:themeShade="BF"/>
     </w:rPr>
   </w:style>
-  <w:style w:type="paragraph" w:styleId="1523">
+  <w:style w:type="paragraph" w:styleId="1559">
     <w:name w:val="Intense Quote"/>
-    <w:basedOn w:val="1494"/>
-    <w:next w:val="1494"/>
-    <w:link w:val="1524"/>
+    <w:basedOn w:val="1530"/>
+    <w:next w:val="1530"/>
+    <w:link w:val="1560"/>
     <w:uiPriority w:val="30"/>
     <w:qFormat/>
     <w:pPr>
@@ -63577,10 +64988,10 @@
       <w:color w:val="0f4761" w:themeColor="accent1" w:themeShade="BF"/>
     </w:rPr>
   </w:style>
-  <w:style w:type="character" w:styleId="1524">
+  <w:style w:type="character" w:styleId="1560">
     <w:name w:val="Intense Quote Char"/>
-    <w:basedOn w:val="1504"/>
-    <w:link w:val="1523"/>
+    <w:basedOn w:val="1540"/>
+    <w:link w:val="1559"/>
     <w:uiPriority w:val="30"/>
     <w:pPr>
       <w:pBdr/>
@@ -63593,9 +65004,9 @@
       <w:color w:val="0f4761" w:themeColor="accent1" w:themeShade="BF"/>
     </w:rPr>
   </w:style>
-  <w:style w:type="character" w:styleId="1525">
+  <w:style w:type="character" w:styleId="1561">
     <w:name w:val="Intense Reference"/>
-    <w:basedOn w:val="1504"/>
+    <w:basedOn w:val="1540"/>
     <w:uiPriority w:val="32"/>
     <w:qFormat/>
     <w:pPr>
@@ -63611,9 +65022,9 @@
       <w:spacing w:val="5"/>
     </w:rPr>
   </w:style>
-  <w:style w:type="paragraph" w:styleId="1526">
+  <w:style w:type="paragraph" w:styleId="1562">
     <w:name w:val="No Spacing"/>
-    <w:basedOn w:val="1494"/>
+    <w:basedOn w:val="1530"/>
     <w:uiPriority w:val="1"/>
     <w:qFormat/>
     <w:pPr>
@@ -63622,9 +65033,9 @@
       <w:ind/>
     </w:pPr>
   </w:style>
-  <w:style w:type="character" w:styleId="1527">
+  <w:style w:type="character" w:styleId="1563">
     <w:name w:val="Subtle Emphasis"/>
-    <w:basedOn w:val="1504"/>
+    <w:basedOn w:val="1540"/>
     <w:uiPriority w:val="19"/>
     <w:qFormat/>
     <w:pPr>
@@ -63638,9 +65049,9 @@
       <w:color w:val="404040" w:themeColor="text1" w:themeTint="BF"/>
     </w:rPr>
   </w:style>
-  <w:style w:type="character" w:styleId="1528">
+  <w:style w:type="character" w:styleId="1564">
     <w:name w:val="Emphasis"/>
-    <w:basedOn w:val="1504"/>
+    <w:basedOn w:val="1540"/>
     <w:uiPriority w:val="20"/>
     <w:qFormat/>
     <w:pPr>
@@ -63653,9 +65064,9 @@
       <w:iCs/>
     </w:rPr>
   </w:style>
-  <w:style w:type="character" w:styleId="1529">
+  <w:style w:type="character" w:styleId="1565">
     <w:name w:val="Strong"/>
-    <w:basedOn w:val="1504"/>
+    <w:basedOn w:val="1540"/>
     <w:uiPriority w:val="22"/>
     <w:qFormat/>
     <w:pPr>
@@ -63668,9 +65079,9 @@
       <w:bCs/>
     </w:rPr>
   </w:style>
-  <w:style w:type="character" w:styleId="1530">
+  <w:style w:type="character" w:styleId="1566">
     <w:name w:val="Subtle Reference"/>
-    <w:basedOn w:val="1504"/>
+    <w:basedOn w:val="1540"/>
     <w:uiPriority w:val="31"/>
     <w:qFormat/>
     <w:pPr>
@@ -63683,9 +65094,9 @@
       <w:color w:val="5a5a5a" w:themeColor="text1" w:themeTint="A5"/>
     </w:rPr>
   </w:style>
-  <w:style w:type="character" w:styleId="1531">
+  <w:style w:type="character" w:styleId="1567">
     <w:name w:val="Book Title"/>
-    <w:basedOn w:val="1504"/>
+    <w:basedOn w:val="1540"/>
     <w:uiPriority w:val="33"/>
     <w:qFormat/>
     <w:pPr>
@@ -63701,10 +65112,10 @@
       <w:spacing w:val="5"/>
     </w:rPr>
   </w:style>
-  <w:style w:type="paragraph" w:styleId="1532">
+  <w:style w:type="paragraph" w:styleId="1568">
     <w:name w:val="Header"/>
-    <w:basedOn w:val="1494"/>
-    <w:link w:val="1533"/>
+    <w:basedOn w:val="1530"/>
+    <w:link w:val="1569"/>
     <w:uiPriority w:val="99"/>
     <w:unhideWhenUsed/>
     <w:pPr>
@@ -63717,10 +65128,10 @@
       <w:ind/>
     </w:pPr>
   </w:style>
-  <w:style w:type="character" w:styleId="1533">
+  <w:style w:type="character" w:styleId="1569">
     <w:name w:val="Header Char"/>
-    <w:basedOn w:val="1504"/>
-    <w:link w:val="1532"/>
+    <w:basedOn w:val="1540"/>
+    <w:link w:val="1568"/>
     <w:uiPriority w:val="99"/>
     <w:pPr>
       <w:pBdr/>
@@ -63728,10 +65139,10 @@
       <w:ind/>
     </w:pPr>
   </w:style>
-  <w:style w:type="paragraph" w:styleId="1534">
+  <w:style w:type="paragraph" w:styleId="1570">
     <w:name w:val="Footer"/>
-    <w:basedOn w:val="1494"/>
-    <w:link w:val="1535"/>
+    <w:basedOn w:val="1530"/>
+    <w:link w:val="1571"/>
     <w:uiPriority w:val="99"/>
     <w:unhideWhenUsed/>
     <w:pPr>
@@ -63744,10 +65155,10 @@
       <w:ind/>
     </w:pPr>
   </w:style>
-  <w:style w:type="character" w:styleId="1535">
+  <w:style w:type="character" w:styleId="1571">
     <w:name w:val="Footer Char"/>
-    <w:basedOn w:val="1504"/>
-    <w:link w:val="1534"/>
+    <w:basedOn w:val="1540"/>
+    <w:link w:val="1570"/>
     <w:uiPriority w:val="99"/>
     <w:pPr>
       <w:pBdr/>
@@ -63755,10 +65166,10 @@
       <w:ind/>
     </w:pPr>
   </w:style>
-  <w:style w:type="paragraph" w:styleId="1536">
+  <w:style w:type="paragraph" w:styleId="1572">
     <w:name w:val="Caption"/>
-    <w:basedOn w:val="1494"/>
-    <w:next w:val="1494"/>
+    <w:basedOn w:val="1530"/>
+    <w:next w:val="1530"/>
     <w:uiPriority w:val="35"/>
     <w:unhideWhenUsed/>
     <w:qFormat/>
@@ -63775,10 +65186,10 @@
       <w:szCs w:val="18"/>
     </w:rPr>
   </w:style>
-  <w:style w:type="paragraph" w:styleId="1537">
+  <w:style w:type="paragraph" w:styleId="1573">
     <w:name w:val="footnote text"/>
-    <w:basedOn w:val="1494"/>
-    <w:link w:val="1538"/>
+    <w:basedOn w:val="1530"/>
+    <w:link w:val="1574"/>
     <w:uiPriority w:val="99"/>
     <w:semiHidden/>
     <w:unhideWhenUsed/>
@@ -63792,10 +65203,10 @@
       <w:szCs w:val="20"/>
     </w:rPr>
   </w:style>
-  <w:style w:type="character" w:styleId="1538">
+  <w:style w:type="character" w:styleId="1574">
     <w:name w:val="Footnote Text Char"/>
-    <w:basedOn w:val="1504"/>
-    <w:link w:val="1537"/>
+    <w:basedOn w:val="1540"/>
+    <w:link w:val="1573"/>
     <w:uiPriority w:val="99"/>
     <w:semiHidden/>
     <w:pPr>
@@ -63808,9 +65219,9 @@
       <w:szCs w:val="20"/>
     </w:rPr>
   </w:style>
-  <w:style w:type="character" w:styleId="1539">
+  <w:style w:type="character" w:styleId="1575">
     <w:name w:val="footnote reference"/>
-    <w:basedOn w:val="1504"/>
+    <w:basedOn w:val="1540"/>
     <w:uiPriority w:val="99"/>
     <w:semiHidden/>
     <w:unhideWhenUsed/>
@@ -63823,10 +65234,10 @@
       <w:vertAlign w:val="superscript"/>
     </w:rPr>
   </w:style>
-  <w:style w:type="paragraph" w:styleId="1540">
+  <w:style w:type="paragraph" w:styleId="1576">
     <w:name w:val="endnote text"/>
-    <w:basedOn w:val="1494"/>
-    <w:link w:val="1541"/>
+    <w:basedOn w:val="1530"/>
+    <w:link w:val="1577"/>
     <w:uiPriority w:val="99"/>
     <w:semiHidden/>
     <w:unhideWhenUsed/>
@@ -63840,10 +65251,10 @@
       <w:szCs w:val="20"/>
     </w:rPr>
   </w:style>
-  <w:style w:type="character" w:styleId="1541">
+  <w:style w:type="character" w:styleId="1577">
     <w:name w:val="Endnote Text Char"/>
-    <w:basedOn w:val="1504"/>
-    <w:link w:val="1540"/>
+    <w:basedOn w:val="1540"/>
+    <w:link w:val="1576"/>
     <w:uiPriority w:val="99"/>
     <w:semiHidden/>
     <w:pPr>
@@ -63856,9 +65267,9 @@
       <w:szCs w:val="20"/>
     </w:rPr>
   </w:style>
-  <w:style w:type="character" w:styleId="1542">
+  <w:style w:type="character" w:styleId="1578">
     <w:name w:val="endnote reference"/>
-    <w:basedOn w:val="1504"/>
+    <w:basedOn w:val="1540"/>
     <w:uiPriority w:val="99"/>
     <w:semiHidden/>
     <w:unhideWhenUsed/>
@@ -63871,9 +65282,9 @@
       <w:vertAlign w:val="superscript"/>
     </w:rPr>
   </w:style>
-  <w:style w:type="character" w:styleId="1543">
+  <w:style w:type="character" w:styleId="1579">
     <w:name w:val="Hyperlink"/>
-    <w:basedOn w:val="1504"/>
+    <w:basedOn w:val="1540"/>
     <w:uiPriority w:val="99"/>
     <w:unhideWhenUsed/>
     <w:pPr>
@@ -63886,9 +65297,9 @@
       <w:u w:val="single"/>
     </w:rPr>
   </w:style>
-  <w:style w:type="character" w:styleId="1544">
+  <w:style w:type="character" w:styleId="1580">
     <w:name w:val="FollowedHyperlink"/>
-    <w:basedOn w:val="1504"/>
+    <w:basedOn w:val="1540"/>
     <w:uiPriority w:val="99"/>
     <w:semiHidden/>
     <w:unhideWhenUsed/>
@@ -63902,10 +65313,10 @@
       <w:u w:val="single"/>
     </w:rPr>
   </w:style>
-  <w:style w:type="paragraph" w:styleId="1545">
+  <w:style w:type="paragraph" w:styleId="1581">
     <w:name w:val="toc 1"/>
-    <w:basedOn w:val="1494"/>
-    <w:next w:val="1494"/>
+    <w:basedOn w:val="1530"/>
+    <w:next w:val="1530"/>
     <w:uiPriority w:val="39"/>
     <w:unhideWhenUsed/>
     <w:pPr>
@@ -63914,10 +65325,10 @@
       <w:ind/>
     </w:pPr>
   </w:style>
-  <w:style w:type="paragraph" w:styleId="1546">
+  <w:style w:type="paragraph" w:styleId="1582">
     <w:name w:val="toc 2"/>
-    <w:basedOn w:val="1494"/>
-    <w:next w:val="1494"/>
+    <w:basedOn w:val="1530"/>
+    <w:next w:val="1530"/>
     <w:uiPriority w:val="39"/>
     <w:unhideWhenUsed/>
     <w:pPr>
@@ -63926,10 +65337,10 @@
       <w:ind w:left="220"/>
     </w:pPr>
   </w:style>
-  <w:style w:type="paragraph" w:styleId="1547">
+  <w:style w:type="paragraph" w:styleId="1583">
     <w:name w:val="toc 3"/>
-    <w:basedOn w:val="1494"/>
-    <w:next w:val="1494"/>
+    <w:basedOn w:val="1530"/>
+    <w:next w:val="1530"/>
     <w:uiPriority w:val="39"/>
     <w:unhideWhenUsed/>
     <w:pPr>
@@ -63938,10 +65349,10 @@
       <w:ind w:left="440"/>
     </w:pPr>
   </w:style>
-  <w:style w:type="paragraph" w:styleId="1548">
+  <w:style w:type="paragraph" w:styleId="1584">
     <w:name w:val="toc 4"/>
-    <w:basedOn w:val="1494"/>
-    <w:next w:val="1494"/>
+    <w:basedOn w:val="1530"/>
+    <w:next w:val="1530"/>
     <w:uiPriority w:val="39"/>
     <w:unhideWhenUsed/>
     <w:pPr>
@@ -63950,10 +65361,10 @@
       <w:ind w:left="660"/>
     </w:pPr>
   </w:style>
-  <w:style w:type="paragraph" w:styleId="1549">
+  <w:style w:type="paragraph" w:styleId="1585">
     <w:name w:val="toc 5"/>
-    <w:basedOn w:val="1494"/>
-    <w:next w:val="1494"/>
+    <w:basedOn w:val="1530"/>
+    <w:next w:val="1530"/>
     <w:uiPriority w:val="39"/>
     <w:unhideWhenUsed/>
     <w:pPr>
@@ -63962,10 +65373,10 @@
       <w:ind w:left="880"/>
     </w:pPr>
   </w:style>
-  <w:style w:type="paragraph" w:styleId="1550">
+  <w:style w:type="paragraph" w:styleId="1586">
     <w:name w:val="toc 6"/>
-    <w:basedOn w:val="1494"/>
-    <w:next w:val="1494"/>
+    <w:basedOn w:val="1530"/>
+    <w:next w:val="1530"/>
     <w:uiPriority w:val="39"/>
     <w:unhideWhenUsed/>
     <w:pPr>
@@ -63974,10 +65385,10 @@
       <w:ind w:left="1100"/>
     </w:pPr>
   </w:style>
-  <w:style w:type="paragraph" w:styleId="1551">
+  <w:style w:type="paragraph" w:styleId="1587">
     <w:name w:val="toc 7"/>
-    <w:basedOn w:val="1494"/>
-    <w:next w:val="1494"/>
+    <w:basedOn w:val="1530"/>
+    <w:next w:val="1530"/>
     <w:uiPriority w:val="39"/>
     <w:unhideWhenUsed/>
     <w:pPr>
@@ -63986,10 +65397,10 @@
       <w:ind w:left="1320"/>
     </w:pPr>
   </w:style>
-  <w:style w:type="paragraph" w:styleId="1552">
+  <w:style w:type="paragraph" w:styleId="1588">
     <w:name w:val="toc 8"/>
-    <w:basedOn w:val="1494"/>
-    <w:next w:val="1494"/>
+    <w:basedOn w:val="1530"/>
+    <w:next w:val="1530"/>
     <w:uiPriority w:val="39"/>
     <w:unhideWhenUsed/>
     <w:pPr>
@@ -63998,10 +65409,10 @@
       <w:ind w:left="1540"/>
     </w:pPr>
   </w:style>
-  <w:style w:type="paragraph" w:styleId="1553">
+  <w:style w:type="paragraph" w:styleId="1589">
     <w:name w:val="toc 9"/>
-    <w:basedOn w:val="1494"/>
-    <w:next w:val="1494"/>
+    <w:basedOn w:val="1530"/>
+    <w:next w:val="1530"/>
     <w:uiPriority w:val="39"/>
     <w:unhideWhenUsed/>
     <w:pPr>
@@ -64010,9 +65421,9 @@
       <w:ind w:left="1760"/>
     </w:pPr>
   </w:style>
-  <w:style w:type="character" w:styleId="1554">
+  <w:style w:type="character" w:styleId="1590">
     <w:name w:val="Placeholder Text"/>
-    <w:basedOn w:val="1504"/>
+    <w:basedOn w:val="1540"/>
     <w:uiPriority w:val="99"/>
     <w:semiHidden/>
     <w:pPr>
@@ -64024,7 +65435,7 @@
       <w:color w:val="666666"/>
     </w:rPr>
   </w:style>
-  <w:style w:type="paragraph" w:styleId="1555">
+  <w:style w:type="paragraph" w:styleId="1591">
     <w:name w:val="TOC Heading"/>
     <w:uiPriority w:val="39"/>
     <w:unhideWhenUsed/>
@@ -64034,10 +65445,10 @@
       <w:ind/>
     </w:pPr>
   </w:style>
-  <w:style w:type="paragraph" w:styleId="1556">
+  <w:style w:type="paragraph" w:styleId="1592">
     <w:name w:val="table of figures"/>
-    <w:basedOn w:val="1494"/>
-    <w:next w:val="1494"/>
+    <w:basedOn w:val="1530"/>
+    <w:next w:val="1530"/>
     <w:uiPriority w:val="99"/>
     <w:unhideWhenUsed/>
     <w:pPr>

</xml_diff>

<commit_message>
Ajout de la partie IHM ainsi que la documenattion
</commit_message>
<xml_diff>
--- a/Documentation Capteur Particules/Documentation_capteur_particules.docx
+++ b/Documentation Capteur Particules/Documentation_capteur_particules.docx
@@ -777,11 +777,7 @@
           <w14:ligatures w14:val="none"/>
         </w:rPr>
       </w:pPr>
-      <w:r>
-        <w:rPr>
-          <w:rFonts w:ascii="Lexend" w:hAnsi="Lexend" w:eastAsia="Lexend" w:cs="Lexend"/>
-        </w:rPr>
-      </w:r>
+      <w:r/>
       <w:bookmarkStart w:id="1" w:name="_Toc1"/>
       <w:r>
         <w:rPr>
@@ -789,14 +785,9 @@
         </w:rPr>
         <w:t xml:space="preserve">Sommaire</w:t>
       </w:r>
+      <w:r/>
       <w:bookmarkEnd w:id="1"/>
-      <w:r>
-        <w:rPr>
-          <w:rFonts w:ascii="Lexend" w:hAnsi="Lexend" w:cs="Lexend"/>
-          <w:highlight w:val="none"/>
-          <w14:ligatures w14:val="none"/>
-        </w:rPr>
-      </w:r>
+      <w:r/>
       <w:r>
         <w:rPr>
           <w:rFonts w:ascii="Lexend" w:hAnsi="Lexend" w:cs="Lexend"/>
@@ -832,6 +823,7 @@
             <w:rPr>
               <w:rFonts w:ascii="Lexend" w:hAnsi="Lexend" w:cs="Lexend"/>
               <w:highlight w:val="none"/>
+              <w14:ligatures w14:val="none"/>
             </w:rPr>
           </w:pPr>
           <w:r>
@@ -855,7 +847,7 @@
           </w:r>
           <w:r>
             <w:rPr>
-              <w:rFonts w:ascii="Lexend" w:hAnsi="Lexend" w:eastAsia="Lexend" w:cs="Lexend"/>
+              <w:rFonts w:ascii="Lexend" w:hAnsi="Lexend" w:cs="Lexend"/>
               <w:highlight w:val="none"/>
             </w:rPr>
           </w:r>
@@ -863,7 +855,6 @@
             <w:r>
               <w:rPr>
                 <w:rStyle w:val="882"/>
-                <w:rFonts w:ascii="Lexend" w:hAnsi="Lexend" w:eastAsia="Lexend" w:cs="Lexend"/>
               </w:rPr>
             </w:r>
             <w:r>
@@ -876,20 +867,15 @@
             <w:r>
               <w:rPr>
                 <w:rStyle w:val="882"/>
-                <w:rFonts w:ascii="Lexend" w:hAnsi="Lexend" w:eastAsia="Lexend" w:cs="Lexend"/>
+                <w:rFonts w:ascii="Lexend" w:hAnsi="Lexend" w:cs="Lexend"/>
                 <w:highlight w:val="none"/>
+                <w14:ligatures w14:val="none"/>
               </w:rPr>
             </w:r>
             <w:r>
-              <w:rPr>
-                <w:rFonts w:ascii="Lexend" w:hAnsi="Lexend" w:eastAsia="Lexend" w:cs="Lexend"/>
-              </w:rPr>
               <w:tab/>
             </w:r>
             <w:r>
-              <w:rPr>
-                <w:rFonts w:ascii="Lexend" w:hAnsi="Lexend" w:eastAsia="Lexend" w:cs="Lexend"/>
-              </w:rPr>
               <w:fldChar w:fldCharType="begin"/>
               <w:instrText xml:space="preserve">PAGEREF _Toc1 \h</w:instrText>
               <w:fldChar w:fldCharType="separate"/>
@@ -901,12 +887,7 @@
             <w:rPr>
               <w:rFonts w:ascii="Lexend" w:hAnsi="Lexend" w:cs="Lexend"/>
               <w:highlight w:val="none"/>
-            </w:rPr>
-          </w:r>
-          <w:r>
-            <w:rPr>
-              <w:rFonts w:ascii="Lexend" w:hAnsi="Lexend" w:cs="Lexend"/>
-              <w:highlight w:val="none"/>
+              <w14:ligatures w14:val="none"/>
             </w:rPr>
           </w:r>
         </w:p>
@@ -921,18 +902,14 @@
             <w:ind/>
             <w:rPr>
               <w:rFonts w:ascii="Lexend" w:hAnsi="Lexend" w:cs="Lexend"/>
+              <w:highlight w:val="none"/>
+              <w14:ligatures w14:val="none"/>
             </w:rPr>
           </w:pPr>
-          <w:r>
-            <w:rPr>
-              <w:rFonts w:ascii="Lexend" w:hAnsi="Lexend" w:eastAsia="Lexend" w:cs="Lexend"/>
-            </w:rPr>
-          </w:r>
           <w:hyperlink w:tooltip="#_Toc2" w:anchor="_Toc2" w:history="1">
             <w:r>
               <w:rPr>
                 <w:rStyle w:val="882"/>
-                <w:rFonts w:ascii="Lexend" w:hAnsi="Lexend" w:eastAsia="Lexend" w:cs="Lexend"/>
               </w:rPr>
             </w:r>
             <w:r>
@@ -941,7 +918,341 @@
                 <w:rFonts w:ascii="Lexend" w:hAnsi="Lexend" w:eastAsia="Lexend" w:cs="Lexend"/>
                 <w:highlight w:val="none"/>
               </w:rPr>
-              <w:t xml:space="preserve">1 – </w:t>
+              <w:t xml:space="preserve">1 – Présentation du capteur</w:t>
+            </w:r>
+            <w:r>
+              <w:rPr>
+                <w:rStyle w:val="882"/>
+                <w:rFonts w:ascii="Lexend" w:hAnsi="Lexend" w:cs="Lexend"/>
+                <w:highlight w:val="none"/>
+                <w14:ligatures w14:val="none"/>
+              </w:rPr>
+            </w:r>
+            <w:r>
+              <w:tab/>
+            </w:r>
+            <w:r>
+              <w:fldChar w:fldCharType="begin"/>
+              <w:instrText xml:space="preserve">PAGEREF _Toc2 \h</w:instrText>
+              <w:fldChar w:fldCharType="separate"/>
+              <w:t xml:space="preserve">3</w:t>
+              <w:fldChar w:fldCharType="end"/>
+            </w:r>
+          </w:hyperlink>
+          <w:r>
+            <w:rPr>
+              <w:rFonts w:ascii="Lexend" w:hAnsi="Lexend" w:cs="Lexend"/>
+              <w:highlight w:val="none"/>
+              <w14:ligatures w14:val="none"/>
+            </w:rPr>
+          </w:r>
+        </w:p>
+        <w:p>
+          <w:pPr>
+            <w:pStyle w:val="885"/>
+            <w:pBdr/>
+            <w:tabs>
+              <w:tab w:val="right" w:leader="dot" w:pos="10205"/>
+            </w:tabs>
+            <w:spacing/>
+            <w:ind/>
+            <w:rPr>
+              <w:highlight w:val="none"/>
+              <w14:ligatures w14:val="none"/>
+            </w:rPr>
+          </w:pPr>
+          <w:hyperlink w:tooltip="#_Toc3" w:anchor="_Toc3" w:history="1">
+            <w:r>
+              <w:rPr>
+                <w:rStyle w:val="882"/>
+              </w:rPr>
+            </w:r>
+            <w:r>
+              <w:rPr>
+                <w:rStyle w:val="882"/>
+                <w:highlight w:val="none"/>
+              </w:rPr>
+              <w:t xml:space="preserve">2 – Fonctionnement du capteur</w:t>
+            </w:r>
+            <w:r>
+              <w:rPr>
+                <w:rStyle w:val="882"/>
+                <w:highlight w:val="none"/>
+                <w14:ligatures w14:val="none"/>
+              </w:rPr>
+            </w:r>
+            <w:r>
+              <w:tab/>
+            </w:r>
+            <w:r>
+              <w:fldChar w:fldCharType="begin"/>
+              <w:instrText xml:space="preserve">PAGEREF _Toc3 \h</w:instrText>
+              <w:fldChar w:fldCharType="separate"/>
+              <w:t xml:space="preserve">3</w:t>
+              <w:fldChar w:fldCharType="end"/>
+            </w:r>
+          </w:hyperlink>
+          <w:r>
+            <w:rPr>
+              <w:highlight w:val="none"/>
+              <w14:ligatures w14:val="none"/>
+            </w:rPr>
+          </w:r>
+        </w:p>
+        <w:p>
+          <w:pPr>
+            <w:pStyle w:val="886"/>
+            <w:pBdr/>
+            <w:tabs>
+              <w:tab w:val="right" w:leader="dot" w:pos="10205"/>
+            </w:tabs>
+            <w:spacing/>
+            <w:ind/>
+            <w:rPr>
+              <w14:ligatures w14:val="none"/>
+            </w:rPr>
+          </w:pPr>
+          <w:hyperlink w:tooltip="#_Toc4" w:anchor="_Toc4" w:history="1">
+            <w:r>
+              <w:rPr>
+                <w:rStyle w:val="882"/>
+              </w:rPr>
+            </w:r>
+            <w:r>
+              <w:rPr>
+                <w:rStyle w:val="882"/>
+                <w:highlight w:val="none"/>
+              </w:rPr>
+              <w:t xml:space="preserve">2.1 – Principe de mesure</w:t>
+            </w:r>
+            <w:r>
+              <w:rPr>
+                <w:rStyle w:val="882"/>
+                <w14:ligatures w14:val="none"/>
+              </w:rPr>
+            </w:r>
+            <w:r>
+              <w:tab/>
+            </w:r>
+            <w:r>
+              <w:fldChar w:fldCharType="begin"/>
+              <w:instrText xml:space="preserve">PAGEREF _Toc4 \h</w:instrText>
+              <w:fldChar w:fldCharType="separate"/>
+              <w:t xml:space="preserve">3</w:t>
+              <w:fldChar w:fldCharType="end"/>
+            </w:r>
+          </w:hyperlink>
+          <w:r>
+            <w:rPr>
+              <w14:ligatures w14:val="none"/>
+            </w:rPr>
+          </w:r>
+        </w:p>
+        <w:p>
+          <w:pPr>
+            <w:pStyle w:val="886"/>
+            <w:pBdr/>
+            <w:tabs>
+              <w:tab w:val="right" w:leader="dot" w:pos="10205"/>
+            </w:tabs>
+            <w:spacing/>
+            <w:ind/>
+            <w:rPr/>
+          </w:pPr>
+          <w:hyperlink w:tooltip="#_Toc5" w:anchor="_Toc5" w:history="1">
+            <w:r>
+              <w:rPr>
+                <w:rStyle w:val="882"/>
+              </w:rPr>
+            </w:r>
+            <w:r>
+              <w:rPr>
+                <w:rStyle w:val="882"/>
+                <w:highlight w:val="none"/>
+              </w:rPr>
+              <w:t xml:space="preserve">2.2 – Branchement</w:t>
+            </w:r>
+            <w:r>
+              <w:rPr>
+                <w:rStyle w:val="882"/>
+              </w:rPr>
+            </w:r>
+            <w:r>
+              <w:tab/>
+            </w:r>
+            <w:r>
+              <w:fldChar w:fldCharType="begin"/>
+              <w:instrText xml:space="preserve">PAGEREF _Toc5 \h</w:instrText>
+              <w:fldChar w:fldCharType="separate"/>
+              <w:t xml:space="preserve">3</w:t>
+              <w:fldChar w:fldCharType="end"/>
+            </w:r>
+          </w:hyperlink>
+          <w:r/>
+        </w:p>
+        <w:p>
+          <w:pPr>
+            <w:pStyle w:val="886"/>
+            <w:pBdr/>
+            <w:tabs>
+              <w:tab w:val="right" w:leader="dot" w:pos="10205"/>
+            </w:tabs>
+            <w:spacing/>
+            <w:ind/>
+            <w:rPr>
+              <w:highlight w:val="none"/>
+            </w:rPr>
+          </w:pPr>
+          <w:hyperlink w:tooltip="#_Toc7" w:anchor="_Toc7" w:history="1">
+            <w:r>
+              <w:rPr>
+                <w:rStyle w:val="882"/>
+              </w:rPr>
+            </w:r>
+            <w:r>
+              <w:rPr>
+                <w:rStyle w:val="882"/>
+                <w:rFonts w:ascii="Lexend" w:hAnsi="Lexend" w:eastAsia="Lexend" w:cs="Lexend"/>
+                <w:highlight w:val="none"/>
+              </w:rPr>
+              <w:t xml:space="preserve">2.3 – Modes de fonctionnement</w:t>
+            </w:r>
+            <w:r>
+              <w:rPr>
+                <w:rStyle w:val="882"/>
+              </w:rPr>
+            </w:r>
+            <w:r>
+              <w:tab/>
+            </w:r>
+            <w:r>
+              <w:fldChar w:fldCharType="begin"/>
+              <w:instrText xml:space="preserve">PAGEREF _Toc7 \h</w:instrText>
+              <w:fldChar w:fldCharType="separate"/>
+              <w:t xml:space="preserve">4</w:t>
+              <w:fldChar w:fldCharType="end"/>
+            </w:r>
+          </w:hyperlink>
+          <w:r>
+            <w:rPr>
+              <w:highlight w:val="none"/>
+            </w:rPr>
+          </w:r>
+        </w:p>
+        <w:p>
+          <w:pPr>
+            <w:pStyle w:val="886"/>
+            <w:pBdr/>
+            <w:tabs>
+              <w:tab w:val="right" w:leader="dot" w:pos="10205"/>
+            </w:tabs>
+            <w:spacing/>
+            <w:ind/>
+            <w:rPr/>
+          </w:pPr>
+          <w:hyperlink w:tooltip="#_Toc8" w:anchor="_Toc8" w:history="1">
+            <w:r>
+              <w:rPr>
+                <w:rStyle w:val="882"/>
+              </w:rPr>
+            </w:r>
+            <w:r>
+              <w:rPr>
+                <w:rStyle w:val="882"/>
+                <w:rFonts w:ascii="Lexend" w:hAnsi="Lexend" w:eastAsia="Lexend" w:cs="Lexend"/>
+                <w:highlight w:val="none"/>
+              </w:rPr>
+              <w:t xml:space="preserve">2.4 – Période de chauffe</w:t>
+            </w:r>
+            <w:r>
+              <w:rPr>
+                <w:rStyle w:val="882"/>
+              </w:rPr>
+            </w:r>
+            <w:r>
+              <w:tab/>
+            </w:r>
+            <w:r>
+              <w:fldChar w:fldCharType="begin"/>
+              <w:instrText xml:space="preserve">PAGEREF _Toc8 \h</w:instrText>
+              <w:fldChar w:fldCharType="separate"/>
+              <w:t xml:space="preserve">4</w:t>
+              <w:fldChar w:fldCharType="end"/>
+            </w:r>
+          </w:hyperlink>
+          <w:r/>
+        </w:p>
+        <w:p>
+          <w:pPr>
+            <w:pStyle w:val="886"/>
+            <w:pBdr/>
+            <w:tabs>
+              <w:tab w:val="right" w:leader="dot" w:pos="10205"/>
+            </w:tabs>
+            <w:spacing/>
+            <w:ind/>
+            <w:rPr/>
+          </w:pPr>
+          <w:hyperlink w:tooltip="#_Toc9" w:anchor="_Toc9" w:history="1">
+            <w:r>
+              <w:rPr>
+                <w:rStyle w:val="882"/>
+              </w:rPr>
+            </w:r>
+            <w:r>
+              <w:rPr>
+                <w:rStyle w:val="882"/>
+                <w:rFonts w:ascii="Lexend" w:hAnsi="Lexend" w:eastAsia="Lexend" w:cs="Lexend"/>
+                <w:highlight w:val="none"/>
+              </w:rPr>
+              <w:t xml:space="preserve">2.5 – Mode veille</w:t>
+            </w:r>
+            <w:r>
+              <w:rPr>
+                <w:rStyle w:val="882"/>
+              </w:rPr>
+            </w:r>
+            <w:r>
+              <w:tab/>
+            </w:r>
+            <w:r>
+              <w:fldChar w:fldCharType="begin"/>
+              <w:instrText xml:space="preserve">PAGEREF _Toc9 \h</w:instrText>
+              <w:fldChar w:fldCharType="separate"/>
+              <w:t xml:space="preserve">4</w:t>
+              <w:fldChar w:fldCharType="end"/>
+            </w:r>
+          </w:hyperlink>
+          <w:r/>
+        </w:p>
+        <w:p>
+          <w:pPr>
+            <w:pStyle w:val="885"/>
+            <w:pBdr/>
+            <w:tabs>
+              <w:tab w:val="right" w:leader="dot" w:pos="10205"/>
+            </w:tabs>
+            <w:spacing/>
+            <w:ind/>
+            <w:rPr>
+              <w:rFonts w:ascii="Lexend" w:hAnsi="Lexend" w:cs="Lexend"/>
+              <w:highlight w:val="none"/>
+              <w14:ligatures w14:val="none"/>
+            </w:rPr>
+          </w:pPr>
+          <w:hyperlink w:tooltip="#_Toc10" w:anchor="_Toc10" w:history="1">
+            <w:r>
+              <w:rPr>
+                <w:rStyle w:val="882"/>
+              </w:rPr>
+            </w:r>
+            <w:r>
+              <w:rPr>
+                <w:rStyle w:val="882"/>
+                <w:rFonts w:ascii="Lexend" w:hAnsi="Lexend" w:eastAsia="Lexend" w:cs="Lexend"/>
+                <w:highlight w:val="none"/>
+              </w:rPr>
+              <w:t xml:space="preserve">3 – </w:t>
             </w:r>
             <w:r>
               <w:rPr>
@@ -954,34 +1265,139 @@
             <w:r>
               <w:rPr>
                 <w:rStyle w:val="882"/>
-                <w:rFonts w:ascii="Lexend" w:hAnsi="Lexend" w:eastAsia="Lexend" w:cs="Lexend"/>
+                <w:rFonts w:ascii="Lexend" w:hAnsi="Lexend" w:cs="Lexend"/>
+                <w:highlight w:val="none"/>
+                <w14:ligatures w14:val="none"/>
               </w:rPr>
             </w:r>
             <w:r>
-              <w:rPr>
-                <w:rFonts w:ascii="Lexend" w:hAnsi="Lexend" w:eastAsia="Lexend" w:cs="Lexend"/>
-              </w:rPr>
               <w:tab/>
             </w:r>
             <w:r>
-              <w:rPr>
-                <w:rFonts w:ascii="Lexend" w:hAnsi="Lexend" w:eastAsia="Lexend" w:cs="Lexend"/>
-              </w:rPr>
               <w:fldChar w:fldCharType="begin"/>
-              <w:instrText xml:space="preserve">PAGEREF _Toc2 \h</w:instrText>
+              <w:instrText xml:space="preserve">PAGEREF _Toc10 \h</w:instrText>
               <w:fldChar w:fldCharType="separate"/>
-              <w:t xml:space="preserve">3</w:t>
+              <w:t xml:space="preserve">5</w:t>
               <w:fldChar w:fldCharType="end"/>
             </w:r>
           </w:hyperlink>
           <w:r>
             <w:rPr>
               <w:rFonts w:ascii="Lexend" w:hAnsi="Lexend" w:cs="Lexend"/>
+              <w:highlight w:val="none"/>
+              <w14:ligatures w14:val="none"/>
             </w:rPr>
           </w:r>
+        </w:p>
+        <w:p>
+          <w:pPr>
+            <w:pStyle w:val="886"/>
+            <w:pBdr/>
+            <w:tabs>
+              <w:tab w:val="right" w:leader="dot" w:pos="10205"/>
+            </w:tabs>
+            <w:spacing/>
+            <w:ind/>
+            <w:rPr>
+              <w:rFonts w:ascii="Lexend" w:hAnsi="Lexend" w:cs="Lexend"/>
+              <w:highlight w:val="none"/>
+            </w:rPr>
+          </w:pPr>
+          <w:hyperlink w:tooltip="#_Toc11" w:anchor="_Toc11" w:history="1">
+            <w:r>
+              <w:rPr>
+                <w:rStyle w:val="882"/>
+              </w:rPr>
+            </w:r>
+            <w:r>
+              <w:rPr>
+                <w:rStyle w:val="882"/>
+                <w:rFonts w:ascii="Lexend" w:hAnsi="Lexend" w:eastAsia="Lexend" w:cs="Lexend"/>
+                <w:highlight w:val="none"/>
+              </w:rPr>
+              <w:t xml:space="preserve">3.1 – </w:t>
+            </w:r>
+            <w:r>
+              <w:rPr>
+                <w:rStyle w:val="882"/>
+                <w:rFonts w:ascii="Lexend" w:hAnsi="Lexend" w:eastAsia="Lexend" w:cs="Lexend"/>
+                <w:highlight w:val="none"/>
+              </w:rPr>
+              <w:t xml:space="preserve">Calcul des valeurs</w:t>
+            </w:r>
+            <w:r>
+              <w:rPr>
+                <w:rStyle w:val="882"/>
+              </w:rPr>
+            </w:r>
+            <w:r>
+              <w:tab/>
+            </w:r>
+            <w:r>
+              <w:fldChar w:fldCharType="begin"/>
+              <w:instrText xml:space="preserve">PAGEREF _Toc11 \h</w:instrText>
+              <w:fldChar w:fldCharType="separate"/>
+              <w:t xml:space="preserve">5</w:t>
+              <w:fldChar w:fldCharType="end"/>
+            </w:r>
+          </w:hyperlink>
           <w:r>
             <w:rPr>
               <w:rFonts w:ascii="Lexend" w:hAnsi="Lexend" w:cs="Lexend"/>
+              <w:highlight w:val="none"/>
+            </w:rPr>
+          </w:r>
+        </w:p>
+        <w:p>
+          <w:pPr>
+            <w:pStyle w:val="886"/>
+            <w:pBdr/>
+            <w:tabs>
+              <w:tab w:val="right" w:leader="dot" w:pos="10205"/>
+            </w:tabs>
+            <w:spacing/>
+            <w:ind/>
+            <w:rPr>
+              <w:rFonts w:ascii="Lexend" w:hAnsi="Lexend" w:eastAsia="Lexend" w:cs="Lexend"/>
+              <w:highlight w:val="none"/>
+            </w:rPr>
+          </w:pPr>
+          <w:hyperlink w:tooltip="#_Toc12" w:anchor="_Toc12" w:history="1">
+            <w:r>
+              <w:rPr>
+                <w:rStyle w:val="882"/>
+              </w:rPr>
+            </w:r>
+            <w:r>
+              <w:rPr>
+                <w:rStyle w:val="882"/>
+                <w:rFonts w:ascii="Lexend" w:hAnsi="Lexend" w:eastAsia="Lexend" w:cs="Lexend"/>
+                <w:highlight w:val="none"/>
+              </w:rPr>
+              <w:t xml:space="preserve">3.2 – Vérification du checksum</w:t>
+            </w:r>
+            <w:r>
+              <w:rPr>
+                <w:rStyle w:val="882"/>
+                <w:rFonts w:ascii="Lexend" w:hAnsi="Lexend" w:eastAsia="Lexend" w:cs="Lexend"/>
+                <w:highlight w:val="none"/>
+              </w:rPr>
+            </w:r>
+            <w:r>
+              <w:tab/>
+            </w:r>
+            <w:r>
+              <w:fldChar w:fldCharType="begin"/>
+              <w:instrText xml:space="preserve">PAGEREF _Toc12 \h</w:instrText>
+              <w:fldChar w:fldCharType="separate"/>
+              <w:t xml:space="preserve">5</w:t>
+              <w:fldChar w:fldCharType="end"/>
+            </w:r>
+          </w:hyperlink>
+          <w:r>
+            <w:rPr>
+              <w:rFonts w:ascii="Lexend" w:hAnsi="Lexend" w:eastAsia="Lexend" w:cs="Lexend"/>
+              <w:highlight w:val="none"/>
             </w:rPr>
           </w:r>
         </w:p>
@@ -999,20 +1415,15 @@
             <w:rPr>
               <w:rFonts w:ascii="Lexend" w:hAnsi="Lexend" w:eastAsia="Lexend" w:cs="Lexend"/>
             </w:rPr>
-            <w:fldChar w:fldCharType="end"/>
           </w:r>
           <w:r>
             <w:rPr>
-              <w:rFonts w:ascii="Lexend" w:hAnsi="Lexend" w:cs="Lexend"/>
-              <w:highlight w:val="none"/>
+              <w:rFonts w:ascii="Lexend" w:hAnsi="Lexend" w:eastAsia="Lexend" w:cs="Lexend"/>
             </w:rPr>
+            <w:fldChar w:fldCharType="end"/>
           </w:r>
-          <w:r>
-            <w:rPr>
-              <w:rFonts w:ascii="Lexend" w:hAnsi="Lexend" w:cs="Lexend"/>
-              <w:highlight w:val="none"/>
-            </w:rPr>
-          </w:r>
+          <w:r/>
+          <w:r/>
         </w:p>
       </w:sdtContent>
     </w:sdt>
@@ -1058,12 +1469,8 @@
           <w14:ligatures w14:val="none"/>
         </w:rPr>
       </w:pPr>
-      <w:r>
-        <w:rPr>
-          <w:rFonts w:ascii="Lexend" w:hAnsi="Lexend" w:eastAsia="Lexend" w:cs="Lexend"/>
-          <w:highlight w:val="none"/>
-        </w:rPr>
-      </w:r>
+      <w:r/>
+      <w:bookmarkStart w:id="2" w:name="_Toc2"/>
       <w:r>
         <w:rPr>
           <w:rFonts w:ascii="Lexend" w:hAnsi="Lexend" w:eastAsia="Lexend" w:cs="Lexend"/>
@@ -1071,13 +1478,9 @@
         </w:rPr>
         <w:t xml:space="preserve">1 – Présentation du capteur</w:t>
       </w:r>
-      <w:r>
-        <w:rPr>
-          <w:rFonts w:ascii="Lexend" w:hAnsi="Lexend" w:cs="Lexend"/>
-          <w:highlight w:val="none"/>
-          <w14:ligatures w14:val="none"/>
-        </w:rPr>
-      </w:r>
+      <w:r/>
+      <w:bookmarkEnd w:id="2"/>
+      <w:r/>
       <w:r>
         <w:rPr>
           <w:rFonts w:ascii="Lexend" w:hAnsi="Lexend" w:cs="Lexend"/>
@@ -1192,6 +1595,11 @@
       </w:pPr>
       <w:r>
         <w:t xml:space="preserve">Caractéristiques techniques principales :</w:t>
+      </w:r>
+      <w:r>
+        <w:rPr>
+          <w14:ligatures w14:val="none"/>
+        </w:rPr>
       </w:r>
       <w:r>
         <w:rPr>
@@ -1258,7 +1666,7 @@
             </w:r>
             <w:r>
               <w:rPr>
-                <w:rFonts w:ascii="Lexend" w:hAnsi="Lexend" w:eastAsia="Lexend" w:cs="Lexend"/>
+                <w:rFonts w:ascii="Lexend" w:hAnsi="Lexend" w:cs="Lexend"/>
               </w:rPr>
             </w:r>
             <w:r>
@@ -1303,7 +1711,7 @@
             </w:r>
             <w:r>
               <w:rPr>
-                <w:rFonts w:ascii="Lexend" w:hAnsi="Lexend" w:eastAsia="Lexend" w:cs="Lexend"/>
+                <w:rFonts w:ascii="Lexend" w:hAnsi="Lexend" w:cs="Lexend"/>
               </w:rPr>
             </w:r>
             <w:r>
@@ -1349,7 +1757,7 @@
             </w:r>
             <w:r>
               <w:rPr>
-                <w:rFonts w:ascii="Lexend" w:hAnsi="Lexend" w:eastAsia="Lexend" w:cs="Lexend"/>
+                <w:rFonts w:ascii="Lexend" w:hAnsi="Lexend" w:cs="Lexend"/>
               </w:rPr>
             </w:r>
             <w:r>
@@ -1392,7 +1800,7 @@
             </w:r>
             <w:r>
               <w:rPr>
-                <w:rFonts w:ascii="Lexend" w:hAnsi="Lexend" w:eastAsia="Lexend" w:cs="Lexend"/>
+                <w:rFonts w:ascii="Lexend" w:hAnsi="Lexend" w:cs="Lexend"/>
               </w:rPr>
             </w:r>
             <w:r>
@@ -1438,7 +1846,7 @@
             </w:r>
             <w:r>
               <w:rPr>
-                <w:rFonts w:ascii="Lexend" w:hAnsi="Lexend" w:eastAsia="Lexend" w:cs="Lexend"/>
+                <w:rFonts w:ascii="Lexend" w:hAnsi="Lexend" w:cs="Lexend"/>
               </w:rPr>
             </w:r>
             <w:r>
@@ -1481,7 +1889,7 @@
             </w:r>
             <w:r>
               <w:rPr>
-                <w:rFonts w:ascii="Lexend" w:hAnsi="Lexend" w:eastAsia="Lexend" w:cs="Lexend"/>
+                <w:rFonts w:ascii="Lexend" w:hAnsi="Lexend" w:cs="Lexend"/>
               </w:rPr>
             </w:r>
             <w:r>
@@ -1527,7 +1935,7 @@
             </w:r>
             <w:r>
               <w:rPr>
-                <w:rFonts w:ascii="Lexend" w:hAnsi="Lexend" w:eastAsia="Lexend" w:cs="Lexend"/>
+                <w:rFonts w:ascii="Lexend" w:hAnsi="Lexend" w:cs="Lexend"/>
               </w:rPr>
             </w:r>
             <w:r>
@@ -1570,7 +1978,7 @@
             </w:r>
             <w:r>
               <w:rPr>
-                <w:rFonts w:ascii="Lexend" w:hAnsi="Lexend" w:eastAsia="Lexend" w:cs="Lexend"/>
+                <w:rFonts w:ascii="Lexend" w:hAnsi="Lexend" w:cs="Lexend"/>
               </w:rPr>
             </w:r>
             <w:r>
@@ -1616,7 +2024,7 @@
             </w:r>
             <w:r>
               <w:rPr>
-                <w:rFonts w:ascii="Lexend" w:hAnsi="Lexend" w:eastAsia="Lexend" w:cs="Lexend"/>
+                <w:rFonts w:ascii="Lexend" w:hAnsi="Lexend" w:cs="Lexend"/>
               </w:rPr>
             </w:r>
             <w:r>
@@ -1659,7 +2067,7 @@
             </w:r>
             <w:r>
               <w:rPr>
-                <w:rFonts w:ascii="Lexend" w:hAnsi="Lexend" w:eastAsia="Lexend" w:cs="Lexend"/>
+                <w:rFonts w:ascii="Lexend" w:hAnsi="Lexend" w:cs="Lexend"/>
               </w:rPr>
             </w:r>
             <w:r>
@@ -1705,7 +2113,7 @@
             </w:r>
             <w:r>
               <w:rPr>
-                <w:rFonts w:ascii="Lexend" w:hAnsi="Lexend" w:eastAsia="Lexend" w:cs="Lexend"/>
+                <w:rFonts w:ascii="Lexend" w:hAnsi="Lexend" w:cs="Lexend"/>
               </w:rPr>
             </w:r>
             <w:r>
@@ -1748,7 +2156,7 @@
             </w:r>
             <w:r>
               <w:rPr>
-                <w:rFonts w:ascii="Lexend" w:hAnsi="Lexend" w:eastAsia="Lexend" w:cs="Lexend"/>
+                <w:rFonts w:ascii="Lexend" w:hAnsi="Lexend" w:cs="Lexend"/>
               </w:rPr>
             </w:r>
             <w:r>
@@ -1794,7 +2202,7 @@
             </w:r>
             <w:r>
               <w:rPr>
-                <w:rFonts w:ascii="Lexend" w:hAnsi="Lexend" w:eastAsia="Lexend" w:cs="Lexend"/>
+                <w:rFonts w:ascii="Lexend" w:hAnsi="Lexend" w:cs="Lexend"/>
               </w:rPr>
             </w:r>
             <w:r>
@@ -1837,7 +2245,7 @@
             </w:r>
             <w:r>
               <w:rPr>
-                <w:rFonts w:ascii="Lexend" w:hAnsi="Lexend" w:eastAsia="Lexend" w:cs="Lexend"/>
+                <w:rFonts w:ascii="Lexend" w:hAnsi="Lexend" w:cs="Lexend"/>
               </w:rPr>
             </w:r>
             <w:r>
@@ -1883,7 +2291,7 @@
             </w:r>
             <w:r>
               <w:rPr>
-                <w:rFonts w:ascii="Lexend" w:hAnsi="Lexend" w:eastAsia="Lexend" w:cs="Lexend"/>
+                <w:rFonts w:ascii="Lexend" w:hAnsi="Lexend" w:cs="Lexend"/>
               </w:rPr>
             </w:r>
             <w:r>
@@ -1926,7 +2334,7 @@
             </w:r>
             <w:r>
               <w:rPr>
-                <w:rFonts w:ascii="Lexend" w:hAnsi="Lexend" w:eastAsia="Lexend" w:cs="Lexend"/>
+                <w:rFonts w:ascii="Lexend" w:hAnsi="Lexend" w:cs="Lexend"/>
               </w:rPr>
             </w:r>
             <w:r>
@@ -1957,34 +2365,6 @@
       <w:r>
         <w:rPr>
           <w:highlight w:val="none"/>
-        </w:rPr>
-      </w:r>
-      <w:r>
-        <w:rPr>
-          <w:highlight w:val="none"/>
-          <w14:ligatures w14:val="none"/>
-        </w:rPr>
-      </w:r>
-    </w:p>
-    <w:p>
-      <w:pPr>
-        <w:pStyle w:val="838"/>
-        <w:pBdr/>
-        <w:spacing/>
-        <w:ind/>
-        <w:rPr>
-          <w:highlight w:val="none"/>
-          <w14:ligatures w14:val="none"/>
-        </w:rPr>
-      </w:pPr>
-      <w:r>
-        <w:rPr>
-          <w:highlight w:val="none"/>
-        </w:rPr>
-        <w:t xml:space="preserve">2 – Fonctionnement du capteur</w:t>
-      </w:r>
-      <w:r>
-        <w:rPr>
           <w14:ligatures w14:val="none"/>
         </w:rPr>
       </w:r>
@@ -1997,6 +2377,35 @@
     </w:p>
     <w:p>
       <w:pPr>
+        <w:pStyle w:val="838"/>
+        <w:pBdr/>
+        <w:spacing/>
+        <w:ind/>
+        <w:rPr>
+          <w:highlight w:val="none"/>
+          <w14:ligatures w14:val="none"/>
+        </w:rPr>
+      </w:pPr>
+      <w:r/>
+      <w:bookmarkStart w:id="3" w:name="_Toc3"/>
+      <w:r>
+        <w:rPr>
+          <w:highlight w:val="none"/>
+        </w:rPr>
+        <w:t xml:space="preserve">2 – Fonctionnement du capteur</w:t>
+      </w:r>
+      <w:r/>
+      <w:bookmarkEnd w:id="3"/>
+      <w:r/>
+      <w:r>
+        <w:rPr>
+          <w:highlight w:val="none"/>
+          <w14:ligatures w14:val="none"/>
+        </w:rPr>
+      </w:r>
+    </w:p>
+    <w:p>
+      <w:pPr>
         <w:pStyle w:val="839"/>
         <w:pBdr/>
         <w:spacing/>
@@ -2005,17 +2414,17 @@
           <w14:ligatures w14:val="none"/>
         </w:rPr>
       </w:pPr>
+      <w:r/>
+      <w:bookmarkStart w:id="4" w:name="_Toc4"/>
       <w:r>
         <w:rPr>
           <w:highlight w:val="none"/>
         </w:rPr>
         <w:t xml:space="preserve">2.1 – Principe de mesure</w:t>
       </w:r>
-      <w:r>
-        <w:rPr>
-          <w:highlight w:val="none"/>
-        </w:rPr>
-      </w:r>
+      <w:r/>
+      <w:bookmarkEnd w:id="4"/>
+      <w:r/>
       <w:r>
         <w:rPr>
           <w14:ligatures w14:val="none"/>
@@ -2065,6 +2474,8 @@
           <w:bCs/>
         </w:rPr>
       </w:pPr>
+      <w:r/>
+      <w:bookmarkStart w:id="5" w:name="_Toc5"/>
       <w:r>
         <w:rPr>
           <w:b/>
@@ -2073,13 +2484,9 @@
         </w:rPr>
         <w:t xml:space="preserve">2.2 – Branchement</w:t>
       </w:r>
-      <w:r>
-        <w:rPr>
-          <w:b/>
-          <w:bCs/>
-          <w:highlight w:val="none"/>
-        </w:rPr>
-      </w:r>
+      <w:r/>
+      <w:bookmarkEnd w:id="5"/>
+      <w:r/>
       <w:r>
         <w:rPr>
           <w:b/>
@@ -2248,22 +2655,24 @@
           <w14:ligatures w14:val="none"/>
         </w:rPr>
       </w:pPr>
+      <w:r/>
+      <w:bookmarkStart w:id="6" w:name="_Toc6"/>
+      <w:r/>
       <w:r>
-        <w:rPr>
-          <w:rFonts w:ascii="Lexend" w:hAnsi="Lexend" w:eastAsia="Lexend" w:cs="Lexend"/>
-          <w:highlight w:val="none"/>
-        </w:rPr>
-      </w:r>
-      <w:r>
-        <w:rPr>
-          <w:rFonts w:ascii="Lexend" w:hAnsi="Lexend" w:eastAsia="Lexend" w:cs="Lexend"/>
-        </w:rPr>
         <mc:AlternateContent>
           <mc:Choice Requires="wpg">
             <w:drawing>
-              <wp:inline xmlns:wp="http://schemas.openxmlformats.org/drawingml/2006/wordprocessingDrawing" distT="0" distB="0" distL="0" distR="0">
+              <wp:anchor xmlns:wp="http://schemas.openxmlformats.org/drawingml/2006/wordprocessingDrawing" xmlns:wp14="http://schemas.microsoft.com/office/word/2010/wordprocessingDrawing" distT="0" distB="0" distL="115200" distR="115200" simplePos="0" relativeHeight="10240" behindDoc="0" locked="0" layoutInCell="1" allowOverlap="1">
+                <wp:simplePos x="0" y="0"/>
+                <wp:positionH relativeFrom="column">
+                  <wp:posOffset>-317</wp:posOffset>
+                </wp:positionH>
+                <wp:positionV relativeFrom="paragraph">
+                  <wp:posOffset>-391993</wp:posOffset>
+                </wp:positionV>
                 <wp:extent cx="6480175" cy="2213214"/>
                 <wp:effectExtent l="0" t="0" r="0" b="0"/>
+                <wp:wrapNone/>
                 <wp:docPr id="3" name=""/>
                 <wp:cNvGraphicFramePr>
                   <a:graphicFrameLocks xmlns:a="http://schemas.openxmlformats.org/drawingml/2006/main" noChangeAspect="1"/>
@@ -2272,7 +2681,7 @@
                   <a:graphicData uri="http://schemas.openxmlformats.org/drawingml/2006/picture">
                     <pic:pic xmlns:pic="http://schemas.openxmlformats.org/drawingml/2006/picture">
                       <pic:nvPicPr>
-                        <pic:cNvPr id="800579506" name=""/>
+                        <pic:cNvPr id="2142750973" name=""/>
                         <pic:cNvPicPr>
                           <a:picLocks noChangeAspect="1"/>
                         </pic:cNvPicPr>
@@ -2285,7 +2694,7 @@
                       <pic:spPr bwMode="auto">
                         <a:xfrm rot="0" flipH="0" flipV="0">
                           <a:off x="0" y="0"/>
-                          <a:ext cx="6480174" cy="2213213"/>
+                          <a:ext cx="6480173" cy="2213212"/>
                         </a:xfrm>
                         <a:prstGeom prst="rect">
                           <a:avLst/>
@@ -2294,7 +2703,7 @@
                     </pic:pic>
                   </a:graphicData>
                 </a:graphic>
-              </wp:inline>
+              </wp:anchor>
             </w:drawing>
           </mc:Choice>
           <mc:Fallback>
@@ -2318,7 +2727,7 @@
                 <v:path o:extrusionok="f" gradientshapeok="t" o:connecttype="rect"/>
                 <o:lock v:ext="edit" aspectratio="t"/>
               </v:shapetype>
-              <v:shape id="_x0000_i2" o:spid="_x0000_s2" type="#_x0000_t75" style="width:510.25pt;height:174.27pt;mso-wrap-distance-left:0.00pt;mso-wrap-distance-top:0.00pt;mso-wrap-distance-right:0.00pt;mso-wrap-distance-bottom:0.00pt;rotation:0;z-index:1;" stroked="false">
+              <v:shape id="_x0000_i2" o:spid="_x0000_s2" type="#_x0000_t75" style="position:absolute;z-index:10240;o:allowoverlap:true;o:allowincell:true;mso-position-horizontal-relative:text;margin-left:-0.02pt;mso-position-horizontal:absolute;mso-position-vertical-relative:text;margin-top:-30.87pt;mso-position-vertical:absolute;width:510.25pt;height:174.27pt;mso-wrap-distance-left:9.07pt;mso-wrap-distance-top:0.00pt;mso-wrap-distance-right:9.07pt;mso-wrap-distance-bottom:0.00pt;rotation:0;z-index:1;" stroked="false">
                 <v:imagedata r:id="rId12" o:title=""/>
                 <o:lock v:ext="edit" rotation="t"/>
               </v:shape>
@@ -2326,13 +2735,9 @@
           </mc:Fallback>
         </mc:AlternateContent>
       </w:r>
-      <w:r>
-        <w:rPr>
-          <w:rFonts w:ascii="Lexend" w:hAnsi="Lexend" w:cs="Lexend"/>
-          <w:highlight w:val="none"/>
-          <w14:ligatures w14:val="none"/>
-        </w:rPr>
-      </w:r>
+      <w:r/>
+      <w:bookmarkEnd w:id="6"/>
+      <w:r/>
       <w:r>
         <w:rPr>
           <w:rFonts w:ascii="Lexend" w:hAnsi="Lexend" w:cs="Lexend"/>
@@ -2354,13 +2759,136 @@
       </w:pPr>
       <w:r>
         <w:rPr>
-          <w:rFonts w:ascii="Lexend" w:hAnsi="Lexend" w:eastAsia="Lexend" w:cs="Lexend"/>
-          <w:b/>
-          <w:bCs/>
           <w:highlight w:val="none"/>
         </w:rPr>
-        <w:t xml:space="preserve">2.4 – Modes de fonctionnement</w:t>
       </w:r>
+      <w:r>
+        <w:rPr>
+          <w:highlight w:val="none"/>
+        </w:rPr>
+      </w:r>
+      <w:r>
+        <w:rPr>
+          <w:highlight w:val="none"/>
+        </w:rPr>
+      </w:r>
+    </w:p>
+    <w:p>
+      <w:pPr>
+        <w:pStyle w:val="839"/>
+        <w:pBdr/>
+        <w:spacing/>
+        <w:ind/>
+        <w:rPr>
+          <w:highlight w:val="none"/>
+        </w:rPr>
+      </w:pPr>
+      <w:r>
+        <w:rPr>
+          <w:highlight w:val="none"/>
+        </w:rPr>
+      </w:r>
+      <w:r>
+        <w:rPr>
+          <w:highlight w:val="none"/>
+        </w:rPr>
+      </w:r>
+      <w:r>
+        <w:rPr>
+          <w:highlight w:val="none"/>
+        </w:rPr>
+      </w:r>
+    </w:p>
+    <w:p>
+      <w:pPr>
+        <w:pStyle w:val="839"/>
+        <w:pBdr/>
+        <w:spacing/>
+        <w:ind/>
+        <w:rPr>
+          <w:highlight w:val="none"/>
+        </w:rPr>
+      </w:pPr>
+      <w:r>
+        <w:rPr>
+          <w:highlight w:val="none"/>
+        </w:rPr>
+      </w:r>
+      <w:r>
+        <w:rPr>
+          <w:highlight w:val="none"/>
+        </w:rPr>
+      </w:r>
+      <w:r>
+        <w:rPr>
+          <w:highlight w:val="none"/>
+        </w:rPr>
+      </w:r>
+    </w:p>
+    <w:p>
+      <w:pPr>
+        <w:pStyle w:val="839"/>
+        <w:pBdr/>
+        <w:spacing/>
+        <w:ind/>
+        <w:rPr>
+          <w:highlight w:val="none"/>
+        </w:rPr>
+      </w:pPr>
+      <w:r>
+        <w:rPr>
+          <w:highlight w:val="none"/>
+        </w:rPr>
+      </w:r>
+      <w:r>
+        <w:rPr>
+          <w:highlight w:val="none"/>
+        </w:rPr>
+      </w:r>
+      <w:r>
+        <w:rPr>
+          <w:highlight w:val="none"/>
+        </w:rPr>
+      </w:r>
+    </w:p>
+    <w:p>
+      <w:pPr>
+        <w:pStyle w:val="839"/>
+        <w:pBdr/>
+        <w:spacing/>
+        <w:ind/>
+        <w:rPr>
+          <w:highlight w:val="none"/>
+        </w:rPr>
+      </w:pPr>
+      <w:r>
+        <w:rPr>
+          <w:highlight w:val="none"/>
+        </w:rPr>
+      </w:r>
+      <w:r>
+        <w:rPr>
+          <w:highlight w:val="none"/>
+        </w:rPr>
+      </w:r>
+      <w:r>
+        <w:rPr>
+          <w:highlight w:val="none"/>
+        </w:rPr>
+      </w:r>
+    </w:p>
+    <w:p>
+      <w:pPr>
+        <w:pStyle w:val="839"/>
+        <w:pBdr/>
+        <w:spacing/>
+        <w:ind/>
+        <w:rPr>
+          <w:highlight w:val="none"/>
+        </w:rPr>
+      </w:pPr>
+      <w:r/>
+      <w:bookmarkStart w:id="7" w:name="_Toc7"/>
       <w:r>
         <w:rPr>
           <w:rFonts w:ascii="Lexend" w:hAnsi="Lexend" w:eastAsia="Lexend" w:cs="Lexend"/>
@@ -2368,7 +2896,11 @@
           <w:bCs/>
           <w:highlight w:val="none"/>
         </w:rPr>
+        <w:t xml:space="preserve">2.3 – Modes de fonctionnement</w:t>
       </w:r>
+      <w:r/>
+      <w:bookmarkEnd w:id="7"/>
+      <w:r/>
       <w:r>
         <w:rPr>
           <w:b/>
@@ -2383,6 +2915,13 @@
         <w:ind/>
         <w:rPr/>
       </w:pPr>
+      <w:r>
+        <w:rPr>
+          <w:rFonts w:ascii="Lexend" w:hAnsi="Lexend" w:eastAsia="Lexend" w:cs="Lexend"/>
+          <w:highlight w:val="none"/>
+        </w:rPr>
+      </w:r>
+      <w:r/>
       <w:r>
         <w:rPr>
           <w:rFonts w:ascii="Lexend" w:hAnsi="Lexend" w:eastAsia="Lexend" w:cs="Lexend"/>
@@ -2396,20 +2935,6 @@
           <w:highlight w:val="none"/>
         </w:rPr>
       </w:r>
-      <w:r/>
-      <w:r>
-        <w:rPr>
-          <w:rFonts w:ascii="Lexend" w:hAnsi="Lexend" w:eastAsia="Lexend" w:cs="Lexend"/>
-          <w:highlight w:val="none"/>
-        </w:rPr>
-      </w:r>
-      <w:r>
-        <w:rPr>
-          <w:rFonts w:ascii="Lexend" w:hAnsi="Lexend" w:eastAsia="Lexend" w:cs="Lexend"/>
-          <w:highlight w:val="none"/>
-        </w:rPr>
-      </w:r>
-      <w:r/>
       <w:r/>
     </w:p>
     <w:p>
@@ -2503,19 +3028,18 @@
         <w:ind/>
         <w:rPr/>
       </w:pPr>
+      <w:r/>
+      <w:bookmarkStart w:id="8" w:name="_Toc8"/>
       <w:r>
         <w:rPr>
           <w:rFonts w:ascii="Lexend" w:hAnsi="Lexend" w:eastAsia="Lexend" w:cs="Lexend"/>
           <w:highlight w:val="none"/>
         </w:rPr>
-        <w:t xml:space="preserve">2.5 – Période de chauffe</w:t>
+        <w:t xml:space="preserve">2.4 – Période de chauffe</w:t>
       </w:r>
-      <w:r>
-        <w:rPr>
-          <w:rFonts w:ascii="Lexend" w:hAnsi="Lexend" w:eastAsia="Lexend" w:cs="Lexend"/>
-          <w:highlight w:val="none"/>
-        </w:rPr>
-      </w:r>
+      <w:r/>
+      <w:bookmarkEnd w:id="8"/>
+      <w:r/>
       <w:r/>
     </w:p>
     <w:p>
@@ -2548,27 +3072,29 @@
         <w:ind/>
         <w:rPr/>
       </w:pPr>
+      <w:r/>
+      <w:bookmarkStart w:id="9" w:name="_Toc9"/>
       <w:r>
         <w:rPr>
           <w:rFonts w:ascii="Lexend" w:hAnsi="Lexend" w:eastAsia="Lexend" w:cs="Lexend"/>
           <w:highlight w:val="none"/>
         </w:rPr>
-        <w:t xml:space="preserve">2.6 – Mode veille</w:t>
+        <w:t xml:space="preserve">2.5 – Mode veille</w:t>
       </w:r>
-      <w:r>
+      <w:r/>
+      <w:bookmarkEnd w:id="9"/>
+      <w:r/>
+      <w:r/>
+    </w:p>
+    <w:p>
+      <w:pPr>
+        <w:pBdr/>
+        <w:spacing/>
+        <w:ind/>
         <w:rPr>
           <w:rFonts w:ascii="Lexend" w:hAnsi="Lexend" w:eastAsia="Lexend" w:cs="Lexend"/>
           <w:highlight w:val="none"/>
         </w:rPr>
-      </w:r>
-      <w:r/>
-    </w:p>
-    <w:p>
-      <w:pPr>
-        <w:pBdr/>
-        <w:spacing/>
-        <w:ind/>
-        <w:rPr/>
       </w:pPr>
       <w:r>
         <w:rPr>
@@ -2577,26 +3103,58 @@
         </w:rPr>
         <w:t xml:space="preserve">Le capteur dispose d'un mode veille (sleep) permettant d'éteindre le ventilateur et le laser lorsque les mesures ne sont pas nécessaires. Cela permet de préserver la durée de vie du laser, estimée à environ 8 000 heures de fonctionnement.</w:t>
       </w:r>
-      <w:r>
-        <w:rPr>
-          <w:rFonts w:ascii="Lexend" w:hAnsi="Lexend" w:cs="Lexend"/>
-          <w:highlight w:val="none"/>
-          <w14:ligatures w14:val="none"/>
-        </w:rPr>
-      </w:r>
       <w:r/>
     </w:p>
     <w:p>
       <w:pPr>
-        <w:pStyle w:val="838"/>
-        <w:pBdr/>
-        <w:spacing/>
-        <w:ind/>
-        <w:rPr>
-          <w:rFonts w:ascii="Lexend" w:hAnsi="Lexend" w:cs="Lexend"/>
-          <w:highlight w:val="none"/>
-          <w14:ligatures w14:val="none"/>
-        </w:rPr>
+        <w:pBdr/>
+        <w:spacing/>
+        <w:ind/>
+        <w:rPr/>
+      </w:pPr>
+      <w:r/>
+      <w:r/>
+      <w:r/>
+    </w:p>
+    <w:p>
+      <w:pPr>
+        <w:pBdr/>
+        <w:spacing/>
+        <w:ind/>
+        <w:rPr/>
+      </w:pPr>
+      <w:r/>
+      <w:r/>
+      <w:r/>
+    </w:p>
+    <w:p>
+      <w:pPr>
+        <w:pBdr/>
+        <w:spacing/>
+        <w:ind/>
+        <w:rPr/>
+      </w:pPr>
+      <w:r/>
+      <w:r/>
+      <w:r/>
+    </w:p>
+    <w:p>
+      <w:pPr>
+        <w:pBdr/>
+        <w:spacing/>
+        <w:ind/>
+        <w:rPr/>
+      </w:pPr>
+      <w:r/>
+      <w:r/>
+      <w:r/>
+    </w:p>
+    <w:p>
+      <w:pPr>
+        <w:pBdr/>
+        <w:spacing/>
+        <w:ind/>
+        <w:rPr/>
       </w:pPr>
       <w:r>
         <w:rPr>
@@ -2606,571 +3164,37 @@
       </w:r>
       <w:r>
         <w:rPr>
-          <w:rFonts w:ascii="Lexend" w:hAnsi="Lexend" w:cs="Lexend"/>
+          <w:rFonts w:ascii="Lexend" w:hAnsi="Lexend" w:eastAsia="Lexend" w:cs="Lexend"/>
           <w:highlight w:val="none"/>
-          <w14:ligatures w14:val="none"/>
         </w:rPr>
       </w:r>
-      <w:r>
-        <w:rPr>
-          <w:rFonts w:ascii="Lexend" w:hAnsi="Lexend" w:cs="Lexend"/>
-          <w:highlight w:val="none"/>
-          <w14:ligatures w14:val="none"/>
-        </w:rPr>
-      </w:r>
-    </w:p>
-    <w:p>
-      <w:pPr>
-        <w:pStyle w:val="838"/>
-        <w:pBdr/>
-        <w:spacing/>
-        <w:ind/>
-        <w:rPr>
-          <w:rFonts w:ascii="Lexend" w:hAnsi="Lexend" w:cs="Lexend"/>
-          <w:highlight w:val="none"/>
-          <w14:ligatures w14:val="none"/>
-        </w:rPr>
-      </w:pPr>
       <w:r>
         <w:rPr>
           <w:rFonts w:ascii="Lexend" w:hAnsi="Lexend" w:eastAsia="Lexend" w:cs="Lexend"/>
           <w:highlight w:val="none"/>
         </w:rPr>
       </w:r>
-      <w:r>
+    </w:p>
+    <w:p>
+      <w:pPr>
+        <w:pStyle w:val="838"/>
+        <w:pBdr/>
+        <w:spacing/>
+        <w:ind/>
         <w:rPr>
           <w:rFonts w:ascii="Lexend" w:hAnsi="Lexend" w:cs="Lexend"/>
           <w:highlight w:val="none"/>
           <w14:ligatures w14:val="none"/>
         </w:rPr>
-      </w:r>
-      <w:r>
-        <w:rPr>
-          <w:rFonts w:ascii="Lexend" w:hAnsi="Lexend" w:cs="Lexend"/>
-          <w:highlight w:val="none"/>
-          <w14:ligatures w14:val="none"/>
-        </w:rPr>
-      </w:r>
-    </w:p>
-    <w:p>
-      <w:pPr>
-        <w:pStyle w:val="838"/>
-        <w:pBdr/>
-        <w:spacing/>
-        <w:ind/>
-        <w:rPr>
-          <w:rFonts w:ascii="Lexend" w:hAnsi="Lexend" w:cs="Lexend"/>
-          <w:highlight w:val="none"/>
-          <w14:ligatures w14:val="none"/>
-        </w:rPr>
-      </w:pPr>
+      </w:pPr>
+      <w:r/>
+      <w:bookmarkStart w:id="10" w:name="_Toc10"/>
       <w:r>
         <w:rPr>
           <w:rFonts w:ascii="Lexend" w:hAnsi="Lexend" w:eastAsia="Lexend" w:cs="Lexend"/>
           <w:highlight w:val="none"/>
         </w:rPr>
-      </w:r>
-      <w:r>
-        <w:rPr>
-          <w:rFonts w:ascii="Lexend" w:hAnsi="Lexend" w:cs="Lexend"/>
-          <w:highlight w:val="none"/>
-          <w14:ligatures w14:val="none"/>
-        </w:rPr>
-      </w:r>
-      <w:r>
-        <w:rPr>
-          <w:rFonts w:ascii="Lexend" w:hAnsi="Lexend" w:cs="Lexend"/>
-          <w:highlight w:val="none"/>
-          <w14:ligatures w14:val="none"/>
-        </w:rPr>
-      </w:r>
-    </w:p>
-    <w:p>
-      <w:pPr>
-        <w:pStyle w:val="838"/>
-        <w:pBdr/>
-        <w:spacing/>
-        <w:ind/>
-        <w:rPr>
-          <w:rFonts w:ascii="Lexend" w:hAnsi="Lexend" w:cs="Lexend"/>
-          <w:highlight w:val="none"/>
-          <w14:ligatures w14:val="none"/>
-        </w:rPr>
-      </w:pPr>
-      <w:r>
-        <w:rPr>
-          <w:rFonts w:ascii="Lexend" w:hAnsi="Lexend" w:eastAsia="Lexend" w:cs="Lexend"/>
-          <w:highlight w:val="none"/>
-        </w:rPr>
-      </w:r>
-      <w:r>
-        <w:rPr>
-          <w:rFonts w:ascii="Lexend" w:hAnsi="Lexend" w:cs="Lexend"/>
-          <w:highlight w:val="none"/>
-          <w14:ligatures w14:val="none"/>
-        </w:rPr>
-      </w:r>
-      <w:r>
-        <w:rPr>
-          <w:rFonts w:ascii="Lexend" w:hAnsi="Lexend" w:cs="Lexend"/>
-          <w:highlight w:val="none"/>
-          <w14:ligatures w14:val="none"/>
-        </w:rPr>
-      </w:r>
-    </w:p>
-    <w:p>
-      <w:pPr>
-        <w:pStyle w:val="838"/>
-        <w:pBdr/>
-        <w:spacing/>
-        <w:ind/>
-        <w:rPr>
-          <w:rFonts w:ascii="Lexend" w:hAnsi="Lexend" w:cs="Lexend"/>
-          <w:highlight w:val="none"/>
-          <w14:ligatures w14:val="none"/>
-        </w:rPr>
-      </w:pPr>
-      <w:r>
-        <w:rPr>
-          <w:rFonts w:ascii="Lexend" w:hAnsi="Lexend" w:eastAsia="Lexend" w:cs="Lexend"/>
-          <w:highlight w:val="none"/>
-        </w:rPr>
-      </w:r>
-      <w:r>
-        <w:rPr>
-          <w:rFonts w:ascii="Lexend" w:hAnsi="Lexend" w:cs="Lexend"/>
-          <w:highlight w:val="none"/>
-          <w14:ligatures w14:val="none"/>
-        </w:rPr>
-      </w:r>
-      <w:r>
-        <w:rPr>
-          <w:rFonts w:ascii="Lexend" w:hAnsi="Lexend" w:cs="Lexend"/>
-          <w:highlight w:val="none"/>
-          <w14:ligatures w14:val="none"/>
-        </w:rPr>
-      </w:r>
-    </w:p>
-    <w:p>
-      <w:pPr>
-        <w:pStyle w:val="838"/>
-        <w:pBdr/>
-        <w:spacing/>
-        <w:ind/>
-        <w:rPr>
-          <w:rFonts w:ascii="Lexend" w:hAnsi="Lexend" w:cs="Lexend"/>
-          <w:highlight w:val="none"/>
-          <w14:ligatures w14:val="none"/>
-        </w:rPr>
-      </w:pPr>
-      <w:r>
-        <w:rPr>
-          <w:rFonts w:ascii="Lexend" w:hAnsi="Lexend" w:eastAsia="Lexend" w:cs="Lexend"/>
-          <w:highlight w:val="none"/>
-        </w:rPr>
-      </w:r>
-      <w:r>
-        <w:rPr>
-          <w:rFonts w:ascii="Lexend" w:hAnsi="Lexend" w:cs="Lexend"/>
-          <w:highlight w:val="none"/>
-          <w14:ligatures w14:val="none"/>
-        </w:rPr>
-      </w:r>
-      <w:r>
-        <w:rPr>
-          <w:rFonts w:ascii="Lexend" w:hAnsi="Lexend" w:cs="Lexend"/>
-          <w:highlight w:val="none"/>
-          <w14:ligatures w14:val="none"/>
-        </w:rPr>
-      </w:r>
-    </w:p>
-    <w:p>
-      <w:pPr>
-        <w:pStyle w:val="838"/>
-        <w:pBdr/>
-        <w:spacing/>
-        <w:ind/>
-        <w:rPr>
-          <w:rFonts w:ascii="Lexend" w:hAnsi="Lexend" w:cs="Lexend"/>
-          <w:highlight w:val="none"/>
-          <w14:ligatures w14:val="none"/>
-        </w:rPr>
-      </w:pPr>
-      <w:r>
-        <w:rPr>
-          <w:rFonts w:ascii="Lexend" w:hAnsi="Lexend" w:eastAsia="Lexend" w:cs="Lexend"/>
-          <w:highlight w:val="none"/>
-        </w:rPr>
-      </w:r>
-      <w:r>
-        <w:rPr>
-          <w:rFonts w:ascii="Lexend" w:hAnsi="Lexend" w:cs="Lexend"/>
-          <w:highlight w:val="none"/>
-          <w14:ligatures w14:val="none"/>
-        </w:rPr>
-      </w:r>
-      <w:r>
-        <w:rPr>
-          <w:rFonts w:ascii="Lexend" w:hAnsi="Lexend" w:cs="Lexend"/>
-          <w:highlight w:val="none"/>
-          <w14:ligatures w14:val="none"/>
-        </w:rPr>
-      </w:r>
-    </w:p>
-    <w:p>
-      <w:pPr>
-        <w:pStyle w:val="838"/>
-        <w:pBdr/>
-        <w:spacing/>
-        <w:ind/>
-        <w:rPr>
-          <w:rFonts w:ascii="Lexend" w:hAnsi="Lexend" w:cs="Lexend"/>
-          <w:highlight w:val="none"/>
-          <w14:ligatures w14:val="none"/>
-        </w:rPr>
-      </w:pPr>
-      <w:r>
-        <w:rPr>
-          <w:rFonts w:ascii="Lexend" w:hAnsi="Lexend" w:eastAsia="Lexend" w:cs="Lexend"/>
-          <w:highlight w:val="none"/>
-        </w:rPr>
-      </w:r>
-      <w:r>
-        <w:rPr>
-          <w:rFonts w:ascii="Lexend" w:hAnsi="Lexend" w:cs="Lexend"/>
-          <w:highlight w:val="none"/>
-          <w14:ligatures w14:val="none"/>
-        </w:rPr>
-      </w:r>
-      <w:r>
-        <w:rPr>
-          <w:rFonts w:ascii="Lexend" w:hAnsi="Lexend" w:cs="Lexend"/>
-          <w:highlight w:val="none"/>
-          <w14:ligatures w14:val="none"/>
-        </w:rPr>
-      </w:r>
-    </w:p>
-    <w:p>
-      <w:pPr>
-        <w:pStyle w:val="838"/>
-        <w:pBdr/>
-        <w:spacing/>
-        <w:ind/>
-        <w:rPr>
-          <w:rFonts w:ascii="Lexend" w:hAnsi="Lexend" w:cs="Lexend"/>
-          <w:highlight w:val="none"/>
-          <w14:ligatures w14:val="none"/>
-        </w:rPr>
-      </w:pPr>
-      <w:r>
-        <w:rPr>
-          <w:rFonts w:ascii="Lexend" w:hAnsi="Lexend" w:eastAsia="Lexend" w:cs="Lexend"/>
-          <w:highlight w:val="none"/>
-        </w:rPr>
-      </w:r>
-      <w:r>
-        <w:rPr>
-          <w:rFonts w:ascii="Lexend" w:hAnsi="Lexend" w:cs="Lexend"/>
-          <w:highlight w:val="none"/>
-          <w14:ligatures w14:val="none"/>
-        </w:rPr>
-      </w:r>
-      <w:r>
-        <w:rPr>
-          <w:rFonts w:ascii="Lexend" w:hAnsi="Lexend" w:cs="Lexend"/>
-          <w:highlight w:val="none"/>
-          <w14:ligatures w14:val="none"/>
-        </w:rPr>
-      </w:r>
-    </w:p>
-    <w:p>
-      <w:pPr>
-        <w:pStyle w:val="838"/>
-        <w:pBdr/>
-        <w:spacing/>
-        <w:ind/>
-        <w:rPr>
-          <w:rFonts w:ascii="Lexend" w:hAnsi="Lexend" w:cs="Lexend"/>
-          <w:highlight w:val="none"/>
-          <w14:ligatures w14:val="none"/>
-        </w:rPr>
-      </w:pPr>
-      <w:r>
-        <w:rPr>
-          <w:rFonts w:ascii="Lexend" w:hAnsi="Lexend" w:eastAsia="Lexend" w:cs="Lexend"/>
-          <w:highlight w:val="none"/>
-        </w:rPr>
-      </w:r>
-      <w:r>
-        <w:rPr>
-          <w:rFonts w:ascii="Lexend" w:hAnsi="Lexend" w:cs="Lexend"/>
-          <w:highlight w:val="none"/>
-          <w14:ligatures w14:val="none"/>
-        </w:rPr>
-      </w:r>
-      <w:r>
-        <w:rPr>
-          <w:rFonts w:ascii="Lexend" w:hAnsi="Lexend" w:cs="Lexend"/>
-          <w:highlight w:val="none"/>
-          <w14:ligatures w14:val="none"/>
-        </w:rPr>
-      </w:r>
-    </w:p>
-    <w:p>
-      <w:pPr>
-        <w:pStyle w:val="838"/>
-        <w:pBdr/>
-        <w:spacing/>
-        <w:ind/>
-        <w:rPr>
-          <w:rFonts w:ascii="Lexend" w:hAnsi="Lexend" w:cs="Lexend"/>
-          <w:highlight w:val="none"/>
-          <w14:ligatures w14:val="none"/>
-        </w:rPr>
-      </w:pPr>
-      <w:r>
-        <w:rPr>
-          <w:rFonts w:ascii="Lexend" w:hAnsi="Lexend" w:eastAsia="Lexend" w:cs="Lexend"/>
-          <w:highlight w:val="none"/>
-        </w:rPr>
-      </w:r>
-      <w:r>
-        <w:rPr>
-          <w:rFonts w:ascii="Lexend" w:hAnsi="Lexend" w:cs="Lexend"/>
-          <w:highlight w:val="none"/>
-          <w14:ligatures w14:val="none"/>
-        </w:rPr>
-      </w:r>
-      <w:r>
-        <w:rPr>
-          <w:rFonts w:ascii="Lexend" w:hAnsi="Lexend" w:cs="Lexend"/>
-          <w:highlight w:val="none"/>
-          <w14:ligatures w14:val="none"/>
-        </w:rPr>
-      </w:r>
-    </w:p>
-    <w:p>
-      <w:pPr>
-        <w:pStyle w:val="838"/>
-        <w:pBdr/>
-        <w:spacing/>
-        <w:ind/>
-        <w:rPr>
-          <w:rFonts w:ascii="Lexend" w:hAnsi="Lexend" w:cs="Lexend"/>
-          <w:highlight w:val="none"/>
-          <w14:ligatures w14:val="none"/>
-        </w:rPr>
-      </w:pPr>
-      <w:r>
-        <w:rPr>
-          <w:rFonts w:ascii="Lexend" w:hAnsi="Lexend" w:eastAsia="Lexend" w:cs="Lexend"/>
-          <w:highlight w:val="none"/>
-        </w:rPr>
-      </w:r>
-      <w:r>
-        <w:rPr>
-          <w:rFonts w:ascii="Lexend" w:hAnsi="Lexend" w:cs="Lexend"/>
-          <w:highlight w:val="none"/>
-          <w14:ligatures w14:val="none"/>
-        </w:rPr>
-      </w:r>
-      <w:r>
-        <w:rPr>
-          <w:rFonts w:ascii="Lexend" w:hAnsi="Lexend" w:cs="Lexend"/>
-          <w:highlight w:val="none"/>
-          <w14:ligatures w14:val="none"/>
-        </w:rPr>
-      </w:r>
-    </w:p>
-    <w:p>
-      <w:pPr>
-        <w:pStyle w:val="838"/>
-        <w:pBdr/>
-        <w:spacing/>
-        <w:ind/>
-        <w:rPr>
-          <w:rFonts w:ascii="Lexend" w:hAnsi="Lexend" w:cs="Lexend"/>
-          <w:highlight w:val="none"/>
-          <w14:ligatures w14:val="none"/>
-        </w:rPr>
-      </w:pPr>
-      <w:r>
-        <w:rPr>
-          <w:rFonts w:ascii="Lexend" w:hAnsi="Lexend" w:eastAsia="Lexend" w:cs="Lexend"/>
-          <w:highlight w:val="none"/>
-        </w:rPr>
-      </w:r>
-      <w:r>
-        <w:rPr>
-          <w:rFonts w:ascii="Lexend" w:hAnsi="Lexend" w:cs="Lexend"/>
-          <w:highlight w:val="none"/>
-          <w14:ligatures w14:val="none"/>
-        </w:rPr>
-      </w:r>
-      <w:r>
-        <w:rPr>
-          <w:rFonts w:ascii="Lexend" w:hAnsi="Lexend" w:cs="Lexend"/>
-          <w:highlight w:val="none"/>
-          <w14:ligatures w14:val="none"/>
-        </w:rPr>
-      </w:r>
-    </w:p>
-    <w:p>
-      <w:pPr>
-        <w:pStyle w:val="838"/>
-        <w:pBdr/>
-        <w:spacing/>
-        <w:ind/>
-        <w:rPr>
-          <w:rFonts w:ascii="Lexend" w:hAnsi="Lexend" w:cs="Lexend"/>
-          <w:highlight w:val="none"/>
-          <w14:ligatures w14:val="none"/>
-        </w:rPr>
-      </w:pPr>
-      <w:r>
-        <w:rPr>
-          <w:rFonts w:ascii="Lexend" w:hAnsi="Lexend" w:eastAsia="Lexend" w:cs="Lexend"/>
-          <w:highlight w:val="none"/>
-        </w:rPr>
-      </w:r>
-      <w:r>
-        <w:rPr>
-          <w:rFonts w:ascii="Lexend" w:hAnsi="Lexend" w:cs="Lexend"/>
-          <w:highlight w:val="none"/>
-          <w14:ligatures w14:val="none"/>
-        </w:rPr>
-      </w:r>
-      <w:r>
-        <w:rPr>
-          <w:rFonts w:ascii="Lexend" w:hAnsi="Lexend" w:cs="Lexend"/>
-          <w:highlight w:val="none"/>
-          <w14:ligatures w14:val="none"/>
-        </w:rPr>
-      </w:r>
-    </w:p>
-    <w:p>
-      <w:pPr>
-        <w:pStyle w:val="838"/>
-        <w:pBdr/>
-        <w:spacing/>
-        <w:ind/>
-        <w:rPr>
-          <w:rFonts w:ascii="Lexend" w:hAnsi="Lexend" w:cs="Lexend"/>
-          <w:highlight w:val="none"/>
-          <w14:ligatures w14:val="none"/>
-        </w:rPr>
-      </w:pPr>
-      <w:r>
-        <w:rPr>
-          <w:rFonts w:ascii="Lexend" w:hAnsi="Lexend" w:eastAsia="Lexend" w:cs="Lexend"/>
-          <w:highlight w:val="none"/>
-        </w:rPr>
-      </w:r>
-      <w:r>
-        <w:rPr>
-          <w:rFonts w:ascii="Lexend" w:hAnsi="Lexend" w:cs="Lexend"/>
-          <w:highlight w:val="none"/>
-          <w14:ligatures w14:val="none"/>
-        </w:rPr>
-      </w:r>
-      <w:r>
-        <w:rPr>
-          <w:rFonts w:ascii="Lexend" w:hAnsi="Lexend" w:cs="Lexend"/>
-          <w:highlight w:val="none"/>
-          <w14:ligatures w14:val="none"/>
-        </w:rPr>
-      </w:r>
-    </w:p>
-    <w:p>
-      <w:pPr>
-        <w:pStyle w:val="838"/>
-        <w:pBdr/>
-        <w:spacing/>
-        <w:ind/>
-        <w:rPr>
-          <w:rFonts w:ascii="Lexend" w:hAnsi="Lexend" w:cs="Lexend"/>
-          <w:highlight w:val="none"/>
-          <w14:ligatures w14:val="none"/>
-        </w:rPr>
-      </w:pPr>
-      <w:r>
-        <w:rPr>
-          <w:rFonts w:ascii="Lexend" w:hAnsi="Lexend" w:eastAsia="Lexend" w:cs="Lexend"/>
-          <w:highlight w:val="none"/>
-        </w:rPr>
-      </w:r>
-      <w:r>
-        <w:rPr>
-          <w:rFonts w:ascii="Lexend" w:hAnsi="Lexend" w:cs="Lexend"/>
-          <w:highlight w:val="none"/>
-          <w14:ligatures w14:val="none"/>
-        </w:rPr>
-      </w:r>
-      <w:r>
-        <w:rPr>
-          <w:rFonts w:ascii="Lexend" w:hAnsi="Lexend" w:cs="Lexend"/>
-          <w:highlight w:val="none"/>
-          <w14:ligatures w14:val="none"/>
-        </w:rPr>
-      </w:r>
-    </w:p>
-    <w:p>
-      <w:pPr>
-        <w:pStyle w:val="838"/>
-        <w:pBdr/>
-        <w:spacing/>
-        <w:ind/>
-        <w:rPr>
-          <w:rFonts w:ascii="Lexend" w:hAnsi="Lexend" w:cs="Lexend"/>
-          <w:highlight w:val="none"/>
-          <w14:ligatures w14:val="none"/>
-        </w:rPr>
-      </w:pPr>
-      <w:r>
-        <w:rPr>
-          <w:rFonts w:ascii="Lexend" w:hAnsi="Lexend" w:eastAsia="Lexend" w:cs="Lexend"/>
-          <w:highlight w:val="none"/>
-        </w:rPr>
-      </w:r>
-      <w:r>
-        <w:rPr>
-          <w:rFonts w:ascii="Lexend" w:hAnsi="Lexend" w:cs="Lexend"/>
-          <w:highlight w:val="none"/>
-          <w14:ligatures w14:val="none"/>
-        </w:rPr>
-      </w:r>
-      <w:r>
-        <w:rPr>
-          <w:rFonts w:ascii="Lexend" w:hAnsi="Lexend" w:cs="Lexend"/>
-          <w:highlight w:val="none"/>
-          <w14:ligatures w14:val="none"/>
-        </w:rPr>
-      </w:r>
-    </w:p>
-    <w:p>
-      <w:pPr>
-        <w:pStyle w:val="838"/>
-        <w:pBdr/>
-        <w:spacing/>
-        <w:ind/>
-        <w:rPr>
-          <w:rFonts w:ascii="Lexend" w:hAnsi="Lexend" w:cs="Lexend"/>
-          <w:highlight w:val="none"/>
-          <w14:ligatures w14:val="none"/>
-        </w:rPr>
-      </w:pPr>
-      <w:r>
-        <w:rPr>
-          <w:rFonts w:ascii="Lexend" w:hAnsi="Lexend" w:eastAsia="Lexend" w:cs="Lexend"/>
-        </w:rPr>
-      </w:r>
-      <w:bookmarkStart w:id="2" w:name="_Toc2"/>
-      <w:r>
-        <w:rPr>
-          <w:rFonts w:ascii="Lexend" w:hAnsi="Lexend" w:eastAsia="Lexend" w:cs="Lexend"/>
-          <w:highlight w:val="none"/>
-        </w:rPr>
-        <w:t xml:space="preserve">1 – </w:t>
+        <w:t xml:space="preserve">3 – </w:t>
       </w:r>
       <w:r>
         <w:rPr>
@@ -3179,14 +3203,9 @@
         </w:rPr>
         <w:t xml:space="preserve">Récupération de la trame</w:t>
       </w:r>
-      <w:bookmarkEnd w:id="2"/>
-      <w:r>
-        <w:rPr>
-          <w:rFonts w:ascii="Lexend" w:hAnsi="Lexend" w:cs="Lexend"/>
-          <w:highlight w:val="none"/>
-          <w14:ligatures w14:val="none"/>
-        </w:rPr>
-      </w:r>
+      <w:r/>
+      <w:bookmarkEnd w:id="10"/>
+      <w:r/>
       <w:r>
         <w:rPr>
           <w:rFonts w:ascii="Lexend" w:hAnsi="Lexend" w:cs="Lexend"/>
@@ -3293,7 +3312,7 @@
         <w:spacing/>
         <w:ind/>
         <w:rPr>
-          <w:rFonts w:ascii="Lexend" w:hAnsi="Lexend" w:cs="Lexend"/>
+          <w:rFonts w:ascii="Lexend" w:hAnsi="Lexend" w:eastAsia="Lexend" w:cs="Lexend"/>
           <w:highlight w:val="none"/>
         </w:rPr>
       </w:pPr>
@@ -3472,7 +3491,98 @@
       </w:r>
       <w:r>
         <w:rPr>
+          <w:rFonts w:ascii="Lexend" w:hAnsi="Lexend" w:eastAsia="Lexend" w:cs="Lexend"/>
+          <w:highlight w:val="none"/>
+        </w:rPr>
+      </w:r>
+    </w:p>
+    <w:p>
+      <w:pPr>
+        <w:pBdr/>
+        <w:spacing/>
+        <w:ind/>
+        <w:rPr>
+          <w:rFonts w:ascii="Lexend" w:hAnsi="Lexend" w:eastAsia="Lexend" w:cs="Lexend"/>
+          <w:highlight w:val="none"/>
+        </w:rPr>
+      </w:pPr>
+      <w:r>
+        <w:rPr>
+          <w:rFonts w:ascii="Lexend" w:hAnsi="Lexend" w:eastAsia="Lexend" w:cs="Lexend"/>
+          <w:highlight w:val="none"/>
+        </w:rPr>
+      </w:r>
+      <w:r>
+        <w:rPr>
+          <w:rFonts w:ascii="Lexend" w:hAnsi="Lexend" w:eastAsia="Lexend" w:cs="Lexend"/>
+          <w:highlight w:val="none"/>
+        </w:rPr>
+      </w:r>
+      <w:r>
+        <w:rPr>
+          <w:rFonts w:ascii="Lexend" w:hAnsi="Lexend" w:eastAsia="Lexend" w:cs="Lexend"/>
+          <w:highlight w:val="none"/>
+        </w:rPr>
+      </w:r>
+    </w:p>
+    <w:p>
+      <w:pPr>
+        <w:pStyle w:val="839"/>
+        <w:pBdr/>
+        <w:spacing/>
+        <w:ind/>
+        <w:rPr>
           <w:rFonts w:ascii="Lexend" w:hAnsi="Lexend" w:cs="Lexend"/>
+          <w:highlight w:val="none"/>
+        </w:rPr>
+      </w:pPr>
+      <w:r/>
+      <w:bookmarkStart w:id="11" w:name="_Toc11"/>
+      <w:r>
+        <w:rPr>
+          <w:rFonts w:ascii="Lexend" w:hAnsi="Lexend" w:eastAsia="Lexend" w:cs="Lexend"/>
+          <w:highlight w:val="none"/>
+        </w:rPr>
+        <w:t xml:space="preserve">3.1 – </w:t>
+      </w:r>
+      <w:r>
+        <w:rPr>
+          <w:rFonts w:ascii="Lexend" w:hAnsi="Lexend" w:eastAsia="Lexend" w:cs="Lexend"/>
+          <w:highlight w:val="none"/>
+        </w:rPr>
+        <w:t xml:space="preserve">Calcul des valeurs</w:t>
+      </w:r>
+      <w:r/>
+      <w:bookmarkEnd w:id="11"/>
+      <w:r/>
+      <w:r/>
+    </w:p>
+    <w:p>
+      <w:pPr>
+        <w:pBdr/>
+        <w:spacing/>
+        <w:ind/>
+        <w:rPr>
+          <w:rFonts w:ascii="Lexend" w:hAnsi="Lexend" w:cs="Lexend"/>
+          <w:highlight w:val="none"/>
+        </w:rPr>
+      </w:pPr>
+      <w:r>
+        <w:rPr>
+          <w:rFonts w:ascii="Lexend" w:hAnsi="Lexend" w:eastAsia="Lexend" w:cs="Lexend"/>
+          <w:highlight w:val="none"/>
+        </w:rPr>
+        <w:t xml:space="preserve">Les valeurs de PM2.5 et PM10 sont obtenues en combinant les deux octets correspondants (poids faible + poids fort), puis en divisant le résultat par 10 :</w:t>
+      </w:r>
+      <w:r>
+        <w:rPr>
+          <w:rFonts w:ascii="Lexend" w:hAnsi="Lexend" w:eastAsia="Lexend" w:cs="Lexend"/>
+          <w:highlight w:val="none"/>
+        </w:rPr>
+      </w:r>
+      <w:r>
+        <w:rPr>
+          <w:rFonts w:ascii="Lexend" w:hAnsi="Lexend" w:eastAsia="Lexend" w:cs="Lexend"/>
           <w:highlight w:val="none"/>
         </w:rPr>
       </w:r>
@@ -3486,101 +3596,136 @@
     <w:p>
       <w:pPr>
         <w:pBdr/>
-        <w:spacing/>
-        <w:ind/>
-        <w:rPr>
-          <w:rFonts w:ascii="Lexend" w:hAnsi="Lexend" w:cs="Lexend"/>
-          <w:highlight w:val="none"/>
-        </w:rPr>
+        <w:tabs>
+          <w:tab w:val="center" w:leader="none" w:pos="5102"/>
+          <w:tab w:val="center" w:leader="none" w:pos="5102"/>
+        </w:tabs>
+        <w:spacing/>
+        <w:ind/>
+        <w:rPr/>
       </w:pPr>
       <w:r>
         <w:rPr>
           <w:rFonts w:ascii="Lexend" w:hAnsi="Lexend" w:eastAsia="Lexend" w:cs="Lexend"/>
           <w:highlight w:val="none"/>
         </w:rPr>
-        <w:t xml:space="preserve">La mesure du capteur est donc :</w:t>
+        <w:t xml:space="preserve">Taux PM2.5 = (octet4 × 256 + octet3) / 10  →  0x0015 = 21 → 2,1 µg/m³</w:t>
+        <w:br/>
       </w:r>
-      <w:r>
-        <w:rPr>
-          <w:rFonts w:ascii="Lexend" w:hAnsi="Lexend" w:cs="Lexend"/>
-          <w:highlight w:val="none"/>
-        </w:rPr>
-      </w:r>
-      <w:r>
-        <w:rPr>
-          <w:rFonts w:ascii="Lexend" w:hAnsi="Lexend" w:cs="Lexend"/>
-          <w:highlight w:val="none"/>
-        </w:rPr>
-      </w:r>
-    </w:p>
-    <w:p>
-      <w:pPr>
-        <w:pBdr/>
-        <w:tabs>
-          <w:tab w:val="center" w:leader="none" w:pos="5102"/>
-          <w:tab w:val="center" w:leader="none" w:pos="5102"/>
-        </w:tabs>
-        <w:spacing/>
-        <w:ind/>
-        <w:rPr>
-          <w:rFonts w:ascii="Lexend" w:hAnsi="Lexend" w:cs="Lexend"/>
-          <w:highlight w:val="none"/>
-          <w:vertAlign w:val="baseline"/>
-        </w:rPr>
-      </w:pPr>
+      <w:r/>
       <w:r>
         <w:rPr>
           <w:rFonts w:ascii="Lexend" w:hAnsi="Lexend" w:eastAsia="Lexend" w:cs="Lexend"/>
           <w:highlight w:val="none"/>
         </w:rPr>
-        <w:t xml:space="preserve">Taux PM 2.5</w:t>
+        <w:t xml:space="preserve">Taux PM10  = (octet6 × 256 + octet5) / 10  →  0x0068 = 104 → 10,4 µg/m³</w:t>
+      </w:r>
+      <w:r/>
+      <w:r>
+        <w:rPr>
+          <w:rFonts w:ascii="Lexend" w:hAnsi="Lexend" w:eastAsia="Lexend" w:cs="Lexend"/>
+          <w:highlight w:val="none"/>
+        </w:rPr>
       </w:r>
       <w:r>
         <w:rPr>
           <w:rFonts w:ascii="Lexend" w:hAnsi="Lexend" w:eastAsia="Lexend" w:cs="Lexend"/>
           <w:highlight w:val="none"/>
         </w:rPr>
-        <w:t xml:space="preserve"> = 0x0015 = 21 = 2,1 µg.m</w:t>
-      </w:r>
-      <w:r>
-        <w:rPr>
-          <w:rFonts w:ascii="Lexend" w:hAnsi="Lexend" w:eastAsia="Lexend" w:cs="Lexend"/>
-          <w:highlight w:val="none"/>
-          <w:vertAlign w:val="superscript"/>
-        </w:rPr>
-        <w:t xml:space="preserve">3</w:t>
-        <w:br/>
-      </w:r>
-      <w:r>
-        <w:rPr>
-          <w:rFonts w:ascii="Lexend" w:hAnsi="Lexend" w:eastAsia="Lexend" w:cs="Lexend"/>
-          <w:highlight w:val="none"/>
-          <w:vertAlign w:val="baseline"/>
-        </w:rPr>
-        <w:t xml:space="preserve">Taux PM 10 = 0x0068 = 104 = 10,4</w:t>
-      </w:r>
-      <w:r>
-        <w:rPr>
-          <w:rFonts w:ascii="Lexend" w:hAnsi="Lexend" w:eastAsia="Lexend" w:cs="Lexend"/>
-          <w:highlight w:val="none"/>
-          <w:vertAlign w:val="baseline"/>
-        </w:rPr>
-        <w:t xml:space="preserve"> </w:t>
       </w:r>
       <w:r>
         <w:rPr>
           <w:rFonts w:ascii="Lexend" w:hAnsi="Lexend" w:eastAsia="Lexend" w:cs="Lexend"/>
           <w:highlight w:val="none"/>
         </w:rPr>
-        <w:t xml:space="preserve">µg.m</w:t>
+      </w:r>
+    </w:p>
+    <w:p>
+      <w:pPr>
+        <w:pBdr/>
+        <w:tabs>
+          <w:tab w:val="center" w:leader="none" w:pos="5102"/>
+          <w:tab w:val="center" w:leader="none" w:pos="5102"/>
+        </w:tabs>
+        <w:spacing/>
+        <w:ind/>
+        <w:rPr>
+          <w:rFonts w:ascii="Lexend" w:hAnsi="Lexend" w:eastAsia="Lexend" w:cs="Lexend"/>
+          <w:highlight w:val="none"/>
+        </w:rPr>
+      </w:pPr>
+      <w:r>
+        <w:rPr>
+          <w:rFonts w:ascii="Lexend" w:hAnsi="Lexend" w:eastAsia="Lexend" w:cs="Lexend"/>
+          <w:highlight w:val="none"/>
+        </w:rPr>
       </w:r>
       <w:r>
         <w:rPr>
           <w:rFonts w:ascii="Lexend" w:hAnsi="Lexend" w:eastAsia="Lexend" w:cs="Lexend"/>
           <w:highlight w:val="none"/>
-          <w:vertAlign w:val="superscript"/>
         </w:rPr>
-        <w:t xml:space="preserve">3</w:t>
+      </w:r>
+      <w:r>
+        <w:rPr>
+          <w:rFonts w:ascii="Lexend" w:hAnsi="Lexend" w:eastAsia="Lexend" w:cs="Lexend"/>
+          <w:highlight w:val="none"/>
+        </w:rPr>
+      </w:r>
+    </w:p>
+    <w:p>
+      <w:pPr>
+        <w:pStyle w:val="839"/>
+        <w:pBdr/>
+        <w:spacing/>
+        <w:ind/>
+        <w:rPr/>
+      </w:pPr>
+      <w:r/>
+      <w:bookmarkStart w:id="12" w:name="_Toc12"/>
+      <w:r>
+        <w:rPr>
+          <w:rFonts w:ascii="Lexend" w:hAnsi="Lexend" w:eastAsia="Lexend" w:cs="Lexend"/>
+          <w:highlight w:val="none"/>
+        </w:rPr>
+        <w:t xml:space="preserve">3.2 – Vérification du checksum</w:t>
+      </w:r>
+      <w:r/>
+      <w:bookmarkEnd w:id="12"/>
+      <w:r/>
+      <w:r>
+        <w:rPr>
+          <w:rFonts w:ascii="Lexend" w:hAnsi="Lexend" w:eastAsia="Lexend" w:cs="Lexend"/>
+          <w:highlight w:val="none"/>
+        </w:rPr>
+      </w:r>
+    </w:p>
+    <w:p>
+      <w:pPr>
+        <w:pBdr/>
+        <w:tabs>
+          <w:tab w:val="center" w:leader="none" w:pos="5102"/>
+          <w:tab w:val="center" w:leader="none" w:pos="5102"/>
+        </w:tabs>
+        <w:spacing/>
+        <w:ind/>
+        <w:rPr>
+          <w:rFonts w:ascii="Lexend" w:hAnsi="Lexend" w:eastAsia="Lexend" w:cs="Lexend"/>
+          <w:highlight w:val="none"/>
+        </w:rPr>
+      </w:pPr>
+      <w:r>
+        <w:rPr>
+          <w:rFonts w:ascii="Lexend" w:hAnsi="Lexend" w:eastAsia="Lexend" w:cs="Lexend"/>
+          <w:highlight w:val="none"/>
+        </w:rPr>
+        <w:t xml:space="preserve">Le checksum permet de vérifier l'intégrité de la trame reçue. Il est calculé de cette manière :</w:t>
+      </w:r>
+      <w:r>
+        <w:rPr>
+          <w:rFonts w:ascii="Lexend" w:hAnsi="Lexend" w:eastAsia="Lexend" w:cs="Lexend"/>
+          <w:highlight w:val="none"/>
+        </w:rPr>
       </w:r>
       <w:r>
         <w:rPr>
@@ -3589,11 +3734,51 @@
           <w:vertAlign w:val="baseline"/>
         </w:rPr>
       </w:r>
-      <w:r>
+    </w:p>
+    <w:p>
+      <w:pPr>
+        <w:pBdr/>
+        <w:tabs>
+          <w:tab w:val="center" w:leader="none" w:pos="5102"/>
+          <w:tab w:val="center" w:leader="none" w:pos="5102"/>
+        </w:tabs>
+        <w:spacing/>
+        <w:ind/>
         <w:rPr>
           <w:rFonts w:ascii="Lexend" w:hAnsi="Lexend" w:cs="Lexend"/>
           <w:highlight w:val="none"/>
           <w:vertAlign w:val="baseline"/>
+        </w:rPr>
+      </w:pPr>
+      <w:r>
+        <w:rPr>
+          <w:rFonts w:ascii="Lexend" w:hAnsi="Lexend" w:eastAsia="Lexend" w:cs="Lexend"/>
+          <w:highlight w:val="none"/>
+        </w:rPr>
+      </w:r>
+      <w:r>
+        <w:rPr>
+          <w:rFonts w:ascii="Lexend" w:hAnsi="Lexend" w:eastAsia="Lexend" w:cs="Lexend"/>
+          <w:highlight w:val="none"/>
+        </w:rPr>
+        <w:t xml:space="preserve">Checksum = (DATA1 + DATA2 + DATA3 + DATA4 + DATA5 + DATA6) modulo 256</w:t>
+      </w:r>
+      <w:r>
+        <w:rPr>
+          <w:rFonts w:ascii="Lexend" w:hAnsi="Lexend" w:eastAsia="Lexend" w:cs="Lexend"/>
+          <w:highlight w:val="none"/>
+        </w:rPr>
+      </w:r>
+      <w:r>
+        <w:rPr>
+          <w:rFonts w:ascii="Lexend" w:hAnsi="Lexend" w:eastAsia="Lexend" w:cs="Lexend"/>
+          <w:highlight w:val="none"/>
+        </w:rPr>
+      </w:r>
+      <w:r>
+        <w:rPr>
+          <w:rFonts w:ascii="Lexend" w:hAnsi="Lexend" w:eastAsia="Lexend" w:cs="Lexend"/>
+          <w:highlight w:val="none"/>
         </w:rPr>
       </w:r>
     </w:p>

</xml_diff>

<commit_message>
probleme réglé bouttons et notifiaction et ajout certificat gitignore
</commit_message>
<xml_diff>
--- a/Documentation Capteur Particules/Documentation_capteur_particules.docx
+++ b/Documentation Capteur Particules/Documentation_capteur_particules.docx
@@ -879,7 +879,7 @@
               <w:fldChar w:fldCharType="begin"/>
               <w:instrText xml:space="preserve">PAGEREF _Toc1 \h</w:instrText>
               <w:fldChar w:fldCharType="separate"/>
-              <w:t xml:space="preserve">2</w:t>
+              <w:t xml:space="preserve">1</w:t>
               <w:fldChar w:fldCharType="end"/>
             </w:r>
           </w:hyperlink>
@@ -1120,6 +1120,7 @@
             <w:r>
               <w:rPr>
                 <w:rStyle w:val="882"/>
+                <w:highlight w:val="none"/>
               </w:rPr>
             </w:r>
             <w:r>
@@ -1235,9 +1236,7 @@
             <w:spacing/>
             <w:ind/>
             <w:rPr>
-              <w:rFonts w:ascii="Lexend" w:hAnsi="Lexend" w:cs="Lexend"/>
               <w:highlight w:val="none"/>
-              <w14:ligatures w14:val="none"/>
             </w:rPr>
           </w:pPr>
           <w:hyperlink w:tooltip="#_Toc10" w:anchor="_Toc10" w:history="1">
@@ -1249,7 +1248,6 @@
             <w:r>
               <w:rPr>
                 <w:rStyle w:val="882"/>
-                <w:rFonts w:ascii="Lexend" w:hAnsi="Lexend" w:eastAsia="Lexend" w:cs="Lexend"/>
                 <w:highlight w:val="none"/>
               </w:rPr>
               <w:t xml:space="preserve">3 – </w:t>
@@ -1257,7 +1255,6 @@
             <w:r>
               <w:rPr>
                 <w:rStyle w:val="882"/>
-                <w:rFonts w:ascii="Lexend" w:hAnsi="Lexend" w:eastAsia="Lexend" w:cs="Lexend"/>
                 <w:highlight w:val="none"/>
               </w:rPr>
               <w:t xml:space="preserve">Récupération de la trame</w:t>
@@ -1265,9 +1262,7 @@
             <w:r>
               <w:rPr>
                 <w:rStyle w:val="882"/>
-                <w:rFonts w:ascii="Lexend" w:hAnsi="Lexend" w:cs="Lexend"/>
                 <w:highlight w:val="none"/>
-                <w14:ligatures w14:val="none"/>
               </w:rPr>
             </w:r>
             <w:r>
@@ -1277,15 +1272,13 @@
               <w:fldChar w:fldCharType="begin"/>
               <w:instrText xml:space="preserve">PAGEREF _Toc10 \h</w:instrText>
               <w:fldChar w:fldCharType="separate"/>
-              <w:t xml:space="preserve">5</w:t>
+              <w:t xml:space="preserve">4</w:t>
               <w:fldChar w:fldCharType="end"/>
             </w:r>
           </w:hyperlink>
           <w:r>
             <w:rPr>
-              <w:rFonts w:ascii="Lexend" w:hAnsi="Lexend" w:cs="Lexend"/>
               <w:highlight w:val="none"/>
-              <w14:ligatures w14:val="none"/>
             </w:rPr>
           </w:r>
         </w:p>
@@ -1299,7 +1292,6 @@
             <w:spacing/>
             <w:ind/>
             <w:rPr>
-              <w:rFonts w:ascii="Lexend" w:hAnsi="Lexend" w:cs="Lexend"/>
               <w:highlight w:val="none"/>
             </w:rPr>
           </w:pPr>
@@ -1328,6 +1320,8 @@
             <w:r>
               <w:rPr>
                 <w:rStyle w:val="882"/>
+                <w:rFonts w:ascii="Lexend" w:hAnsi="Lexend" w:cs="Lexend"/>
+                <w:highlight w:val="none"/>
               </w:rPr>
             </w:r>
             <w:r>
@@ -1343,7 +1337,6 @@
           </w:hyperlink>
           <w:r>
             <w:rPr>
-              <w:rFonts w:ascii="Lexend" w:hAnsi="Lexend" w:cs="Lexend"/>
               <w:highlight w:val="none"/>
             </w:rPr>
           </w:r>
@@ -1357,10 +1350,7 @@
             </w:tabs>
             <w:spacing/>
             <w:ind/>
-            <w:rPr>
-              <w:rFonts w:ascii="Lexend" w:hAnsi="Lexend" w:eastAsia="Lexend" w:cs="Lexend"/>
-              <w:highlight w:val="none"/>
-            </w:rPr>
+            <w:rPr/>
           </w:pPr>
           <w:hyperlink w:tooltip="#_Toc12" w:anchor="_Toc12" w:history="1">
             <w:r>
@@ -1379,8 +1369,6 @@
             <w:r>
               <w:rPr>
                 <w:rStyle w:val="882"/>
-                <w:rFonts w:ascii="Lexend" w:hAnsi="Lexend" w:eastAsia="Lexend" w:cs="Lexend"/>
-                <w:highlight w:val="none"/>
               </w:rPr>
             </w:r>
             <w:r>
@@ -1394,12 +1382,7 @@
               <w:fldChar w:fldCharType="end"/>
             </w:r>
           </w:hyperlink>
-          <w:r>
-            <w:rPr>
-              <w:rFonts w:ascii="Lexend" w:hAnsi="Lexend" w:eastAsia="Lexend" w:cs="Lexend"/>
-              <w:highlight w:val="none"/>
-            </w:rPr>
-          </w:r>
+          <w:r/>
         </w:p>
         <w:p>
           <w:pPr>
@@ -1549,17 +1532,12 @@
           <w14:ligatures w14:val="none"/>
         </w:rPr>
       </w:r>
-    </w:p>
-    <w:p>
-      <w:pPr>
-        <w:pBdr/>
-        <w:spacing/>
-        <w:ind/>
+      <w:r>
         <w:rPr>
           <w:highlight w:val="none"/>
           <w14:ligatures w14:val="none"/>
         </w:rPr>
-      </w:pPr>
+      </w:r>
       <w:r>
         <w:rPr>
           <w:highlight w:val="none"/>
@@ -1633,7 +1611,12 @@
         </w:trPr>
         <w:tc>
           <w:tcPr>
-            <w:tcBorders/>
+            <w:tcBorders>
+              <w:top w:val="single" w:color="000000" w:sz="8" w:space="0"/>
+              <w:left w:val="single" w:color="000000" w:sz="8" w:space="0"/>
+              <w:bottom w:val="single" w:color="000000" w:sz="8" w:space="0"/>
+              <w:right w:val="single" w:color="000000" w:sz="8" w:space="0"/>
+            </w:tcBorders>
             <w:tcMar>
               <w:left w:w="15" w:type="dxa"/>
               <w:top w:w="15" w:type="dxa"/>
@@ -1678,7 +1661,12 @@
         </w:tc>
         <w:tc>
           <w:tcPr>
-            <w:tcBorders/>
+            <w:tcBorders>
+              <w:top w:val="single" w:color="000000" w:sz="8" w:space="0"/>
+              <w:left w:val="single" w:color="000000" w:sz="8" w:space="0"/>
+              <w:bottom w:val="single" w:color="000000" w:sz="8" w:space="0"/>
+              <w:right w:val="single" w:color="000000" w:sz="8" w:space="0"/>
+            </w:tcBorders>
             <w:tcMar>
               <w:left w:w="15" w:type="dxa"/>
               <w:top w:w="15" w:type="dxa"/>
@@ -1726,7 +1714,12 @@
         <w:trPr/>
         <w:tc>
           <w:tcPr>
-            <w:tcBorders/>
+            <w:tcBorders>
+              <w:top w:val="single" w:color="000000" w:sz="8" w:space="0"/>
+              <w:left w:val="single" w:color="000000" w:sz="8" w:space="0"/>
+              <w:bottom w:val="single" w:color="000000" w:sz="8" w:space="0"/>
+              <w:right w:val="single" w:color="000000" w:sz="8" w:space="0"/>
+            </w:tcBorders>
             <w:tcMar>
               <w:left w:w="15" w:type="dxa"/>
               <w:top w:w="15" w:type="dxa"/>
@@ -1769,7 +1762,12 @@
         </w:tc>
         <w:tc>
           <w:tcPr>
-            <w:tcBorders/>
+            <w:tcBorders>
+              <w:top w:val="single" w:color="000000" w:sz="8" w:space="0"/>
+              <w:left w:val="single" w:color="000000" w:sz="8" w:space="0"/>
+              <w:bottom w:val="single" w:color="000000" w:sz="8" w:space="0"/>
+              <w:right w:val="single" w:color="000000" w:sz="8" w:space="0"/>
+            </w:tcBorders>
             <w:tcMar>
               <w:left w:w="15" w:type="dxa"/>
               <w:top w:w="15" w:type="dxa"/>
@@ -1815,7 +1813,12 @@
         <w:trPr/>
         <w:tc>
           <w:tcPr>
-            <w:tcBorders/>
+            <w:tcBorders>
+              <w:top w:val="single" w:color="000000" w:sz="8" w:space="0"/>
+              <w:left w:val="single" w:color="000000" w:sz="8" w:space="0"/>
+              <w:bottom w:val="single" w:color="000000" w:sz="8" w:space="0"/>
+              <w:right w:val="single" w:color="000000" w:sz="8" w:space="0"/>
+            </w:tcBorders>
             <w:tcMar>
               <w:left w:w="15" w:type="dxa"/>
               <w:top w:w="15" w:type="dxa"/>
@@ -1858,7 +1861,12 @@
         </w:tc>
         <w:tc>
           <w:tcPr>
-            <w:tcBorders/>
+            <w:tcBorders>
+              <w:top w:val="single" w:color="000000" w:sz="8" w:space="0"/>
+              <w:left w:val="single" w:color="000000" w:sz="8" w:space="0"/>
+              <w:bottom w:val="single" w:color="000000" w:sz="8" w:space="0"/>
+              <w:right w:val="single" w:color="000000" w:sz="8" w:space="0"/>
+            </w:tcBorders>
             <w:tcMar>
               <w:left w:w="15" w:type="dxa"/>
               <w:top w:w="15" w:type="dxa"/>
@@ -1904,7 +1912,12 @@
         <w:trPr/>
         <w:tc>
           <w:tcPr>
-            <w:tcBorders/>
+            <w:tcBorders>
+              <w:top w:val="single" w:color="000000" w:sz="8" w:space="0"/>
+              <w:left w:val="single" w:color="000000" w:sz="8" w:space="0"/>
+              <w:bottom w:val="single" w:color="000000" w:sz="8" w:space="0"/>
+              <w:right w:val="single" w:color="000000" w:sz="8" w:space="0"/>
+            </w:tcBorders>
             <w:tcMar>
               <w:left w:w="15" w:type="dxa"/>
               <w:top w:w="15" w:type="dxa"/>
@@ -1947,7 +1960,12 @@
         </w:tc>
         <w:tc>
           <w:tcPr>
-            <w:tcBorders/>
+            <w:tcBorders>
+              <w:top w:val="single" w:color="000000" w:sz="8" w:space="0"/>
+              <w:left w:val="single" w:color="000000" w:sz="8" w:space="0"/>
+              <w:bottom w:val="single" w:color="000000" w:sz="8" w:space="0"/>
+              <w:right w:val="single" w:color="000000" w:sz="8" w:space="0"/>
+            </w:tcBorders>
             <w:tcMar>
               <w:left w:w="15" w:type="dxa"/>
               <w:top w:w="15" w:type="dxa"/>
@@ -1993,7 +2011,12 @@
         <w:trPr/>
         <w:tc>
           <w:tcPr>
-            <w:tcBorders/>
+            <w:tcBorders>
+              <w:top w:val="single" w:color="000000" w:sz="8" w:space="0"/>
+              <w:left w:val="single" w:color="000000" w:sz="8" w:space="0"/>
+              <w:bottom w:val="single" w:color="000000" w:sz="8" w:space="0"/>
+              <w:right w:val="single" w:color="000000" w:sz="8" w:space="0"/>
+            </w:tcBorders>
             <w:tcMar>
               <w:left w:w="15" w:type="dxa"/>
               <w:top w:w="15" w:type="dxa"/>
@@ -2036,7 +2059,12 @@
         </w:tc>
         <w:tc>
           <w:tcPr>
-            <w:tcBorders/>
+            <w:tcBorders>
+              <w:top w:val="single" w:color="000000" w:sz="8" w:space="0"/>
+              <w:left w:val="single" w:color="000000" w:sz="8" w:space="0"/>
+              <w:bottom w:val="single" w:color="000000" w:sz="8" w:space="0"/>
+              <w:right w:val="single" w:color="000000" w:sz="8" w:space="0"/>
+            </w:tcBorders>
             <w:tcMar>
               <w:left w:w="15" w:type="dxa"/>
               <w:top w:w="15" w:type="dxa"/>
@@ -2082,7 +2110,12 @@
         <w:trPr/>
         <w:tc>
           <w:tcPr>
-            <w:tcBorders/>
+            <w:tcBorders>
+              <w:top w:val="single" w:color="000000" w:sz="8" w:space="0"/>
+              <w:left w:val="single" w:color="000000" w:sz="8" w:space="0"/>
+              <w:bottom w:val="single" w:color="000000" w:sz="8" w:space="0"/>
+              <w:right w:val="single" w:color="000000" w:sz="8" w:space="0"/>
+            </w:tcBorders>
             <w:tcMar>
               <w:left w:w="15" w:type="dxa"/>
               <w:top w:w="15" w:type="dxa"/>
@@ -2125,7 +2158,12 @@
         </w:tc>
         <w:tc>
           <w:tcPr>
-            <w:tcBorders/>
+            <w:tcBorders>
+              <w:top w:val="single" w:color="000000" w:sz="8" w:space="0"/>
+              <w:left w:val="single" w:color="000000" w:sz="8" w:space="0"/>
+              <w:bottom w:val="single" w:color="000000" w:sz="8" w:space="0"/>
+              <w:right w:val="single" w:color="000000" w:sz="8" w:space="0"/>
+            </w:tcBorders>
             <w:tcMar>
               <w:left w:w="15" w:type="dxa"/>
               <w:top w:w="15" w:type="dxa"/>
@@ -2171,7 +2209,12 @@
         <w:trPr/>
         <w:tc>
           <w:tcPr>
-            <w:tcBorders/>
+            <w:tcBorders>
+              <w:top w:val="single" w:color="000000" w:sz="8" w:space="0"/>
+              <w:left w:val="single" w:color="000000" w:sz="8" w:space="0"/>
+              <w:bottom w:val="single" w:color="000000" w:sz="8" w:space="0"/>
+              <w:right w:val="single" w:color="000000" w:sz="8" w:space="0"/>
+            </w:tcBorders>
             <w:tcMar>
               <w:left w:w="15" w:type="dxa"/>
               <w:top w:w="15" w:type="dxa"/>
@@ -2214,7 +2257,12 @@
         </w:tc>
         <w:tc>
           <w:tcPr>
-            <w:tcBorders/>
+            <w:tcBorders>
+              <w:top w:val="single" w:color="000000" w:sz="8" w:space="0"/>
+              <w:left w:val="single" w:color="000000" w:sz="8" w:space="0"/>
+              <w:bottom w:val="single" w:color="000000" w:sz="8" w:space="0"/>
+              <w:right w:val="single" w:color="000000" w:sz="8" w:space="0"/>
+            </w:tcBorders>
             <w:tcMar>
               <w:left w:w="15" w:type="dxa"/>
               <w:top w:w="15" w:type="dxa"/>
@@ -2260,7 +2308,12 @@
         <w:trPr/>
         <w:tc>
           <w:tcPr>
-            <w:tcBorders/>
+            <w:tcBorders>
+              <w:top w:val="single" w:color="000000" w:sz="8" w:space="0"/>
+              <w:left w:val="single" w:color="000000" w:sz="8" w:space="0"/>
+              <w:bottom w:val="single" w:color="000000" w:sz="8" w:space="0"/>
+              <w:right w:val="single" w:color="000000" w:sz="8" w:space="0"/>
+            </w:tcBorders>
             <w:tcMar>
               <w:left w:w="15" w:type="dxa"/>
               <w:top w:w="15" w:type="dxa"/>
@@ -2303,7 +2356,12 @@
         </w:tc>
         <w:tc>
           <w:tcPr>
-            <w:tcBorders/>
+            <w:tcBorders>
+              <w:top w:val="single" w:color="000000" w:sz="8" w:space="0"/>
+              <w:left w:val="single" w:color="000000" w:sz="8" w:space="0"/>
+              <w:bottom w:val="single" w:color="000000" w:sz="8" w:space="0"/>
+              <w:right w:val="single" w:color="000000" w:sz="8" w:space="0"/>
+            </w:tcBorders>
             <w:tcMar>
               <w:left w:w="15" w:type="dxa"/>
               <w:top w:w="15" w:type="dxa"/>
@@ -2657,7 +2715,6 @@
       </w:pPr>
       <w:r/>
       <w:bookmarkStart w:id="6" w:name="_Toc6"/>
-      <w:r/>
       <w:r>
         <mc:AlternateContent>
           <mc:Choice Requires="wpg">
@@ -2769,7 +2826,8 @@
       </w:r>
       <w:r>
         <w:rPr>
-          <w:highlight w:val="none"/>
+          <w:b/>
+          <w:bCs/>
         </w:rPr>
       </w:r>
     </w:p>
@@ -2903,8 +2961,7 @@
       <w:r/>
       <w:r>
         <w:rPr>
-          <w:b/>
-          <w:bCs/>
+          <w:highlight w:val="none"/>
         </w:rPr>
       </w:r>
     </w:p>
@@ -2921,7 +2978,6 @@
           <w:highlight w:val="none"/>
         </w:rPr>
       </w:r>
-      <w:r/>
       <w:r>
         <w:rPr>
           <w:rFonts w:ascii="Lexend" w:hAnsi="Lexend" w:eastAsia="Lexend" w:cs="Lexend"/>
@@ -3103,71 +3159,6 @@
         </w:rPr>
         <w:t xml:space="preserve">Le capteur dispose d'un mode veille (sleep) permettant d'éteindre le ventilateur et le laser lorsque les mesures ne sont pas nécessaires. Cela permet de préserver la durée de vie du laser, estimée à environ 8 000 heures de fonctionnement.</w:t>
       </w:r>
-      <w:r/>
-    </w:p>
-    <w:p>
-      <w:pPr>
-        <w:pBdr/>
-        <w:spacing/>
-        <w:ind/>
-        <w:rPr/>
-      </w:pPr>
-      <w:r/>
-      <w:r/>
-      <w:r/>
-    </w:p>
-    <w:p>
-      <w:pPr>
-        <w:pBdr/>
-        <w:spacing/>
-        <w:ind/>
-        <w:rPr/>
-      </w:pPr>
-      <w:r/>
-      <w:r/>
-      <w:r/>
-    </w:p>
-    <w:p>
-      <w:pPr>
-        <w:pBdr/>
-        <w:spacing/>
-        <w:ind/>
-        <w:rPr/>
-      </w:pPr>
-      <w:r/>
-      <w:r/>
-      <w:r/>
-    </w:p>
-    <w:p>
-      <w:pPr>
-        <w:pBdr/>
-        <w:spacing/>
-        <w:ind/>
-        <w:rPr/>
-      </w:pPr>
-      <w:r/>
-      <w:r/>
-      <w:r/>
-    </w:p>
-    <w:p>
-      <w:pPr>
-        <w:pBdr/>
-        <w:spacing/>
-        <w:ind/>
-        <w:rPr/>
-      </w:pPr>
-      <w:r>
-        <w:rPr>
-          <w:rFonts w:ascii="Lexend" w:hAnsi="Lexend" w:eastAsia="Lexend" w:cs="Lexend"/>
-          <w:highlight w:val="none"/>
-        </w:rPr>
-      </w:r>
-      <w:r>
-        <w:rPr>
-          <w:rFonts w:ascii="Lexend" w:hAnsi="Lexend" w:eastAsia="Lexend" w:cs="Lexend"/>
-          <w:highlight w:val="none"/>
-        </w:rPr>
-      </w:r>
       <w:r>
         <w:rPr>
           <w:rFonts w:ascii="Lexend" w:hAnsi="Lexend" w:eastAsia="Lexend" w:cs="Lexend"/>
@@ -3177,7 +3168,6 @@
     </w:p>
     <w:p>
       <w:pPr>
-        <w:pStyle w:val="838"/>
         <w:pBdr/>
         <w:spacing/>
         <w:ind/>
@@ -3187,30 +3177,65 @@
           <w14:ligatures w14:val="none"/>
         </w:rPr>
       </w:pPr>
+      <w:r>
+        <w:rPr>
+          <w:rFonts w:ascii="Lexend" w:hAnsi="Lexend" w:cs="Lexend"/>
+          <w:highlight w:val="none"/>
+          <w14:ligatures w14:val="none"/>
+        </w:rPr>
+      </w:r>
+      <w:r>
+        <w:rPr>
+          <w:rFonts w:ascii="Lexend" w:hAnsi="Lexend" w:cs="Lexend"/>
+          <w:highlight w:val="none"/>
+          <w14:ligatures w14:val="none"/>
+        </w:rPr>
+      </w:r>
+      <w:r>
+        <w:rPr>
+          <w:rFonts w:ascii="Lexend" w:hAnsi="Lexend" w:cs="Lexend"/>
+          <w:highlight w:val="none"/>
+          <w14:ligatures w14:val="none"/>
+        </w:rPr>
+      </w:r>
+    </w:p>
+    <w:p>
+      <w:pPr>
+        <w:pStyle w:val="838"/>
+        <w:pBdr/>
+        <w:spacing/>
+        <w:ind/>
+        <w:rPr>
+          <w:highlight w:val="none"/>
+          <w14:ligatures w14:val="none"/>
+        </w:rPr>
+      </w:pPr>
       <w:r/>
       <w:bookmarkStart w:id="10" w:name="_Toc10"/>
       <w:r>
         <w:rPr>
-          <w:rFonts w:ascii="Lexend" w:hAnsi="Lexend" w:eastAsia="Lexend" w:cs="Lexend"/>
           <w:highlight w:val="none"/>
         </w:rPr>
         <w:t xml:space="preserve">3 – </w:t>
       </w:r>
       <w:r>
         <w:rPr>
-          <w:rFonts w:ascii="Lexend" w:hAnsi="Lexend" w:eastAsia="Lexend" w:cs="Lexend"/>
           <w:highlight w:val="none"/>
         </w:rPr>
         <w:t xml:space="preserve">Récupération de la trame</w:t>
       </w:r>
+      <w:r>
+        <w:rPr>
+          <w:highlight w:val="none"/>
+        </w:rPr>
+      </w:r>
+      <w:bookmarkEnd w:id="10"/>
       <w:r/>
       <w:bookmarkEnd w:id="10"/>
       <w:r/>
       <w:r>
         <w:rPr>
-          <w:rFonts w:ascii="Lexend" w:hAnsi="Lexend" w:cs="Lexend"/>
           <w:highlight w:val="none"/>
-          <w14:ligatures w14:val="none"/>
         </w:rPr>
       </w:r>
     </w:p>
@@ -3495,6 +3520,12 @@
           <w:highlight w:val="none"/>
         </w:rPr>
       </w:r>
+      <w:r>
+        <w:rPr>
+          <w:rFonts w:ascii="Lexend" w:hAnsi="Lexend" w:eastAsia="Lexend" w:cs="Lexend"/>
+          <w:highlight w:val="none"/>
+        </w:rPr>
+      </w:r>
     </w:p>
     <w:p>
       <w:pPr>
@@ -3536,8 +3567,61 @@
           <w:highlight w:val="none"/>
         </w:rPr>
       </w:pPr>
+      <w:r>
+        <w:rPr>
+          <w:highlight w:val="none"/>
+        </w:rPr>
+      </w:r>
+      <w:r>
+        <w:rPr>
+          <w:highlight w:val="none"/>
+        </w:rPr>
+      </w:r>
+      <w:r>
+        <w:rPr>
+          <w:highlight w:val="none"/>
+        </w:rPr>
+      </w:r>
+    </w:p>
+    <w:p>
+      <w:pPr>
+        <w:pStyle w:val="839"/>
+        <w:pBdr/>
+        <w:spacing/>
+        <w:ind/>
+        <w:rPr>
+          <w:highlight w:val="none"/>
+        </w:rPr>
+      </w:pPr>
+      <w:r>
+        <w:rPr>
+          <w:highlight w:val="none"/>
+        </w:rPr>
+      </w:r>
+      <w:r>
+        <w:rPr>
+          <w:highlight w:val="none"/>
+        </w:rPr>
+      </w:r>
+      <w:r>
+        <w:rPr>
+          <w:highlight w:val="none"/>
+        </w:rPr>
+      </w:r>
+    </w:p>
+    <w:p>
+      <w:pPr>
+        <w:pStyle w:val="839"/>
+        <w:pBdr/>
+        <w:spacing/>
+        <w:ind/>
+        <w:rPr>
+          <w:highlight w:val="none"/>
+        </w:rPr>
+      </w:pPr>
       <w:r/>
       <w:bookmarkStart w:id="11" w:name="_Toc11"/>
+      <w:r/>
       <w:r>
         <w:rPr>
           <w:rFonts w:ascii="Lexend" w:hAnsi="Lexend" w:eastAsia="Lexend" w:cs="Lexend"/>
@@ -3555,7 +3639,12 @@
       <w:r/>
       <w:bookmarkEnd w:id="11"/>
       <w:r/>
-      <w:r/>
+      <w:r>
+        <w:rPr>
+          <w:rFonts w:ascii="Lexend" w:hAnsi="Lexend" w:cs="Lexend"/>
+          <w:highlight w:val="none"/>
+        </w:rPr>
+      </w:r>
     </w:p>
     <w:p>
       <w:pPr>
@@ -3576,13 +3665,7 @@
       </w:r>
       <w:r>
         <w:rPr>
-          <w:rFonts w:ascii="Lexend" w:hAnsi="Lexend" w:eastAsia="Lexend" w:cs="Lexend"/>
-          <w:highlight w:val="none"/>
-        </w:rPr>
-      </w:r>
-      <w:r>
-        <w:rPr>
-          <w:rFonts w:ascii="Lexend" w:hAnsi="Lexend" w:eastAsia="Lexend" w:cs="Lexend"/>
+          <w:rFonts w:ascii="Lexend" w:hAnsi="Lexend" w:cs="Lexend"/>
           <w:highlight w:val="none"/>
         </w:rPr>
       </w:r>
@@ -3612,7 +3695,6 @@
         <w:t xml:space="preserve">Taux PM2.5 = (octet4 × 256 + octet3) / 10  →  0x0015 = 21 → 2,1 µg/m³</w:t>
         <w:br/>
       </w:r>
-      <w:r/>
       <w:r>
         <w:rPr>
           <w:rFonts w:ascii="Lexend" w:hAnsi="Lexend" w:eastAsia="Lexend" w:cs="Lexend"/>
@@ -3620,7 +3702,28 @@
         </w:rPr>
         <w:t xml:space="preserve">Taux PM10  = (octet6 × 256 + octet5) / 10  →  0x0068 = 104 → 10,4 µg/m³</w:t>
       </w:r>
+      <w:r>
+        <w:rPr>
+          <w:rFonts w:ascii="Lexend" w:hAnsi="Lexend" w:eastAsia="Lexend" w:cs="Lexend"/>
+          <w:highlight w:val="none"/>
+        </w:rPr>
+      </w:r>
       <w:r/>
+    </w:p>
+    <w:p>
+      <w:pPr>
+        <w:pBdr/>
+        <w:tabs>
+          <w:tab w:val="center" w:leader="none" w:pos="5102"/>
+          <w:tab w:val="center" w:leader="none" w:pos="5102"/>
+        </w:tabs>
+        <w:spacing/>
+        <w:ind/>
+        <w:rPr>
+          <w:rFonts w:ascii="Lexend" w:hAnsi="Lexend" w:eastAsia="Lexend" w:cs="Lexend"/>
+          <w:highlight w:val="none"/>
+        </w:rPr>
+      </w:pPr>
       <w:r>
         <w:rPr>
           <w:rFonts w:ascii="Lexend" w:hAnsi="Lexend" w:eastAsia="Lexend" w:cs="Lexend"/>
@@ -3642,39 +3745,6 @@
     </w:p>
     <w:p>
       <w:pPr>
-        <w:pBdr/>
-        <w:tabs>
-          <w:tab w:val="center" w:leader="none" w:pos="5102"/>
-          <w:tab w:val="center" w:leader="none" w:pos="5102"/>
-        </w:tabs>
-        <w:spacing/>
-        <w:ind/>
-        <w:rPr>
-          <w:rFonts w:ascii="Lexend" w:hAnsi="Lexend" w:eastAsia="Lexend" w:cs="Lexend"/>
-          <w:highlight w:val="none"/>
-        </w:rPr>
-      </w:pPr>
-      <w:r>
-        <w:rPr>
-          <w:rFonts w:ascii="Lexend" w:hAnsi="Lexend" w:eastAsia="Lexend" w:cs="Lexend"/>
-          <w:highlight w:val="none"/>
-        </w:rPr>
-      </w:r>
-      <w:r>
-        <w:rPr>
-          <w:rFonts w:ascii="Lexend" w:hAnsi="Lexend" w:eastAsia="Lexend" w:cs="Lexend"/>
-          <w:highlight w:val="none"/>
-        </w:rPr>
-      </w:r>
-      <w:r>
-        <w:rPr>
-          <w:rFonts w:ascii="Lexend" w:hAnsi="Lexend" w:eastAsia="Lexend" w:cs="Lexend"/>
-          <w:highlight w:val="none"/>
-        </w:rPr>
-      </w:r>
-    </w:p>
-    <w:p>
-      <w:pPr>
         <w:pStyle w:val="839"/>
         <w:pBdr/>
         <w:spacing/>
@@ -3693,12 +3763,7 @@
       <w:r/>
       <w:bookmarkEnd w:id="12"/>
       <w:r/>
-      <w:r>
-        <w:rPr>
-          <w:rFonts w:ascii="Lexend" w:hAnsi="Lexend" w:eastAsia="Lexend" w:cs="Lexend"/>
-          <w:highlight w:val="none"/>
-        </w:rPr>
-      </w:r>
+      <w:r/>
     </w:p>
     <w:p>
       <w:pPr>
@@ -3723,15 +3788,15 @@
       </w:r>
       <w:r>
         <w:rPr>
-          <w:rFonts w:ascii="Lexend" w:hAnsi="Lexend" w:eastAsia="Lexend" w:cs="Lexend"/>
+          <w:rFonts w:ascii="Lexend" w:hAnsi="Lexend" w:cs="Lexend"/>
           <w:highlight w:val="none"/>
+          <w:vertAlign w:val="baseline"/>
         </w:rPr>
       </w:r>
       <w:r>
         <w:rPr>
-          <w:rFonts w:ascii="Lexend" w:hAnsi="Lexend" w:cs="Lexend"/>
+          <w:rFonts w:ascii="Lexend" w:hAnsi="Lexend" w:eastAsia="Lexend" w:cs="Lexend"/>
           <w:highlight w:val="none"/>
-          <w:vertAlign w:val="baseline"/>
         </w:rPr>
       </w:r>
     </w:p>
@@ -3771,14 +3836,9 @@
       </w:r>
       <w:r>
         <w:rPr>
-          <w:rFonts w:ascii="Lexend" w:hAnsi="Lexend" w:eastAsia="Lexend" w:cs="Lexend"/>
+          <w:rFonts w:ascii="Lexend" w:hAnsi="Lexend" w:cs="Lexend"/>
           <w:highlight w:val="none"/>
-        </w:rPr>
-      </w:r>
-      <w:r>
-        <w:rPr>
-          <w:rFonts w:ascii="Lexend" w:hAnsi="Lexend" w:eastAsia="Lexend" w:cs="Lexend"/>
-          <w:highlight w:val="none"/>
+          <w:vertAlign w:val="baseline"/>
         </w:rPr>
       </w:r>
     </w:p>

</xml_diff>